<commit_message>
Finalise NICC commentary response after second independent review
- Retitle to 'Two reference points for trust in AI-assisted early warning'
- Fix logic flagged by reviewers: constrained (not absent) discretion,
  compliance without trust, a decisive stratified test, 'not fully
  independent', averted deteriorations not counted as false alarms
- Mark the Kahneman & Klein sentence as a verbatim quotation; quote Tanner
  exactly; cite Parasuraman & Manzey with Lee & See as dynamic accounts
- Main text 1,471 words (1,486 with title); all 36 quotations verified
- Briefing records the two-round verification of all 13 references

Co-Authored-By: Claude Opus 5.5 <noreply@anthropic.com>
Claude-Session: https://claude.ai/code/session_01NFxkwSoaToLEQqh28ojz2g
</commit_message>
<xml_diff>
--- a/nicc_commentary_response/01_Response_to_Commentary_NICC.docx
+++ b/nicc_commentary_response/01_Response_to_Commentary_NICC.docx
@@ -29,7 +29,7 @@
           <w:sz w:val="32"/>
           <w:szCs w:val="32"/>
         </w:rPr>
-        <w:t xml:space="preserve">Two references for trust in AI-assisted early warning: A response to ‘Calibrated to what?’</w:t>
+        <w:t xml:space="preserve">Two reference points for trust in AI-assisted early warning: A response to ‘Calibrated to what?’</w:t>
       </w:r>
     </w:p>
     <w:p>
@@ -264,7 +264,7 @@
           <w:sz w:val="20"/>
           <w:szCs w:val="20"/>
         </w:rPr>
-        <w:t xml:space="preserve">Word count: 1482 words (main text including headings; excluding title, author details, end statements and references). Title: 14 words.</w:t>
+        <w:t xml:space="preserve">Word count: 1471 words (main text including headings; excluding title, author details, end statements and references). Title: 15 words.</w:t>
       </w:r>
     </w:p>
     <w:p>
@@ -423,7 +423,7 @@
           <w:sz w:val="24"/>
           <w:szCs w:val="24"/>
         </w:rPr>
-        <w:t xml:space="preserve"> In Blumer’s terms it was a sensitising concept, suggesting “directions along which to look” rather than “prescriptions of what to see”.</w:t>
+        <w:t xml:space="preserve"> In Blumer’s terms, automation bias was a sensitising concept, suggesting “directions along which to look” rather than “prescriptions of what to see”.</w:t>
       </w:r>
       <w:r>
         <w:rPr>
@@ -444,7 +444,7 @@
           <w:sz w:val="24"/>
           <w:szCs w:val="24"/>
         </w:rPr>
-        <w:t xml:space="preserve"> We agree that automation bias is a tendency identified through the omission and commission errors it produces.</w:t>
+        <w:t xml:space="preserve"> We agree that automation bias is identified through the omission and commission errors it produces.</w:t>
       </w:r>
       <w:r>
         <w:rPr>
@@ -465,7 +465,7 @@
           <w:sz w:val="24"/>
           <w:szCs w:val="24"/>
         </w:rPr>
-        <w:t xml:space="preserve"> No interview can capture an unrecognised error, and we claimed to detect none. What participants could describe was the tendency and its resistance: an early period of “giving the score more authority than their own assessment”, and “an uneasy tendency to wait for the alert rather than lead surveillance”.</w:t>
+        <w:t xml:space="preserve"> No interview can capture an unrecognised error, and we claimed to detect none. What participants could describe was the pull towards the aid: an early period of “giving the score more authority than their own assessment”, and “an uneasy tendency to wait for the alert rather than lead surveillance”.</w:t>
       </w:r>
       <w:r>
         <w:rPr>
@@ -486,7 +486,7 @@
           <w:sz w:val="24"/>
           <w:szCs w:val="24"/>
         </w:rPr>
-        <w:t xml:space="preserve"> These are the experiences of automation bias to which our title refers.</w:t>
+        <w:t xml:space="preserve"> Such reliance becomes bias only when the aid errs; our title refers to experiences of that pull.</w:t>
       </w:r>
     </w:p>
     <w:p>
@@ -523,7 +523,7 @@
           <w:sz w:val="24"/>
           <w:szCs w:val="24"/>
         </w:rPr>
-        <w:t xml:space="preserve"> and that interviews cannot establish it. That was not the claim we intended, and our design could not support it. We accept, however, that our statement that trust was “actively calibrated through experience” can be read as reporting an achievement rather than an activity.</w:t>
+        <w:t xml:space="preserve"> and that interviews cannot establish it. We accept, however, that our statement that trust was “actively calibrated through experience” can be read as reporting an achievement rather than an activity.</w:t>
       </w:r>
       <w:r>
         <w:rPr>
@@ -565,7 +565,7 @@
           <w:sz w:val="24"/>
           <w:szCs w:val="24"/>
         </w:rPr>
-        <w:t xml:space="preserve"> ‘Calibrating’ names work that can succeed or fail; ‘calibrated’ asserts its success. Our data speak to the first, as do our references to a nurse “correctly dismissing” an alert and to junior nurses’ “greater tendency towards early overreliance”: both summarised participants’ accounts, not audited judgements or measured rates.</w:t>
+        <w:t xml:space="preserve"> ‘Calibrating’ names work that can succeed or fail; ‘calibrated’ asserts its success. Our data speak to the first. Our phrase “correctly dismissing” an alert therefore went beyond them, and junior nurses’ “greater tendency towards early overreliance” summarised accounts, not measured rates.</w:t>
       </w:r>
       <w:r>
         <w:rPr>
@@ -586,7 +586,7 @@
           <w:sz w:val="24"/>
           <w:szCs w:val="24"/>
         </w:rPr>
-        <w:t xml:space="preserve"> As Kahneman and Klein conclude, subjective experience is not a reliable indicator of judgement accuracy</w:t>
+        <w:t xml:space="preserve"> As Kahneman and Klein conclude, “subjective experience is not a reliable indicator of judgment accuracy”.</w:t>
       </w:r>
       <w:r>
         <w:rPr>
@@ -598,16 +598,6 @@
           <w:vertAlign w:val="superscript"/>
         </w:rPr>
         <w:t xml:space="preserve">7</w:t>
-      </w:r>
-      <w:r>
-        <w:rPr>
-          <w:rFonts w:ascii="Times New Roman" w:cs="Times New Roman" w:eastAsia="Times New Roman" w:hAnsi="Times New Roman"/>
-          <w:b w:val="false"/>
-          <w:bCs w:val="false"/>
-          <w:sz w:val="24"/>
-          <w:szCs w:val="24"/>
-        </w:rPr>
-        <w:t xml:space="preserve">; hence that boundary.</w:t>
       </w:r>
     </w:p>
     <w:p>
@@ -644,7 +634,7 @@
           <w:sz w:val="24"/>
           <w:szCs w:val="24"/>
         </w:rPr>
-        <w:t xml:space="preserve"> Participants described trust that was specific rather than global (“I trust it more for certain patients and less for others”, P14),</w:t>
+        <w:t xml:space="preserve"> Participants described trust that was differentiated rather than global (“I trust it more for certain patients and less for others”, P14),</w:t>
       </w:r>
       <w:r>
         <w:rPr>
@@ -665,7 +655,7 @@
           <w:sz w:val="24"/>
           <w:szCs w:val="24"/>
         </w:rPr>
-        <w:t xml:space="preserve"> but specificity is not calibration: trust can be differentiated, yet differentiated wrongly. Self-report is an established route to trust as an attitude</w:t>
+        <w:t xml:space="preserve"> but differentiation is not calibration: trust can be differentiated wrongly. Self-report is an established route to trust as an attitude</w:t>
       </w:r>
       <w:r>
         <w:rPr>
@@ -686,7 +676,7 @@
           <w:sz w:val="24"/>
           <w:szCs w:val="24"/>
         </w:rPr>
-        <w:t xml:space="preserve">; whether reliance is appropriate requires behavioural and reference data.</w:t>
+        <w:t xml:space="preserve">; whether trust or reliance is appropriate requires behavioural and reference data.</w:t>
       </w:r>
     </w:p>
     <w:p>
@@ -723,7 +713,7 @@
           <w:sz w:val="24"/>
           <w:szCs w:val="24"/>
         </w:rPr>
-        <w:t xml:space="preserve"> It applies fully to participants’ explanations of why they trusted, which therefore cannot evidence accuracy. Our analytic claims rest instead on concrete episodes and on practices that no audit log records: what senior nurses teach (“the algorithm is one voice”, P19), how override was framed (“I have to be able to explain it”, P06), and when risk felt shared or “entirely personal” (P05).</w:t>
+        <w:t xml:space="preserve"> It applies fully to participants’ explanations of why they trusted, which therefore cannot evidence calibration. Our other claims rest on concrete episodes and on reported practices and meanings that no audit log records: what senior nurses teach (“the algorithm is one voice”, P19), how override was framed (“I have to be able to explain it”, P06), and when risk felt shared or “entirely personal” (P05).</w:t>
       </w:r>
       <w:r>
         <w:rPr>
@@ -761,7 +751,7 @@
           <w:szCs w:val="24"/>
           <w:vertAlign w:val="superscript"/>
         </w:rPr>
-        <w:t xml:space="preserve">1,6</w:t>
+        <w:t xml:space="preserve">1,5,6</w:t>
       </w:r>
       <w:r>
         <w:rPr>
@@ -866,7 +856,7 @@
           <w:sz w:val="24"/>
           <w:szCs w:val="24"/>
         </w:rPr>
-        <w:t xml:space="preserve"> but did not follow that point through to how trust is learned. We add three observations.</w:t>
+        <w:t xml:space="preserve"> but did not follow that point through to how trust is learned.</w:t>
       </w:r>
     </w:p>
     <w:p>
@@ -882,7 +872,7 @@
           <w:sz w:val="24"/>
           <w:szCs w:val="24"/>
         </w:rPr>
-        <w:t xml:space="preserve">First, their reading, like ours, interprets the same accounts; by their own description, the trajectory “equally fits” both.</w:t>
+        <w:t xml:space="preserve">First, their reading, like ours, interprets the same accounts; as they note, the trajectory “equally fits” their reading.</w:t>
       </w:r>
       <w:r>
         <w:rPr>
@@ -940,7 +930,7 @@
           <w:sz w:val="24"/>
           <w:szCs w:val="24"/>
         </w:rPr>
-        <w:t xml:space="preserve"> These were, however, misses that nurses themselves caught (P09), and here the asymmetry bites. Surveillance reveals only the misses nurses detect, leaving those shared by nurse and model invisible to both, and rare events accumulate slowly within 7 to 26 months of exposure.</w:t>
+        <w:t xml:space="preserve"> These were, however, misses that nurses themselves caught (P09), and here the asymmetry bites. Surveillance reveals only the misses nurses detect, leaving misses shared by nurse and model unrecognised as model failures, and rare events accumulate slowly within 7 to 26 months of exposure.</w:t>
       </w:r>
       <w:r>
         <w:rPr>
@@ -982,7 +972,7 @@
           <w:sz w:val="24"/>
           <w:szCs w:val="24"/>
         </w:rPr>
-        <w:t xml:space="preserve">: if surveillance erodes into alert-dependence, misses go not only undetected but unlearned. It also shows why surveillance alone is not enough. Participants already pooled knowledge “not in any manual” (P14) through “peer exchange”</w:t>
+        <w:t xml:space="preserve">: if surveillance erodes into alert-dependence, misses go not only undetected but unlearned. It also shows why surveillance alone is not enough. Participants already pooled knowledge “not in any manual” (P14) through “peer exchange”,</w:t>
       </w:r>
       <w:r>
         <w:rPr>
@@ -1003,7 +993,7 @@
           <w:sz w:val="24"/>
           <w:szCs w:val="24"/>
         </w:rPr>
-        <w:t xml:space="preserve">; the nurse-facing performance reports the commentators propose would formalise that pooling and supply the feedback that individual experience withholds.</w:t>
+        <w:t xml:space="preserve"> but pooled experience shares the same asymmetry; the nurse-facing performance reports the commentators propose would supply the feedback that neither experience nor training alone provides.</w:t>
       </w:r>
     </w:p>
     <w:p>
@@ -1040,7 +1030,7 @@
           <w:sz w:val="24"/>
           <w:szCs w:val="24"/>
         </w:rPr>
-        <w:t xml:space="preserve">; our participants described little such discretion. P17’s account illustrates the commentators’ point about salient false alarms, yet the nurse “still had to process the escalation because the alert existed”.</w:t>
+        <w:t xml:space="preserve">; our participants’ discretion was constrained, though not absent. P17’s account illustrates the commentators’ point about salient false alarms, yet the nurse “still had to process the escalation because the alert existed”.</w:t>
       </w:r>
       <w:r>
         <w:rPr>
@@ -1061,7 +1051,7 @@
           <w:sz w:val="24"/>
           <w:szCs w:val="24"/>
         </w:rPr>
-        <w:t xml:space="preserve"> Visible false alarms may thus shape how nurses regard alerts more than whether they act on them: an audit log would record that escalation as acceptance, whereas the account shows acceptance without trust. Similarly, an unrecorded override removes the trace by which anyone could learn whether it was right, and P16’s certainty that an alert was “not real” is the kind of confidence that, as the commentators argue, incomplete feedback can sustain.</w:t>
+        <w:t xml:space="preserve"> Where escalation is required, visible false alarms may shape how nurses regard alerts more than whether they act on them: an audit log would record that escalation as acceptance, whereas the account shows compliance without trust. Conversely, an unrecorded override leaves no rationale to review against what happened next, and P16’s certainty that an alert was “not real” is the kind of confidence that, as the commentators argue, incomplete feedback can sustain.</w:t>
       </w:r>
       <w:r>
         <w:rPr>
@@ -1082,7 +1072,7 @@
           <w:sz w:val="24"/>
           <w:szCs w:val="24"/>
         </w:rPr>
-        <w:t xml:space="preserve"> Silent override is, in this sense, the organisational form of their feedback asymmetry.</w:t>
+        <w:t xml:space="preserve"> Silent override thus adds an organisational layer to their feedback asymmetry.</w:t>
       </w:r>
     </w:p>
     <w:p>
@@ -1098,7 +1088,7 @@
           <w:sz w:val="24"/>
           <w:szCs w:val="24"/>
         </w:rPr>
-        <w:t xml:space="preserve">4 | TWO REFERENCES: THE PATIENT AND THE SYSTEM</w:t>
+        <w:t xml:space="preserve">4 | TWO REFERENCE POINTS: THE PATIENT AND THE SYSTEM</w:t>
       </w:r>
     </w:p>
     <w:p>
@@ -1114,7 +1104,7 @@
           <w:sz w:val="24"/>
           <w:szCs w:val="24"/>
         </w:rPr>
-        <w:t xml:space="preserve">For each alert, our participants’ reference was the patient in front of them (“When the number does not match the patient”),</w:t>
+        <w:t xml:space="preserve">For each alert, our participants’ reference was the patient in front of them (“I look at my patient”, P03),</w:t>
       </w:r>
       <w:r>
         <w:rPr>
@@ -1135,7 +1125,7 @@
           <w:sz w:val="24"/>
           <w:szCs w:val="24"/>
         </w:rPr>
-        <w:t xml:space="preserve"> consistent with Tanner’s conclusion that sound clinical judgment “rests to some degree on knowing the patient”.</w:t>
+        <w:t xml:space="preserve"> consistent with Tanner’s conclusion that “sound clinical judgment rests to some degree on knowing the patient”.</w:t>
       </w:r>
       <w:r>
         <w:rPr>
@@ -1156,7 +1146,7 @@
           <w:sz w:val="24"/>
           <w:szCs w:val="24"/>
         </w:rPr>
-        <w:t xml:space="preserve"> For a single decision it is the only reference available in real time, but a fallible one. We accept the points on anchoring and concordant error, and add a structural reason: the model analyses the same “routinely documented vital signs and laboratory parameters”</w:t>
+        <w:t xml:space="preserve"> We accept the points on anchoring and concordant error, and add a structural reason: the model analyses the same “routinely documented vital signs and laboratory parameters”</w:t>
       </w:r>
       <w:r>
         <w:rPr>
@@ -1177,7 +1167,7 @@
           <w:sz w:val="24"/>
           <w:szCs w:val="24"/>
         </w:rPr>
-        <w:t xml:space="preserve"> that inform the nurse’s assessment, so the two are not independent, and clinicians judge a deterioration model’s accuracy partly by its concordance with their own impressions.</w:t>
+        <w:t xml:space="preserve"> that inform the nurse’s assessment, so the two are not fully independent, and clinicians report judging a deterioration model’s accuracy partly by its concordance with their own impressions.</w:t>
       </w:r>
       <w:r>
         <w:rPr>
@@ -1198,7 +1188,7 @@
           <w:sz w:val="24"/>
           <w:szCs w:val="24"/>
         </w:rPr>
-        <w:t xml:space="preserve"> Whether learned trust tracks the system’s reliability can be known only against a second reference: local performance data that include missed events.</w:t>
+        <w:t xml:space="preserve"> Whether learned trust tracks the system’s reliability can be known only against a second reference: local performance data that include missed events and do not count averted deteriorations as false alarms.</w:t>
       </w:r>
     </w:p>
     <w:p>
@@ -1214,7 +1204,7 @@
           <w:sz w:val="24"/>
           <w:szCs w:val="24"/>
         </w:rPr>
-        <w:t xml:space="preserve">Our article reported no local performance estimates, and the model’s proprietary characteristics were not independently audited.</w:t>
+        <w:t xml:space="preserve">Our article reported no local performance estimates, and we did not audit the model’s proprietary characteristics.</w:t>
       </w:r>
       <w:r>
         <w:rPr>
@@ -1272,7 +1262,7 @@
           <w:sz w:val="24"/>
           <w:szCs w:val="24"/>
         </w:rPr>
-        <w:t xml:space="preserve">We accept symmetric capture (recording what the system flagged, what nurses did and what happened to the patient, whether or not an alert fired) as a refinement of our override field. A field required only for overrides could, as the commentators argue, “make acceptance the implicit default and attach friction to disagreement alone”,</w:t>
+        <w:t xml:space="preserve">We accept symmetric capture (recording what the system flagged, what nurses did and what happened to the patient, whether or not an alert fired) as a complement to our override field. A field required only for overrides could, as the commentators argue, “make acceptance the implicit default and attach friction to disagreement alone”,</w:t>
       </w:r>
       <w:r>
         <w:rPr>
@@ -1314,7 +1304,7 @@
           <w:sz w:val="24"/>
           <w:szCs w:val="24"/>
         </w:rPr>
-        <w:t xml:space="preserve"> Logs, in turn, need interpretive categories: a log shows that an alert was not escalated, not whether it was assessed and judged wrong or never read, hence our proposed “single-click acknowledgement that an alert was reviewed and not escalated”.</w:t>
+        <w:t xml:space="preserve"> Logs, in turn, need interpretive categories: a log shows that an alert was not escalated, not whether it was assessed and judged wrong or never read, hence our proposed single-click acknowledgement,</w:t>
       </w:r>
       <w:r>
         <w:rPr>
@@ -1335,7 +1325,7 @@
           <w:sz w:val="24"/>
           <w:szCs w:val="24"/>
         </w:rPr>
-        <w:t xml:space="preserve"> As a low-cost first step, units could review deteriorations that no alert preceded against their alert logs.</w:t>
+        <w:t xml:space="preserve"> which symmetric capture would extend to every alert. As a low-cost first step, units could check each deterioration against alert logs to find those no alert preceded.</w:t>
       </w:r>
     </w:p>
     <w:p>
@@ -1409,7 +1399,7 @@
           <w:sz w:val="24"/>
           <w:szCs w:val="24"/>
         </w:rPr>
-        <w:t xml:space="preserve">: audit data show what nurses did; only such designs show what the system changed. Where a deployed system cannot ethically be withheld, simulation and vignette studies offer a feasible route, and our findings specify what to test: discordant alerts, artefacts such as post-suctioning alarms, and the patient groups for which participants trusted the system less (P05, P14).</w:t>
+        <w:t xml:space="preserve">: audit data show what nurses did; only such designs show what the system changed. Where a deployed system cannot ethically be withheld, simulation and vignette studies offer a feasible route, and our findings suggest what to test: discordant alerts, alarms after suctioning, and complex cases, for which participants trusted the system less (P05).</w:t>
       </w:r>
       <w:r>
         <w:rPr>
@@ -1430,7 +1420,7 @@
           <w:sz w:val="24"/>
           <w:szCs w:val="24"/>
         </w:rPr>
-        <w:t xml:space="preserve"> Comparing those groups with group-specific sensitivity and false-alarm rates would show whether differentiated trust tracks the system’s reliability, as growing expertise would predict, or only its visible errors, as the commentators’ reading predicts. Interpretive studies, in turn, show how nurses understand and account for their reliance, what they teach, and when, by their account, disagreement goes unrecorded. Neither substitutes for the other.</w:t>
+        <w:t xml:space="preserve"> Comparing nurses’ trust across patient groups with group-specific false-alarm rates and with misses, separating those nurses caught from those they did not, would show whether differentiated trust tracks the system’s reliability, as our reading predicts, or only its visible errors, as the commentators’ reading predicts. Interpretive studies, in turn, show how nurses understand and account for their reliance, what they teach, and when, by their account, disagreement goes unrecorded. Neither substitutes for the other.</w:t>
       </w:r>
     </w:p>
     <w:p>
@@ -1446,7 +1436,7 @@
           <w:sz w:val="24"/>
           <w:szCs w:val="24"/>
         </w:rPr>
-        <w:t xml:space="preserve">‘Calibrated to what?’ is the right question, and it has two answers. At the bedside, each alert is weighed against the patient, a real-time but fallible reference. Across alerts, learned trust must be checked against the system’s measured performance, misses included. Our study described the first; the commentators rightly insist on the second. Safe AI-assisted early warning needs both, and nurses who keep watching closely enough to notice when the two disagree. We thank the commentators for sharpening this agenda.</w:t>
+        <w:t xml:space="preserve">‘Calibrated to what?’ is the right question, and it has two answers. At the bedside, each alert is weighed against the patient, a real-time but fallible reference. Across alerts, learned trust must be checked against the system’s measured performance, misses included. Our study described the first; the commentators rightly insist on the second. Safe AI-assisted early warning needs both, and nurses who keep watching closely enough to notice when alert and patient disagree. We thank the commentators for sharpening this agenda.</w:t>
       </w:r>
     </w:p>
     <w:p>
@@ -1618,7 +1608,7 @@
           <w:szCs w:val="22"/>
           <w:shd w:fill="FFFF00" w:color="auto" w:val="clear"/>
         </w:rPr>
-        <w:t xml:space="preserve">doi:[to be assigned]</w:t>
+        <w:t xml:space="preserve">doi:[to be inserted by the Editorial Office]</w:t>
       </w:r>
     </w:p>
     <w:p>

</xml_diff>

<commit_message>
Merge strongest elements of the authors' alternative draft into the response
- New title without naming the commentary: 'The patient and the system:
  Two reference points for evaluating nurses' trust in AI-assisted early
  warning'
- Commentary removed from the reference list at the authors' request;
  13 references renumbered; emails updated accordingly
- Adds bidirectional feedback, concordant error, evaluation specifics,
  override field as governance recommendation, and Jabbour et al.
- Briefing records the comparison and the 13-reference verification

Co-Authored-By: Claude Opus 5.5 <noreply@anthropic.com>
Claude-Session: https://claude.ai/code/session_01NFxkwSoaToLEQqh28ojz2g
</commit_message>
<xml_diff>
--- a/nicc_commentary_response/01_Response_to_Commentary_NICC.docx
+++ b/nicc_commentary_response/01_Response_to_Commentary_NICC.docx
@@ -29,7 +29,7 @@
           <w:sz w:val="32"/>
           <w:szCs w:val="32"/>
         </w:rPr>
-        <w:t xml:space="preserve">Two reference points for trust in AI-assisted early warning: A response to ‘Calibrated to what?’</w:t>
+        <w:t xml:space="preserve">The patient and the system: Two reference points for evaluating nurses’ trust in AI-assisted early warning</w:t>
       </w:r>
     </w:p>
     <w:p>
@@ -223,48 +223,23 @@
           <w:sz w:val="20"/>
           <w:szCs w:val="20"/>
         </w:rPr>
-        <w:t xml:space="preserve">Response to: </w:t>
-      </w:r>
-      <w:r>
-        <w:rPr>
-          <w:rFonts w:ascii="Times New Roman" w:cs="Times New Roman" w:eastAsia="Times New Roman" w:hAnsi="Times New Roman"/>
-          <w:b w:val="false"/>
-          <w:bCs w:val="false"/>
-          <w:i/>
-          <w:iCs/>
+        <w:t xml:space="preserve">Response to the commentary on our article: Samy R, Ramadan OME, Elsayed GEA. Nursing in Critical Care. 2026;31(5):e70620. doi:10.1111/nicc.70620</w:t>
+      </w:r>
+    </w:p>
+    <w:p>
+      <w:pPr>
+        <w:spacing w:after="240" w:before="0" w:line="360"/>
+        <w:jc w:val="left"/>
+      </w:pPr>
+      <w:r>
+        <w:rPr>
+          <w:rFonts w:ascii="Times New Roman" w:cs="Times New Roman" w:eastAsia="Times New Roman" w:hAnsi="Times New Roman"/>
+          <w:b w:val="false"/>
+          <w:bCs w:val="false"/>
           <w:sz w:val="20"/>
           <w:szCs w:val="20"/>
-          <w:shd w:fill="FFFF00" w:color="auto" w:val="clear"/>
-        </w:rPr>
-        <w:t xml:space="preserve">[Author names to be inserted by the Editorial Office]</w:t>
-      </w:r>
-      <w:r>
-        <w:rPr>
-          <w:rFonts w:ascii="Times New Roman" w:cs="Times New Roman" w:eastAsia="Times New Roman" w:hAnsi="Times New Roman"/>
-          <w:b w:val="false"/>
-          <w:bCs w:val="false"/>
-          <w:i/>
-          <w:iCs/>
-          <w:sz w:val="20"/>
-          <w:szCs w:val="20"/>
-        </w:rPr>
-        <w:t xml:space="preserve">. Calibrated to what? Feedback asymmetry and the limits of experiential trust in AI-assisted early warning. Nursing in Critical Care. In press.</w:t>
-      </w:r>
-    </w:p>
-    <w:p>
-      <w:pPr>
-        <w:spacing w:after="240" w:before="0" w:line="360"/>
-        <w:jc w:val="left"/>
-      </w:pPr>
-      <w:r>
-        <w:rPr>
-          <w:rFonts w:ascii="Times New Roman" w:cs="Times New Roman" w:eastAsia="Times New Roman" w:hAnsi="Times New Roman"/>
-          <w:b w:val="false"/>
-          <w:bCs w:val="false"/>
-          <w:sz w:val="20"/>
-          <w:szCs w:val="20"/>
-        </w:rPr>
-        <w:t xml:space="preserve">Word count: 1471 words (main text including headings; excluding title, author details, end statements and references). Title: 15 words.</w:t>
+        </w:rPr>
+        <w:t xml:space="preserve">Word count: 1478 words (main text including headings; excluding title, author details, end statements and references). Title: 16 words.</w:t>
       </w:r>
     </w:p>
     <w:p>
@@ -307,49 +282,17 @@
           <w:szCs w:val="24"/>
           <w:vertAlign w:val="superscript"/>
         </w:rPr>
-        <w:t xml:space="preserve">1,2</w:t>
-      </w:r>
-      <w:r>
-        <w:rPr>
-          <w:rFonts w:ascii="Times New Roman" w:cs="Times New Roman" w:eastAsia="Times New Roman" w:hAnsi="Times New Roman"/>
-          <w:b w:val="false"/>
-          <w:bCs w:val="false"/>
-          <w:sz w:val="24"/>
-          <w:szCs w:val="24"/>
-        </w:rPr>
-        <w:t xml:space="preserve"> and for their recognition that silent override “deserves the governance attention the authors call for”.</w:t>
-      </w:r>
-      <w:r>
-        <w:rPr>
-          <w:rFonts w:ascii="Times New Roman" w:cs="Times New Roman" w:eastAsia="Times New Roman" w:hAnsi="Times New Roman"/>
-          <w:b w:val="false"/>
-          <w:bCs w:val="false"/>
-          <w:sz w:val="24"/>
-          <w:szCs w:val="24"/>
-          <w:vertAlign w:val="superscript"/>
-        </w:rPr>
-        <w:t xml:space="preserve">1</w:t>
-      </w:r>
-      <w:r>
-        <w:rPr>
-          <w:rFonts w:ascii="Times New Roman" w:cs="Times New Roman" w:eastAsia="Times New Roman" w:hAnsi="Times New Roman"/>
-          <w:b w:val="false"/>
-          <w:bCs w:val="false"/>
-          <w:sz w:val="24"/>
-          <w:szCs w:val="24"/>
-        </w:rPr>
-        <w:t xml:space="preserve"> They accept that interviews “capture well how nurses make sense of their reliance”; their concern is “one inferential step: from nurses’ accounts of trust to the claim that this trust is calibrated”.</w:t>
-      </w:r>
-      <w:r>
-        <w:rPr>
-          <w:rFonts w:ascii="Times New Roman" w:cs="Times New Roman" w:eastAsia="Times New Roman" w:hAnsi="Times New Roman"/>
-          <w:b w:val="false"/>
-          <w:bCs w:val="false"/>
-          <w:sz w:val="24"/>
-          <w:szCs w:val="24"/>
-          <w:vertAlign w:val="superscript"/>
-        </w:rPr>
-        <w:t xml:space="preserve">1</w:t>
+        <w:t xml:space="preserve">1</w:t>
+      </w:r>
+      <w:r>
+        <w:rPr>
+          <w:rFonts w:ascii="Times New Roman" w:cs="Times New Roman" w:eastAsia="Times New Roman" w:hAnsi="Times New Roman"/>
+          <w:b w:val="false"/>
+          <w:bCs w:val="false"/>
+          <w:sz w:val="24"/>
+          <w:szCs w:val="24"/>
+        </w:rPr>
+        <w:t xml:space="preserve"> and for their recognition that silent override “deserves the governance attention the authors call for”. They accept that interviews “capture well how nurses make sense of their reliance”; their concern is “one inferential step: from nurses’ accounts of trust to the claim that this trust is calibrated”. We agree that reported adjustment of trust does not establish accurate calibration. Equally, understanding how nurses interpret alerts and negotiate responsibility makes a distinct contribution to the safe use of AI.</w:t>
       </w:r>
     </w:p>
     <w:p>
@@ -392,6 +335,48 @@
           <w:szCs w:val="24"/>
           <w:vertAlign w:val="superscript"/>
         </w:rPr>
+        <w:t xml:space="preserve">2</w:t>
+      </w:r>
+      <w:r>
+        <w:rPr>
+          <w:rFonts w:ascii="Times New Roman" w:cs="Times New Roman" w:eastAsia="Times New Roman" w:hAnsi="Times New Roman"/>
+          <w:b w:val="false"/>
+          <w:bCs w:val="false"/>
+          <w:sz w:val="24"/>
+          <w:szCs w:val="24"/>
+        </w:rPr>
+        <w:t xml:space="preserve"> Automation bias theory “sensitised the study” while “remaining subordinate to the inductive, interpretive commitments” of the design.</w:t>
+      </w:r>
+      <w:r>
+        <w:rPr>
+          <w:rFonts w:ascii="Times New Roman" w:cs="Times New Roman" w:eastAsia="Times New Roman" w:hAnsi="Times New Roman"/>
+          <w:b w:val="false"/>
+          <w:bCs w:val="false"/>
+          <w:sz w:val="24"/>
+          <w:szCs w:val="24"/>
+          <w:vertAlign w:val="superscript"/>
+        </w:rPr>
+        <w:t xml:space="preserve">1</w:t>
+      </w:r>
+      <w:r>
+        <w:rPr>
+          <w:rFonts w:ascii="Times New Roman" w:cs="Times New Roman" w:eastAsia="Times New Roman" w:hAnsi="Times New Roman"/>
+          <w:b w:val="false"/>
+          <w:bCs w:val="false"/>
+          <w:sz w:val="24"/>
+          <w:szCs w:val="24"/>
+        </w:rPr>
+        <w:t xml:space="preserve"> In Blumer’s terms, automation bias was a sensitising concept, suggesting “directions along which to look” rather than “prescriptions of what to see”.</w:t>
+      </w:r>
+      <w:r>
+        <w:rPr>
+          <w:rFonts w:ascii="Times New Roman" w:cs="Times New Roman" w:eastAsia="Times New Roman" w:hAnsi="Times New Roman"/>
+          <w:b w:val="false"/>
+          <w:bCs w:val="false"/>
+          <w:sz w:val="24"/>
+          <w:szCs w:val="24"/>
+          <w:vertAlign w:val="superscript"/>
+        </w:rPr>
         <w:t xml:space="preserve">3</w:t>
       </w:r>
       <w:r>
@@ -402,28 +387,7 @@
           <w:sz w:val="24"/>
           <w:szCs w:val="24"/>
         </w:rPr>
-        <w:t xml:space="preserve"> As our framework stated, automation bias theory “sensitised the study” while “remaining subordinate to the inductive, interpretive commitments” of the design.</w:t>
-      </w:r>
-      <w:r>
-        <w:rPr>
-          <w:rFonts w:ascii="Times New Roman" w:cs="Times New Roman" w:eastAsia="Times New Roman" w:hAnsi="Times New Roman"/>
-          <w:b w:val="false"/>
-          <w:bCs w:val="false"/>
-          <w:sz w:val="24"/>
-          <w:szCs w:val="24"/>
-          <w:vertAlign w:val="superscript"/>
-        </w:rPr>
-        <w:t xml:space="preserve">2</w:t>
-      </w:r>
-      <w:r>
-        <w:rPr>
-          <w:rFonts w:ascii="Times New Roman" w:cs="Times New Roman" w:eastAsia="Times New Roman" w:hAnsi="Times New Roman"/>
-          <w:b w:val="false"/>
-          <w:bCs w:val="false"/>
-          <w:sz w:val="24"/>
-          <w:szCs w:val="24"/>
-        </w:rPr>
-        <w:t xml:space="preserve"> In Blumer’s terms, automation bias was a sensitising concept, suggesting “directions along which to look” rather than “prescriptions of what to see”.</w:t>
+        <w:t xml:space="preserve"> We agree that automation bias is identified through the omission and commission errors it produces</w:t>
       </w:r>
       <w:r>
         <w:rPr>
@@ -444,39 +408,18 @@
           <w:sz w:val="24"/>
           <w:szCs w:val="24"/>
         </w:rPr>
-        <w:t xml:space="preserve"> We agree that automation bias is identified through the omission and commission errors it produces.</w:t>
-      </w:r>
-      <w:r>
-        <w:rPr>
-          <w:rFonts w:ascii="Times New Roman" w:cs="Times New Roman" w:eastAsia="Times New Roman" w:hAnsi="Times New Roman"/>
-          <w:b w:val="false"/>
-          <w:bCs w:val="false"/>
-          <w:sz w:val="24"/>
-          <w:szCs w:val="24"/>
-          <w:vertAlign w:val="superscript"/>
-        </w:rPr>
-        <w:t xml:space="preserve">5</w:t>
-      </w:r>
-      <w:r>
-        <w:rPr>
-          <w:rFonts w:ascii="Times New Roman" w:cs="Times New Roman" w:eastAsia="Times New Roman" w:hAnsi="Times New Roman"/>
-          <w:b w:val="false"/>
-          <w:bCs w:val="false"/>
-          <w:sz w:val="24"/>
-          <w:szCs w:val="24"/>
-        </w:rPr>
-        <w:t xml:space="preserve"> No interview can capture an unrecognised error, and we claimed to detect none. What participants could describe was the pull towards the aid: an early period of “giving the score more authority than their own assessment”, and “an uneasy tendency to wait for the alert rather than lead surveillance”.</w:t>
-      </w:r>
-      <w:r>
-        <w:rPr>
-          <w:rFonts w:ascii="Times New Roman" w:cs="Times New Roman" w:eastAsia="Times New Roman" w:hAnsi="Times New Roman"/>
-          <w:b w:val="false"/>
-          <w:bCs w:val="false"/>
-          <w:sz w:val="24"/>
-          <w:szCs w:val="24"/>
-          <w:vertAlign w:val="superscript"/>
-        </w:rPr>
-        <w:t xml:space="preserve">2</w:t>
+        <w:t xml:space="preserve">; no interview can capture an unrecognised error, and we claimed to detect none. What participants could describe was the pull towards the aid: an early period of “giving the score more authority than their own assessment”, and “an uneasy tendency to wait for the alert rather than lead surveillance”.</w:t>
+      </w:r>
+      <w:r>
+        <w:rPr>
+          <w:rFonts w:ascii="Times New Roman" w:cs="Times New Roman" w:eastAsia="Times New Roman" w:hAnsi="Times New Roman"/>
+          <w:b w:val="false"/>
+          <w:bCs w:val="false"/>
+          <w:sz w:val="24"/>
+          <w:szCs w:val="24"/>
+          <w:vertAlign w:val="superscript"/>
+        </w:rPr>
+        <w:t xml:space="preserve">1</w:t>
       </w:r>
       <w:r>
         <w:rPr>
@@ -513,91 +456,91 @@
           <w:szCs w:val="24"/>
           <w:vertAlign w:val="superscript"/>
         </w:rPr>
+        <w:t xml:space="preserve">5</w:t>
+      </w:r>
+      <w:r>
+        <w:rPr>
+          <w:rFonts w:ascii="Times New Roman" w:cs="Times New Roman" w:eastAsia="Times New Roman" w:hAnsi="Times New Roman"/>
+          <w:b w:val="false"/>
+          <w:bCs w:val="false"/>
+          <w:sz w:val="24"/>
+          <w:szCs w:val="24"/>
+        </w:rPr>
+        <w:t xml:space="preserve"> and that interviews cannot establish it. Our statement that trust was “actively calibrated through experience” suggests more than our design supports.</w:t>
+      </w:r>
+      <w:r>
+        <w:rPr>
+          <w:rFonts w:ascii="Times New Roman" w:cs="Times New Roman" w:eastAsia="Times New Roman" w:hAnsi="Times New Roman"/>
+          <w:b w:val="false"/>
+          <w:bCs w:val="false"/>
+          <w:sz w:val="24"/>
+          <w:szCs w:val="24"/>
+          <w:vertAlign w:val="superscript"/>
+        </w:rPr>
+        <w:t xml:space="preserve">1</w:t>
+      </w:r>
+      <w:r>
+        <w:rPr>
+          <w:rFonts w:ascii="Times New Roman" w:cs="Times New Roman" w:eastAsia="Times New Roman" w:hAnsi="Times New Roman"/>
+          <w:b w:val="false"/>
+          <w:bCs w:val="false"/>
+          <w:sz w:val="24"/>
+          <w:szCs w:val="24"/>
+        </w:rPr>
+        <w:t xml:space="preserve"> The precise formulation is that participants described adjusting their trust through experience; the accuracy of those adjustments was not evaluated. Our Limitations drew this line, placing ‘calibrated trust’ in quotation marks, to be read as “considered self-understanding rather than as a verified description of in-the-moment behaviour”.</w:t>
+      </w:r>
+      <w:r>
+        <w:rPr>
+          <w:rFonts w:ascii="Times New Roman" w:cs="Times New Roman" w:eastAsia="Times New Roman" w:hAnsi="Times New Roman"/>
+          <w:b w:val="false"/>
+          <w:bCs w:val="false"/>
+          <w:sz w:val="24"/>
+          <w:szCs w:val="24"/>
+          <w:vertAlign w:val="superscript"/>
+        </w:rPr>
+        <w:t xml:space="preserve">1</w:t>
+      </w:r>
+      <w:r>
+        <w:rPr>
+          <w:rFonts w:ascii="Times New Roman" w:cs="Times New Roman" w:eastAsia="Times New Roman" w:hAnsi="Times New Roman"/>
+          <w:b w:val="false"/>
+          <w:bCs w:val="false"/>
+          <w:sz w:val="24"/>
+          <w:szCs w:val="24"/>
+        </w:rPr>
+        <w:t xml:space="preserve"> Likewise, “correctly dismissing” should read as dismissing an alert the nurse judged unhelpful, and junior nurses’ “greater tendency towards early overreliance” summarised accounts, not measured rates.</w:t>
+      </w:r>
+      <w:r>
+        <w:rPr>
+          <w:rFonts w:ascii="Times New Roman" w:cs="Times New Roman" w:eastAsia="Times New Roman" w:hAnsi="Times New Roman"/>
+          <w:b w:val="false"/>
+          <w:bCs w:val="false"/>
+          <w:sz w:val="24"/>
+          <w:szCs w:val="24"/>
+          <w:vertAlign w:val="superscript"/>
+        </w:rPr>
+        <w:t xml:space="preserve">1</w:t>
+      </w:r>
+      <w:r>
+        <w:rPr>
+          <w:rFonts w:ascii="Times New Roman" w:cs="Times New Roman" w:eastAsia="Times New Roman" w:hAnsi="Times New Roman"/>
+          <w:b w:val="false"/>
+          <w:bCs w:val="false"/>
+          <w:sz w:val="24"/>
+          <w:szCs w:val="24"/>
+        </w:rPr>
+        <w:t xml:space="preserve"> As Kahneman and Klein conclude, “subjective experience is not a reliable indicator of judgment accuracy”.</w:t>
+      </w:r>
+      <w:r>
+        <w:rPr>
+          <w:rFonts w:ascii="Times New Roman" w:cs="Times New Roman" w:eastAsia="Times New Roman" w:hAnsi="Times New Roman"/>
+          <w:b w:val="false"/>
+          <w:bCs w:val="false"/>
+          <w:sz w:val="24"/>
+          <w:szCs w:val="24"/>
+          <w:vertAlign w:val="superscript"/>
+        </w:rPr>
         <w:t xml:space="preserve">6</w:t>
-      </w:r>
-      <w:r>
-        <w:rPr>
-          <w:rFonts w:ascii="Times New Roman" w:cs="Times New Roman" w:eastAsia="Times New Roman" w:hAnsi="Times New Roman"/>
-          <w:b w:val="false"/>
-          <w:bCs w:val="false"/>
-          <w:sz w:val="24"/>
-          <w:szCs w:val="24"/>
-        </w:rPr>
-        <w:t xml:space="preserve"> and that interviews cannot establish it. We accept, however, that our statement that trust was “actively calibrated through experience” can be read as reporting an achievement rather than an activity.</w:t>
-      </w:r>
-      <w:r>
-        <w:rPr>
-          <w:rFonts w:ascii="Times New Roman" w:cs="Times New Roman" w:eastAsia="Times New Roman" w:hAnsi="Times New Roman"/>
-          <w:b w:val="false"/>
-          <w:bCs w:val="false"/>
-          <w:sz w:val="24"/>
-          <w:szCs w:val="24"/>
-          <w:vertAlign w:val="superscript"/>
-        </w:rPr>
-        <w:t xml:space="preserve">2</w:t>
-      </w:r>
-      <w:r>
-        <w:rPr>
-          <w:rFonts w:ascii="Times New Roman" w:cs="Times New Roman" w:eastAsia="Times New Roman" w:hAnsi="Times New Roman"/>
-          <w:b w:val="false"/>
-          <w:bCs w:val="false"/>
-          <w:sz w:val="24"/>
-          <w:szCs w:val="24"/>
-        </w:rPr>
-        <w:t xml:space="preserve"> Elsewhere we framed calibration as work, trust that was “conditional, experience-dependent, and continually adjusted”, and our Limitations placed ‘calibrated trust’ in quotation marks, to be read as “considered self-understanding rather than as a verified description of in-the-moment behaviour”.</w:t>
-      </w:r>
-      <w:r>
-        <w:rPr>
-          <w:rFonts w:ascii="Times New Roman" w:cs="Times New Roman" w:eastAsia="Times New Roman" w:hAnsi="Times New Roman"/>
-          <w:b w:val="false"/>
-          <w:bCs w:val="false"/>
-          <w:sz w:val="24"/>
-          <w:szCs w:val="24"/>
-          <w:vertAlign w:val="superscript"/>
-        </w:rPr>
-        <w:t xml:space="preserve">2</w:t>
-      </w:r>
-      <w:r>
-        <w:rPr>
-          <w:rFonts w:ascii="Times New Roman" w:cs="Times New Roman" w:eastAsia="Times New Roman" w:hAnsi="Times New Roman"/>
-          <w:b w:val="false"/>
-          <w:bCs w:val="false"/>
-          <w:sz w:val="24"/>
-          <w:szCs w:val="24"/>
-        </w:rPr>
-        <w:t xml:space="preserve"> ‘Calibrating’ names work that can succeed or fail; ‘calibrated’ asserts its success. Our data speak to the first. Our phrase “correctly dismissing” an alert therefore went beyond them, and junior nurses’ “greater tendency towards early overreliance” summarised accounts, not measured rates.</w:t>
-      </w:r>
-      <w:r>
-        <w:rPr>
-          <w:rFonts w:ascii="Times New Roman" w:cs="Times New Roman" w:eastAsia="Times New Roman" w:hAnsi="Times New Roman"/>
-          <w:b w:val="false"/>
-          <w:bCs w:val="false"/>
-          <w:sz w:val="24"/>
-          <w:szCs w:val="24"/>
-          <w:vertAlign w:val="superscript"/>
-        </w:rPr>
-        <w:t xml:space="preserve">2</w:t>
-      </w:r>
-      <w:r>
-        <w:rPr>
-          <w:rFonts w:ascii="Times New Roman" w:cs="Times New Roman" w:eastAsia="Times New Roman" w:hAnsi="Times New Roman"/>
-          <w:b w:val="false"/>
-          <w:bCs w:val="false"/>
-          <w:sz w:val="24"/>
-          <w:szCs w:val="24"/>
-        </w:rPr>
-        <w:t xml:space="preserve"> As Kahneman and Klein conclude, “subjective experience is not a reliable indicator of judgment accuracy”.</w:t>
-      </w:r>
-      <w:r>
-        <w:rPr>
-          <w:rFonts w:ascii="Times New Roman" w:cs="Times New Roman" w:eastAsia="Times New Roman" w:hAnsi="Times New Roman"/>
-          <w:b w:val="false"/>
-          <w:bCs w:val="false"/>
-          <w:sz w:val="24"/>
-          <w:szCs w:val="24"/>
-          <w:vertAlign w:val="superscript"/>
-        </w:rPr>
-        <w:t xml:space="preserve">7</w:t>
       </w:r>
     </w:p>
     <w:p>
@@ -624,7 +567,7 @@
           <w:szCs w:val="24"/>
           <w:vertAlign w:val="superscript"/>
         </w:rPr>
-        <w:t xml:space="preserve">6</w:t>
+        <w:t xml:space="preserve">5</w:t>
       </w:r>
       <w:r>
         <w:rPr>
@@ -645,7 +588,7 @@
           <w:szCs w:val="24"/>
           <w:vertAlign w:val="superscript"/>
         </w:rPr>
-        <w:t xml:space="preserve">2</w:t>
+        <w:t xml:space="preserve">1</w:t>
       </w:r>
       <w:r>
         <w:rPr>
@@ -666,7 +609,7 @@
           <w:szCs w:val="24"/>
           <w:vertAlign w:val="superscript"/>
         </w:rPr>
-        <w:t xml:space="preserve">8</w:t>
+        <w:t xml:space="preserve">7</w:t>
       </w:r>
       <w:r>
         <w:rPr>
@@ -703,7 +646,7 @@
           <w:szCs w:val="24"/>
           <w:vertAlign w:val="superscript"/>
         </w:rPr>
-        <w:t xml:space="preserve">9</w:t>
+        <w:t xml:space="preserve">8</w:t>
       </w:r>
       <w:r>
         <w:rPr>
@@ -724,7 +667,7 @@
           <w:szCs w:val="24"/>
           <w:vertAlign w:val="superscript"/>
         </w:rPr>
-        <w:t xml:space="preserve">2</w:t>
+        <w:t xml:space="preserve">1</w:t>
       </w:r>
     </w:p>
     <w:p>
@@ -751,28 +694,28 @@
           <w:szCs w:val="24"/>
           <w:vertAlign w:val="superscript"/>
         </w:rPr>
-        <w:t xml:space="preserve">1,5,6</w:t>
-      </w:r>
-      <w:r>
-        <w:rPr>
-          <w:rFonts w:ascii="Times New Roman" w:cs="Times New Roman" w:eastAsia="Times New Roman" w:hAnsi="Times New Roman"/>
-          <w:b w:val="false"/>
-          <w:bCs w:val="false"/>
-          <w:sz w:val="24"/>
-          <w:szCs w:val="24"/>
-        </w:rPr>
-        <w:t xml:space="preserve"> and that our phrase “complicate prevailing accounts” overstated the contrast. Our contribution is to show, from inside critical care nursing, the organisational and cultural context within which Lee and See place trust</w:t>
-      </w:r>
-      <w:r>
-        <w:rPr>
-          <w:rFonts w:ascii="Times New Roman" w:cs="Times New Roman" w:eastAsia="Times New Roman" w:hAnsi="Times New Roman"/>
-          <w:b w:val="false"/>
-          <w:bCs w:val="false"/>
-          <w:sz w:val="24"/>
-          <w:szCs w:val="24"/>
-          <w:vertAlign w:val="superscript"/>
-        </w:rPr>
-        <w:t xml:space="preserve">6</w:t>
+        <w:t xml:space="preserve">4,5</w:t>
+      </w:r>
+      <w:r>
+        <w:rPr>
+          <w:rFonts w:ascii="Times New Roman" w:cs="Times New Roman" w:eastAsia="Times New Roman" w:hAnsi="Times New Roman"/>
+          <w:b w:val="false"/>
+          <w:bCs w:val="false"/>
+          <w:sz w:val="24"/>
+          <w:szCs w:val="24"/>
+        </w:rPr>
+        <w:t xml:space="preserve"> and that our phrase “complicate prevailing accounts” overstated the contrast. Our contribution is to give nursing content to the organisational and cultural context within which Lee and See place trust</w:t>
+      </w:r>
+      <w:r>
+        <w:rPr>
+          <w:rFonts w:ascii="Times New Roman" w:cs="Times New Roman" w:eastAsia="Times New Roman" w:hAnsi="Times New Roman"/>
+          <w:b w:val="false"/>
+          <w:bCs w:val="false"/>
+          <w:sz w:val="24"/>
+          <w:szCs w:val="24"/>
+          <w:vertAlign w:val="superscript"/>
+        </w:rPr>
+        <w:t xml:space="preserve">5</w:t>
       </w:r>
       <w:r>
         <w:rPr>
@@ -814,49 +757,28 @@
           <w:sz w:val="24"/>
           <w:szCs w:val="24"/>
         </w:rPr>
-        <w:t xml:space="preserve">The commentators offer a “complementary reading” of the trajectory we described, and we accept it as such.</w:t>
-      </w:r>
-      <w:r>
-        <w:rPr>
-          <w:rFonts w:ascii="Times New Roman" w:cs="Times New Roman" w:eastAsia="Times New Roman" w:hAnsi="Times New Roman"/>
-          <w:b w:val="false"/>
-          <w:bCs w:val="false"/>
-          <w:sz w:val="24"/>
-          <w:szCs w:val="24"/>
-          <w:vertAlign w:val="superscript"/>
-        </w:rPr>
-        <w:t xml:space="preserve">1</w:t>
-      </w:r>
-      <w:r>
-        <w:rPr>
-          <w:rFonts w:ascii="Times New Roman" w:cs="Times New Roman" w:eastAsia="Times New Roman" w:hAnsi="Times New Roman"/>
-          <w:b w:val="false"/>
-          <w:bCs w:val="false"/>
-          <w:sz w:val="24"/>
-          <w:szCs w:val="24"/>
-        </w:rPr>
-        <w:t xml:space="preserve"> It also exposes a gap: we noted that omission-type vulnerability is “unlikely to become visible until a deterioration is missed”,</w:t>
-      </w:r>
-      <w:r>
-        <w:rPr>
-          <w:rFonts w:ascii="Times New Roman" w:cs="Times New Roman" w:eastAsia="Times New Roman" w:hAnsi="Times New Roman"/>
-          <w:b w:val="false"/>
-          <w:bCs w:val="false"/>
-          <w:sz w:val="24"/>
-          <w:szCs w:val="24"/>
-          <w:vertAlign w:val="superscript"/>
-        </w:rPr>
-        <w:t xml:space="preserve">2</w:t>
-      </w:r>
-      <w:r>
-        <w:rPr>
-          <w:rFonts w:ascii="Times New Roman" w:cs="Times New Roman" w:eastAsia="Times New Roman" w:hAnsi="Times New Roman"/>
-          <w:b w:val="false"/>
-          <w:bCs w:val="false"/>
-          <w:sz w:val="24"/>
-          <w:szCs w:val="24"/>
-        </w:rPr>
-        <w:t xml:space="preserve"> but did not follow that point through to how trust is learned.</w:t>
+        <w:t xml:space="preserve">The commentators offer a “complementary reading” of the trajectory we described, and we accept it as such. It exposes a gap: we noted that omission-type vulnerability is “unlikely to become visible until a deterioration is missed”,</w:t>
+      </w:r>
+      <w:r>
+        <w:rPr>
+          <w:rFonts w:ascii="Times New Roman" w:cs="Times New Roman" w:eastAsia="Times New Roman" w:hAnsi="Times New Roman"/>
+          <w:b w:val="false"/>
+          <w:bCs w:val="false"/>
+          <w:sz w:val="24"/>
+          <w:szCs w:val="24"/>
+          <w:vertAlign w:val="superscript"/>
+        </w:rPr>
+        <w:t xml:space="preserve">1</w:t>
+      </w:r>
+      <w:r>
+        <w:rPr>
+          <w:rFonts w:ascii="Times New Roman" w:cs="Times New Roman" w:eastAsia="Times New Roman" w:hAnsi="Times New Roman"/>
+          <w:b w:val="false"/>
+          <w:bCs w:val="false"/>
+          <w:sz w:val="24"/>
+          <w:szCs w:val="24"/>
+        </w:rPr>
+        <w:t xml:space="preserve"> but did not follow that point through to how trust is learned. Their reading is a plausible hypothesis rather than a demonstrated mechanism; like ours, it interprets the same accounts, and interviews cannot settle the choice between them.</w:t>
       </w:r>
     </w:p>
     <w:p>
@@ -872,28 +794,91 @@
           <w:sz w:val="24"/>
           <w:szCs w:val="24"/>
         </w:rPr>
-        <w:t xml:space="preserve">First, their reading, like ours, interprets the same accounts; as they note, the trajectory “equally fits” their reading.</w:t>
-      </w:r>
-      <w:r>
-        <w:rPr>
-          <w:rFonts w:ascii="Times New Roman" w:cs="Times New Roman" w:eastAsia="Times New Roman" w:hAnsi="Times New Roman"/>
-          <w:b w:val="false"/>
-          <w:bCs w:val="false"/>
-          <w:sz w:val="24"/>
-          <w:szCs w:val="24"/>
-          <w:vertAlign w:val="superscript"/>
-        </w:rPr>
-        <w:t xml:space="preserve">1</w:t>
-      </w:r>
-      <w:r>
-        <w:rPr>
-          <w:rFonts w:ascii="Times New Roman" w:cs="Times New Roman" w:eastAsia="Times New Roman" w:hAnsi="Times New Roman"/>
-          <w:b w:val="false"/>
-          <w:bCs w:val="false"/>
-          <w:sz w:val="24"/>
-          <w:szCs w:val="24"/>
-        </w:rPr>
-        <w:t xml:space="preserve"> Interviews cannot settle the choice, and both readings can be tested.</w:t>
+        <w:t xml:space="preserve">Feedback about correctness is incomplete in both directions. As the commentators acknowledge, an alert followed by no deterioration may reflect successful intervention rather than a false alarm; conversely, deterioration that nurses recognise can make an absent warning visible. Participants described patients who “appeared clinically worse than the score suggested” and learned “which situations it did not capture well”.</w:t>
+      </w:r>
+      <w:r>
+        <w:rPr>
+          <w:rFonts w:ascii="Times New Roman" w:cs="Times New Roman" w:eastAsia="Times New Roman" w:hAnsi="Times New Roman"/>
+          <w:b w:val="false"/>
+          <w:bCs w:val="false"/>
+          <w:sz w:val="24"/>
+          <w:szCs w:val="24"/>
+          <w:vertAlign w:val="superscript"/>
+        </w:rPr>
+        <w:t xml:space="preserve">1</w:t>
+      </w:r>
+      <w:r>
+        <w:rPr>
+          <w:rFonts w:ascii="Times New Roman" w:cs="Times New Roman" w:eastAsia="Times New Roman" w:hAnsi="Times New Roman"/>
+          <w:b w:val="false"/>
+          <w:bCs w:val="false"/>
+          <w:sz w:val="24"/>
+          <w:szCs w:val="24"/>
+        </w:rPr>
+        <w:t xml:space="preserve"> These were, however, misses that nurses themselves caught (P09). Misses shared by nurse and model remain unrecognised as model failures, and rare events accumulate slowly within 7 to 26 months of exposure.</w:t>
+      </w:r>
+      <w:r>
+        <w:rPr>
+          <w:rFonts w:ascii="Times New Roman" w:cs="Times New Roman" w:eastAsia="Times New Roman" w:hAnsi="Times New Roman"/>
+          <w:b w:val="false"/>
+          <w:bCs w:val="false"/>
+          <w:sz w:val="24"/>
+          <w:szCs w:val="24"/>
+          <w:vertAlign w:val="superscript"/>
+        </w:rPr>
+        <w:t xml:space="preserve">1</w:t>
+      </w:r>
+      <w:r>
+        <w:rPr>
+          <w:rFonts w:ascii="Times New Roman" w:cs="Times New Roman" w:eastAsia="Times New Roman" w:hAnsi="Times New Roman"/>
+          <w:b w:val="false"/>
+          <w:bCs w:val="false"/>
+          <w:sz w:val="24"/>
+          <w:szCs w:val="24"/>
+        </w:rPr>
+        <w:t xml:space="preserve"> This strengthens our argument that surveillance skills “must be deliberately taught, practised and protected”</w:t>
+      </w:r>
+      <w:r>
+        <w:rPr>
+          <w:rFonts w:ascii="Times New Roman" w:cs="Times New Roman" w:eastAsia="Times New Roman" w:hAnsi="Times New Roman"/>
+          <w:b w:val="false"/>
+          <w:bCs w:val="false"/>
+          <w:sz w:val="24"/>
+          <w:szCs w:val="24"/>
+          <w:vertAlign w:val="superscript"/>
+        </w:rPr>
+        <w:t xml:space="preserve">1</w:t>
+      </w:r>
+      <w:r>
+        <w:rPr>
+          <w:rFonts w:ascii="Times New Roman" w:cs="Times New Roman" w:eastAsia="Times New Roman" w:hAnsi="Times New Roman"/>
+          <w:b w:val="false"/>
+          <w:bCs w:val="false"/>
+          <w:sz w:val="24"/>
+          <w:szCs w:val="24"/>
+        </w:rPr>
+        <w:t xml:space="preserve">: if surveillance erodes into alert-dependence, misses go not only undetected but unlearned. Surveillance alone is not enough: knowledge pooled through “peer exchange”</w:t>
+      </w:r>
+      <w:r>
+        <w:rPr>
+          <w:rFonts w:ascii="Times New Roman" w:cs="Times New Roman" w:eastAsia="Times New Roman" w:hAnsi="Times New Roman"/>
+          <w:b w:val="false"/>
+          <w:bCs w:val="false"/>
+          <w:sz w:val="24"/>
+          <w:szCs w:val="24"/>
+          <w:vertAlign w:val="superscript"/>
+        </w:rPr>
+        <w:t xml:space="preserve">1</w:t>
+      </w:r>
+      <w:r>
+        <w:rPr>
+          <w:rFonts w:ascii="Times New Roman" w:cs="Times New Roman" w:eastAsia="Times New Roman" w:hAnsi="Times New Roman"/>
+          <w:b w:val="false"/>
+          <w:bCs w:val="false"/>
+          <w:sz w:val="24"/>
+          <w:szCs w:val="24"/>
+        </w:rPr>
+        <w:t xml:space="preserve"> shares the same asymmetry; the nurse-facing performance reports the commentators propose would supply the feedback that neither experience nor training alone provides.</w:t>
       </w:r>
     </w:p>
     <w:p>
@@ -909,91 +894,86 @@
           <w:sz w:val="24"/>
           <w:szCs w:val="24"/>
         </w:rPr>
-        <w:t xml:space="preserve">Second, participants’ experience was not of false alarms alone: they described patients who “appeared clinically worse than the score suggested” and learned “which situations it did not capture well”.</w:t>
-      </w:r>
-      <w:r>
-        <w:rPr>
-          <w:rFonts w:ascii="Times New Roman" w:cs="Times New Roman" w:eastAsia="Times New Roman" w:hAnsi="Times New Roman"/>
-          <w:b w:val="false"/>
-          <w:bCs w:val="false"/>
-          <w:sz w:val="24"/>
-          <w:szCs w:val="24"/>
-          <w:vertAlign w:val="superscript"/>
-        </w:rPr>
-        <w:t xml:space="preserve">2</w:t>
-      </w:r>
-      <w:r>
-        <w:rPr>
-          <w:rFonts w:ascii="Times New Roman" w:cs="Times New Roman" w:eastAsia="Times New Roman" w:hAnsi="Times New Roman"/>
-          <w:b w:val="false"/>
-          <w:bCs w:val="false"/>
-          <w:sz w:val="24"/>
-          <w:szCs w:val="24"/>
-        </w:rPr>
-        <w:t xml:space="preserve"> These were, however, misses that nurses themselves caught (P09), and here the asymmetry bites. Surveillance reveals only the misses nurses detect, leaving misses shared by nurse and model unrecognised as model failures, and rare events accumulate slowly within 7 to 26 months of exposure.</w:t>
-      </w:r>
-      <w:r>
-        <w:rPr>
-          <w:rFonts w:ascii="Times New Roman" w:cs="Times New Roman" w:eastAsia="Times New Roman" w:hAnsi="Times New Roman"/>
-          <w:b w:val="false"/>
-          <w:bCs w:val="false"/>
-          <w:sz w:val="24"/>
-          <w:szCs w:val="24"/>
-          <w:vertAlign w:val="superscript"/>
-        </w:rPr>
-        <w:t xml:space="preserve">2</w:t>
-      </w:r>
-      <w:r>
-        <w:rPr>
-          <w:rFonts w:ascii="Times New Roman" w:cs="Times New Roman" w:eastAsia="Times New Roman" w:hAnsi="Times New Roman"/>
-          <w:b w:val="false"/>
-          <w:bCs w:val="false"/>
-          <w:sz w:val="24"/>
-          <w:szCs w:val="24"/>
-        </w:rPr>
-        <w:t xml:space="preserve"> This strengthens our argument that surveillance skills “must be deliberately taught, practised and protected”</w:t>
-      </w:r>
-      <w:r>
-        <w:rPr>
-          <w:rFonts w:ascii="Times New Roman" w:cs="Times New Roman" w:eastAsia="Times New Roman" w:hAnsi="Times New Roman"/>
-          <w:b w:val="false"/>
-          <w:bCs w:val="false"/>
-          <w:sz w:val="24"/>
-          <w:szCs w:val="24"/>
-          <w:vertAlign w:val="superscript"/>
-        </w:rPr>
-        <w:t xml:space="preserve">2</w:t>
-      </w:r>
-      <w:r>
-        <w:rPr>
-          <w:rFonts w:ascii="Times New Roman" w:cs="Times New Roman" w:eastAsia="Times New Roman" w:hAnsi="Times New Roman"/>
-          <w:b w:val="false"/>
-          <w:bCs w:val="false"/>
-          <w:sz w:val="24"/>
-          <w:szCs w:val="24"/>
-        </w:rPr>
-        <w:t xml:space="preserve">: if surveillance erodes into alert-dependence, misses go not only undetected but unlearned. It also shows why surveillance alone is not enough. Participants already pooled knowledge “not in any manual” (P14) through “peer exchange”,</w:t>
-      </w:r>
-      <w:r>
-        <w:rPr>
-          <w:rFonts w:ascii="Times New Roman" w:cs="Times New Roman" w:eastAsia="Times New Roman" w:hAnsi="Times New Roman"/>
-          <w:b w:val="false"/>
-          <w:bCs w:val="false"/>
-          <w:sz w:val="24"/>
-          <w:szCs w:val="24"/>
-          <w:vertAlign w:val="superscript"/>
-        </w:rPr>
-        <w:t xml:space="preserve">2</w:t>
-      </w:r>
-      <w:r>
-        <w:rPr>
-          <w:rFonts w:ascii="Times New Roman" w:cs="Times New Roman" w:eastAsia="Times New Roman" w:hAnsi="Times New Roman"/>
-          <w:b w:val="false"/>
-          <w:bCs w:val="false"/>
-          <w:sz w:val="24"/>
-          <w:szCs w:val="24"/>
-        </w:rPr>
-        <w:t xml:space="preserve"> but pooled experience shares the same asymmetry; the nurse-facing performance reports the commentators propose would supply the feedback that neither experience nor training alone provides.</w:t>
+        <w:t xml:space="preserve">Algorithm aversion, moreover, was demonstrated where people could choose whether to rely on an algorithm after seeing it err</w:t>
+      </w:r>
+      <w:r>
+        <w:rPr>
+          <w:rFonts w:ascii="Times New Roman" w:cs="Times New Roman" w:eastAsia="Times New Roman" w:hAnsi="Times New Roman"/>
+          <w:b w:val="false"/>
+          <w:bCs w:val="false"/>
+          <w:sz w:val="24"/>
+          <w:szCs w:val="24"/>
+          <w:vertAlign w:val="superscript"/>
+        </w:rPr>
+        <w:t xml:space="preserve">9</w:t>
+      </w:r>
+      <w:r>
+        <w:rPr>
+          <w:rFonts w:ascii="Times New Roman" w:cs="Times New Roman" w:eastAsia="Times New Roman" w:hAnsi="Times New Roman"/>
+          <w:b w:val="false"/>
+          <w:bCs w:val="false"/>
+          <w:sz w:val="24"/>
+          <w:szCs w:val="24"/>
+        </w:rPr>
+        <w:t xml:space="preserve">; our participants’ discretion was constrained, though not absent. P17’s account illustrates the commentators’ point about salient false alarms, yet the nurse “still had to process the escalation because the alert existed”.</w:t>
+      </w:r>
+      <w:r>
+        <w:rPr>
+          <w:rFonts w:ascii="Times New Roman" w:cs="Times New Roman" w:eastAsia="Times New Roman" w:hAnsi="Times New Roman"/>
+          <w:b w:val="false"/>
+          <w:bCs w:val="false"/>
+          <w:sz w:val="24"/>
+          <w:szCs w:val="24"/>
+          <w:vertAlign w:val="superscript"/>
+        </w:rPr>
+        <w:t xml:space="preserve">1</w:t>
+      </w:r>
+      <w:r>
+        <w:rPr>
+          <w:rFonts w:ascii="Times New Roman" w:cs="Times New Roman" w:eastAsia="Times New Roman" w:hAnsi="Times New Roman"/>
+          <w:b w:val="false"/>
+          <w:bCs w:val="false"/>
+          <w:sz w:val="24"/>
+          <w:szCs w:val="24"/>
+        </w:rPr>
+        <w:t xml:space="preserve"> An audit log would record that escalation as acceptance, whereas the account shows compliance without trust. Conversely, an unrecorded override leaves no rationale to review against what happened next, and P16’s certainty that an alert was “not real” is the kind of confidence that incomplete feedback can sustain.</w:t>
+      </w:r>
+      <w:r>
+        <w:rPr>
+          <w:rFonts w:ascii="Times New Roman" w:cs="Times New Roman" w:eastAsia="Times New Roman" w:hAnsi="Times New Roman"/>
+          <w:b w:val="false"/>
+          <w:bCs w:val="false"/>
+          <w:sz w:val="24"/>
+          <w:szCs w:val="24"/>
+          <w:vertAlign w:val="superscript"/>
+        </w:rPr>
+        <w:t xml:space="preserve">1</w:t>
+      </w:r>
+      <w:r>
+        <w:rPr>
+          <w:rFonts w:ascii="Times New Roman" w:cs="Times New Roman" w:eastAsia="Times New Roman" w:hAnsi="Times New Roman"/>
+          <w:b w:val="false"/>
+          <w:bCs w:val="false"/>
+          <w:sz w:val="24"/>
+          <w:szCs w:val="24"/>
+        </w:rPr>
+        <w:t xml:space="preserve"> Silent override thus adds an organisational layer to their feedback asymmetry.</w:t>
+      </w:r>
+    </w:p>
+    <w:p>
+      <w:pPr>
+        <w:keepNext/>
+        <w:spacing w:after="120" w:before="240" w:line="360"/>
+      </w:pPr>
+      <w:r>
+        <w:rPr>
+          <w:rFonts w:ascii="Times New Roman" w:cs="Times New Roman" w:eastAsia="Times New Roman" w:hAnsi="Times New Roman"/>
+          <w:b/>
+          <w:bCs/>
+          <w:sz w:val="24"/>
+          <w:szCs w:val="24"/>
+        </w:rPr>
+        <w:t xml:space="preserve">4 | TWO REFERENCE POINTS: THE PATIENT AND THE SYSTEM</w:t>
       </w:r>
     </w:p>
     <w:p>
@@ -1009,7 +989,28 @@
           <w:sz w:val="24"/>
           <w:szCs w:val="24"/>
         </w:rPr>
-        <w:t xml:space="preserve">Third, algorithm aversion was demonstrated where people could choose whether to rely on an algorithm after seeing it err</w:t>
+        <w:t xml:space="preserve">For each alert, our participants’ reference point was the patient in front of them (“I look at my patient”, P03),</w:t>
+      </w:r>
+      <w:r>
+        <w:rPr>
+          <w:rFonts w:ascii="Times New Roman" w:cs="Times New Roman" w:eastAsia="Times New Roman" w:hAnsi="Times New Roman"/>
+          <w:b w:val="false"/>
+          <w:bCs w:val="false"/>
+          <w:sz w:val="24"/>
+          <w:szCs w:val="24"/>
+          <w:vertAlign w:val="superscript"/>
+        </w:rPr>
+        <w:t xml:space="preserve">1</w:t>
+      </w:r>
+      <w:r>
+        <w:rPr>
+          <w:rFonts w:ascii="Times New Roman" w:cs="Times New Roman" w:eastAsia="Times New Roman" w:hAnsi="Times New Roman"/>
+          <w:b w:val="false"/>
+          <w:bCs w:val="false"/>
+          <w:sz w:val="24"/>
+          <w:szCs w:val="24"/>
+        </w:rPr>
+        <w:t xml:space="preserve"> consistent with Tanner’s conclusion that “sound clinical judgment rests to some degree on knowing the patient”.</w:t>
       </w:r>
       <w:r>
         <w:rPr>
@@ -1030,49 +1031,107 @@
           <w:sz w:val="24"/>
           <w:szCs w:val="24"/>
         </w:rPr>
-        <w:t xml:space="preserve">; our participants’ discretion was constrained, though not absent. P17’s account illustrates the commentators’ point about salient false alarms, yet the nurse “still had to process the escalation because the alert existed”.</w:t>
-      </w:r>
-      <w:r>
-        <w:rPr>
-          <w:rFonts w:ascii="Times New Roman" w:cs="Times New Roman" w:eastAsia="Times New Roman" w:hAnsi="Times New Roman"/>
-          <w:b w:val="false"/>
-          <w:bCs w:val="false"/>
-          <w:sz w:val="24"/>
-          <w:szCs w:val="24"/>
-          <w:vertAlign w:val="superscript"/>
-        </w:rPr>
-        <w:t xml:space="preserve">2</w:t>
-      </w:r>
-      <w:r>
-        <w:rPr>
-          <w:rFonts w:ascii="Times New Roman" w:cs="Times New Roman" w:eastAsia="Times New Roman" w:hAnsi="Times New Roman"/>
-          <w:b w:val="false"/>
-          <w:bCs w:val="false"/>
-          <w:sz w:val="24"/>
-          <w:szCs w:val="24"/>
-        </w:rPr>
-        <w:t xml:space="preserve"> Where escalation is required, visible false alarms may shape how nurses regard alerts more than whether they act on them: an audit log would record that escalation as acceptance, whereas the account shows compliance without trust. Conversely, an unrecorded override leaves no rationale to review against what happened next, and P16’s certainty that an alert was “not real” is the kind of confidence that, as the commentators argue, incomplete feedback can sustain.</w:t>
-      </w:r>
-      <w:r>
-        <w:rPr>
-          <w:rFonts w:ascii="Times New Roman" w:cs="Times New Roman" w:eastAsia="Times New Roman" w:hAnsi="Times New Roman"/>
-          <w:b w:val="false"/>
-          <w:bCs w:val="false"/>
-          <w:sz w:val="24"/>
-          <w:szCs w:val="24"/>
-          <w:vertAlign w:val="superscript"/>
-        </w:rPr>
-        <w:t xml:space="preserve">1,2</w:t>
-      </w:r>
-      <w:r>
-        <w:rPr>
-          <w:rFonts w:ascii="Times New Roman" w:cs="Times New Roman" w:eastAsia="Times New Roman" w:hAnsi="Times New Roman"/>
-          <w:b w:val="false"/>
-          <w:bCs w:val="false"/>
-          <w:sz w:val="24"/>
-          <w:szCs w:val="24"/>
-        </w:rPr>
-        <w:t xml:space="preserve"> Silent override thus adds an organisational layer to their feedback asymmetry.</w:t>
+        <w:t xml:space="preserve"> As the commentators argue, a nurse and a model can agree and both be wrong, and an assessment anchored by the alert cannot serve as an independent standard for the same decision. We add a structural reason: the model analyses the same “routinely documented vital signs and laboratory parameters”</w:t>
+      </w:r>
+      <w:r>
+        <w:rPr>
+          <w:rFonts w:ascii="Times New Roman" w:cs="Times New Roman" w:eastAsia="Times New Roman" w:hAnsi="Times New Roman"/>
+          <w:b w:val="false"/>
+          <w:bCs w:val="false"/>
+          <w:sz w:val="24"/>
+          <w:szCs w:val="24"/>
+          <w:vertAlign w:val="superscript"/>
+        </w:rPr>
+        <w:t xml:space="preserve">1</w:t>
+      </w:r>
+      <w:r>
+        <w:rPr>
+          <w:rFonts w:ascii="Times New Roman" w:cs="Times New Roman" w:eastAsia="Times New Roman" w:hAnsi="Times New Roman"/>
+          <w:b w:val="false"/>
+          <w:bCs w:val="false"/>
+          <w:sz w:val="24"/>
+          <w:szCs w:val="24"/>
+        </w:rPr>
+        <w:t xml:space="preserve"> that inform the nurse’s assessment, so the two are not fully independent, and clinicians report judging a model’s accuracy partly by its concordance with their own impressions.</w:t>
+      </w:r>
+      <w:r>
+        <w:rPr>
+          <w:rFonts w:ascii="Times New Roman" w:cs="Times New Roman" w:eastAsia="Times New Roman" w:hAnsi="Times New Roman"/>
+          <w:b w:val="false"/>
+          <w:bCs w:val="false"/>
+          <w:sz w:val="24"/>
+          <w:szCs w:val="24"/>
+          <w:vertAlign w:val="superscript"/>
+        </w:rPr>
+        <w:t xml:space="preserve">11</w:t>
+      </w:r>
+      <w:r>
+        <w:rPr>
+          <w:rFonts w:ascii="Times New Roman" w:cs="Times New Roman" w:eastAsia="Times New Roman" w:hAnsi="Times New Roman"/>
+          <w:b w:val="false"/>
+          <w:bCs w:val="false"/>
+          <w:sz w:val="24"/>
+          <w:szCs w:val="24"/>
+        </w:rPr>
+        <w:t xml:space="preserve"> Whether learned trust tracks the system’s reliability can be known only against a second reference point: local performance data that include missed events.</w:t>
+      </w:r>
+    </w:p>
+    <w:p>
+      <w:pPr>
+        <w:spacing w:after="200" w:before="0" w:line="360"/>
+        <w:jc w:val="both"/>
+      </w:pPr>
+      <w:r>
+        <w:rPr>
+          <w:rFonts w:ascii="Times New Roman" w:cs="Times New Roman" w:eastAsia="Times New Roman" w:hAnsi="Times New Roman"/>
+          <w:b w:val="false"/>
+          <w:bCs w:val="false"/>
+          <w:sz w:val="24"/>
+          <w:szCs w:val="24"/>
+        </w:rPr>
+        <w:t xml:space="preserve">Our article reported no local performance estimates, and we did not audit the model’s proprietary characteristics.</w:t>
+      </w:r>
+      <w:r>
+        <w:rPr>
+          <w:rFonts w:ascii="Times New Roman" w:cs="Times New Roman" w:eastAsia="Times New Roman" w:hAnsi="Times New Roman"/>
+          <w:b w:val="false"/>
+          <w:bCs w:val="false"/>
+          <w:sz w:val="24"/>
+          <w:szCs w:val="24"/>
+          <w:vertAlign w:val="superscript"/>
+        </w:rPr>
+        <w:t xml:space="preserve">1</w:t>
+      </w:r>
+      <w:r>
+        <w:rPr>
+          <w:rFonts w:ascii="Times New Roman" w:cs="Times New Roman" w:eastAsia="Times New Roman" w:hAnsi="Times New Roman"/>
+          <w:b w:val="false"/>
+          <w:bCs w:val="false"/>
+          <w:sz w:val="24"/>
+          <w:szCs w:val="24"/>
+        </w:rPr>
+        <w:t xml:space="preserve"> As the commentators note, the validation they cite concerned another, sepsis-specific model</w:t>
+      </w:r>
+      <w:r>
+        <w:rPr>
+          <w:rFonts w:ascii="Times New Roman" w:cs="Times New Roman" w:eastAsia="Times New Roman" w:hAnsi="Times New Roman"/>
+          <w:b w:val="false"/>
+          <w:bCs w:val="false"/>
+          <w:sz w:val="24"/>
+          <w:szCs w:val="24"/>
+          <w:vertAlign w:val="superscript"/>
+        </w:rPr>
+        <w:t xml:space="preserve">12</w:t>
+      </w:r>
+      <w:r>
+        <w:rPr>
+          <w:rFonts w:ascii="Times New Roman" w:cs="Times New Roman" w:eastAsia="Times New Roman" w:hAnsi="Times New Roman"/>
+          <w:b w:val="false"/>
+          <w:bCs w:val="false"/>
+          <w:sz w:val="24"/>
+          <w:szCs w:val="24"/>
+        </w:rPr>
+        <w:t xml:space="preserve">; its estimates do not describe the general deterioration model our participants used, but its lesson transfers. Local evaluation should specify outcomes, prediction horizons and alert thresholds, account for the effects of clinical intervention, and be made known to nurses.</w:t>
       </w:r>
     </w:p>
     <w:p>
@@ -1088,7 +1147,7 @@
           <w:sz w:val="24"/>
           <w:szCs w:val="24"/>
         </w:rPr>
-        <w:t xml:space="preserve">4 | TWO REFERENCE POINTS: THE PATIENT AND THE SYSTEM</w:t>
+        <w:t xml:space="preserve">5 | ACCOUNTABILITY AND EVALUATION</w:t>
       </w:r>
     </w:p>
     <w:p>
@@ -1104,91 +1163,39 @@
           <w:sz w:val="24"/>
           <w:szCs w:val="24"/>
         </w:rPr>
-        <w:t xml:space="preserve">For each alert, our participants’ reference was the patient in front of them (“I look at my patient”, P03),</w:t>
-      </w:r>
-      <w:r>
-        <w:rPr>
-          <w:rFonts w:ascii="Times New Roman" w:cs="Times New Roman" w:eastAsia="Times New Roman" w:hAnsi="Times New Roman"/>
-          <w:b w:val="false"/>
-          <w:bCs w:val="false"/>
-          <w:sz w:val="24"/>
-          <w:szCs w:val="24"/>
-          <w:vertAlign w:val="superscript"/>
-        </w:rPr>
-        <w:t xml:space="preserve">2</w:t>
-      </w:r>
-      <w:r>
-        <w:rPr>
-          <w:rFonts w:ascii="Times New Roman" w:cs="Times New Roman" w:eastAsia="Times New Roman" w:hAnsi="Times New Roman"/>
-          <w:b w:val="false"/>
-          <w:bCs w:val="false"/>
-          <w:sz w:val="24"/>
-          <w:szCs w:val="24"/>
-        </w:rPr>
-        <w:t xml:space="preserve"> consistent with Tanner’s conclusion that “sound clinical judgment rests to some degree on knowing the patient”.</w:t>
-      </w:r>
-      <w:r>
-        <w:rPr>
-          <w:rFonts w:ascii="Times New Roman" w:cs="Times New Roman" w:eastAsia="Times New Roman" w:hAnsi="Times New Roman"/>
-          <w:b w:val="false"/>
-          <w:bCs w:val="false"/>
-          <w:sz w:val="24"/>
-          <w:szCs w:val="24"/>
-          <w:vertAlign w:val="superscript"/>
-        </w:rPr>
-        <w:t xml:space="preserve">11</w:t>
-      </w:r>
-      <w:r>
-        <w:rPr>
-          <w:rFonts w:ascii="Times New Roman" w:cs="Times New Roman" w:eastAsia="Times New Roman" w:hAnsi="Times New Roman"/>
-          <w:b w:val="false"/>
-          <w:bCs w:val="false"/>
-          <w:sz w:val="24"/>
-          <w:szCs w:val="24"/>
-        </w:rPr>
-        <w:t xml:space="preserve"> We accept the points on anchoring and concordant error, and add a structural reason: the model analyses the same “routinely documented vital signs and laboratory parameters”</w:t>
-      </w:r>
-      <w:r>
-        <w:rPr>
-          <w:rFonts w:ascii="Times New Roman" w:cs="Times New Roman" w:eastAsia="Times New Roman" w:hAnsi="Times New Roman"/>
-          <w:b w:val="false"/>
-          <w:bCs w:val="false"/>
-          <w:sz w:val="24"/>
-          <w:szCs w:val="24"/>
-          <w:vertAlign w:val="superscript"/>
-        </w:rPr>
-        <w:t xml:space="preserve">2</w:t>
-      </w:r>
-      <w:r>
-        <w:rPr>
-          <w:rFonts w:ascii="Times New Roman" w:cs="Times New Roman" w:eastAsia="Times New Roman" w:hAnsi="Times New Roman"/>
-          <w:b w:val="false"/>
-          <w:bCs w:val="false"/>
-          <w:sz w:val="24"/>
-          <w:szCs w:val="24"/>
-        </w:rPr>
-        <w:t xml:space="preserve"> that inform the nurse’s assessment, so the two are not fully independent, and clinicians report judging a deterioration model’s accuracy partly by its concordance with their own impressions.</w:t>
-      </w:r>
-      <w:r>
-        <w:rPr>
-          <w:rFonts w:ascii="Times New Roman" w:cs="Times New Roman" w:eastAsia="Times New Roman" w:hAnsi="Times New Roman"/>
-          <w:b w:val="false"/>
-          <w:bCs w:val="false"/>
-          <w:sz w:val="24"/>
-          <w:szCs w:val="24"/>
-          <w:vertAlign w:val="superscript"/>
-        </w:rPr>
-        <w:t xml:space="preserve">12</w:t>
-      </w:r>
-      <w:r>
-        <w:rPr>
-          <w:rFonts w:ascii="Times New Roman" w:cs="Times New Roman" w:eastAsia="Times New Roman" w:hAnsi="Times New Roman"/>
-          <w:b w:val="false"/>
-          <w:bCs w:val="false"/>
-          <w:sz w:val="24"/>
-          <w:szCs w:val="24"/>
-        </w:rPr>
-        <w:t xml:space="preserve"> Whether learned trust tracks the system’s reliability can be known only against a second reference: local performance data that include missed events and do not count averted deteriorations as false alarms.</w:t>
+        <w:t xml:space="preserve">Our proposed override field was a governance recommendation, not a tested intervention or a claim that overrides were safe. We accept that a field required only for overrides could “make acceptance the implicit default and attach friction to disagreement alone”, the risk our article named in warning against positioning the algorithm as “the default standard against which nursing assessment is judged”.</w:t>
+      </w:r>
+      <w:r>
+        <w:rPr>
+          <w:rFonts w:ascii="Times New Roman" w:cs="Times New Roman" w:eastAsia="Times New Roman" w:hAnsi="Times New Roman"/>
+          <w:b w:val="false"/>
+          <w:bCs w:val="false"/>
+          <w:sz w:val="24"/>
+          <w:szCs w:val="24"/>
+          <w:vertAlign w:val="superscript"/>
+        </w:rPr>
+        <w:t xml:space="preserve">1</w:t>
+      </w:r>
+      <w:r>
+        <w:rPr>
+          <w:rFonts w:ascii="Times New Roman" w:cs="Times New Roman" w:eastAsia="Times New Roman" w:hAnsi="Times New Roman"/>
+          <w:b w:val="false"/>
+          <w:bCs w:val="false"/>
+          <w:sz w:val="24"/>
+          <w:szCs w:val="24"/>
+        </w:rPr>
+        <w:t xml:space="preserve"> Acceptance and disagreement deserve comparable scrutiny, and accountability should follow the clinical reasoning rather than conformity with the algorithm. We therefore welcome symmetric capture from system logs, linking alerts, and periods without alerts, to nurses’ responses and to independently ascertained deterioration. Logs still need interpretive categories: a log shows that an alert was not escalated, not whether it was assessed and judged wrong or never read, which our proposed single-click acknowledgement, applied to every alert, would record.</w:t>
+      </w:r>
+      <w:r>
+        <w:rPr>
+          <w:rFonts w:ascii="Times New Roman" w:cs="Times New Roman" w:eastAsia="Times New Roman" w:hAnsi="Times New Roman"/>
+          <w:b w:val="false"/>
+          <w:bCs w:val="false"/>
+          <w:sz w:val="24"/>
+          <w:szCs w:val="24"/>
+          <w:vertAlign w:val="superscript"/>
+        </w:rPr>
+        <w:t xml:space="preserve">1</w:t>
       </w:r>
     </w:p>
     <w:p>
@@ -1204,28 +1211,28 @@
           <w:sz w:val="24"/>
           <w:szCs w:val="24"/>
         </w:rPr>
-        <w:t xml:space="preserve">Our article reported no local performance estimates, and we did not audit the model’s proprietary characteristics.</w:t>
-      </w:r>
-      <w:r>
-        <w:rPr>
-          <w:rFonts w:ascii="Times New Roman" w:cs="Times New Roman" w:eastAsia="Times New Roman" w:hAnsi="Times New Roman"/>
-          <w:b w:val="false"/>
-          <w:bCs w:val="false"/>
-          <w:sz w:val="24"/>
-          <w:szCs w:val="24"/>
-          <w:vertAlign w:val="superscript"/>
-        </w:rPr>
-        <w:t xml:space="preserve">2</w:t>
-      </w:r>
-      <w:r>
-        <w:rPr>
-          <w:rFonts w:ascii="Times New Roman" w:cs="Times New Roman" w:eastAsia="Times New Roman" w:hAnsi="Times New Roman"/>
-          <w:b w:val="false"/>
-          <w:bCs w:val="false"/>
-          <w:sz w:val="24"/>
-          <w:szCs w:val="24"/>
-        </w:rPr>
-        <w:t xml:space="preserve"> As the commentators note, the validation they cite concerned another, sepsis-specific model</w:t>
+        <w:t xml:space="preserve">The commentators’ call for “behavioural designs that observe judgement with and without the system” goes further than our proposal to link accounts with audit data.</w:t>
+      </w:r>
+      <w:r>
+        <w:rPr>
+          <w:rFonts w:ascii="Times New Roman" w:cs="Times New Roman" w:eastAsia="Times New Roman" w:hAnsi="Times New Roman"/>
+          <w:b w:val="false"/>
+          <w:bCs w:val="false"/>
+          <w:sz w:val="24"/>
+          <w:szCs w:val="24"/>
+          <w:vertAlign w:val="superscript"/>
+        </w:rPr>
+        <w:t xml:space="preserve">1</w:t>
+      </w:r>
+      <w:r>
+        <w:rPr>
+          <w:rFonts w:ascii="Times New Roman" w:cs="Times New Roman" w:eastAsia="Times New Roman" w:hAnsi="Times New Roman"/>
+          <w:b w:val="false"/>
+          <w:bCs w:val="false"/>
+          <w:sz w:val="24"/>
+          <w:szCs w:val="24"/>
+        </w:rPr>
+        <w:t xml:space="preserve"> Where a deployed system cannot ethically be withheld, simulation and vignette designs are feasible. The trial they cite also warrants caution: image-based explanations did not mitigate the harm of systematically biased predictions in a clinician vignette study,</w:t>
       </w:r>
       <w:r>
         <w:rPr>
@@ -1246,7 +1253,28 @@
           <w:sz w:val="24"/>
           <w:szCs w:val="24"/>
         </w:rPr>
-        <w:t xml:space="preserve">; its estimates do not describe the general deterioration model our participants used, but its lesson transfers: performance must be measured locally and made known to nurses.</w:t>
+        <w:t xml:space="preserve"> although its relevance to real-time nursing surveillance is untested. Our findings suggest what to test: discordant alerts, alarms after suctioning, and complex cases, for which participants trusted the system less (P05).</w:t>
+      </w:r>
+      <w:r>
+        <w:rPr>
+          <w:rFonts w:ascii="Times New Roman" w:cs="Times New Roman" w:eastAsia="Times New Roman" w:hAnsi="Times New Roman"/>
+          <w:b w:val="false"/>
+          <w:bCs w:val="false"/>
+          <w:sz w:val="24"/>
+          <w:szCs w:val="24"/>
+          <w:vertAlign w:val="superscript"/>
+        </w:rPr>
+        <w:t xml:space="preserve">1</w:t>
+      </w:r>
+      <w:r>
+        <w:rPr>
+          <w:rFonts w:ascii="Times New Roman" w:cs="Times New Roman" w:eastAsia="Times New Roman" w:hAnsi="Times New Roman"/>
+          <w:b w:val="false"/>
+          <w:bCs w:val="false"/>
+          <w:sz w:val="24"/>
+          <w:szCs w:val="24"/>
+        </w:rPr>
+        <w:t xml:space="preserve"> Comparing nurses’ trust across patient groups with group-specific false-alarm rates and with misses, separating those nurses caught from those they did not, would show whether differentiated trust tracks the system’s reliability or only its visible errors. Such studies should distinguish confidence, reported trust and observed reliance; interviews, in turn, show how nurses understand that reliance.</w:t>
       </w:r>
     </w:p>
     <w:p>
@@ -1262,181 +1290,7 @@
           <w:sz w:val="24"/>
           <w:szCs w:val="24"/>
         </w:rPr>
-        <w:t xml:space="preserve">We accept symmetric capture (recording what the system flagged, what nurses did and what happened to the patient, whether or not an alert fired) as a complement to our override field. A field required only for overrides could, as the commentators argue, “make acceptance the implicit default and attach friction to disagreement alone”,</w:t>
-      </w:r>
-      <w:r>
-        <w:rPr>
-          <w:rFonts w:ascii="Times New Roman" w:cs="Times New Roman" w:eastAsia="Times New Roman" w:hAnsi="Times New Roman"/>
-          <w:b w:val="false"/>
-          <w:bCs w:val="false"/>
-          <w:sz w:val="24"/>
-          <w:szCs w:val="24"/>
-          <w:vertAlign w:val="superscript"/>
-        </w:rPr>
-        <w:t xml:space="preserve">1</w:t>
-      </w:r>
-      <w:r>
-        <w:rPr>
-          <w:rFonts w:ascii="Times New Roman" w:cs="Times New Roman" w:eastAsia="Times New Roman" w:hAnsi="Times New Roman"/>
-          <w:b w:val="false"/>
-          <w:bCs w:val="false"/>
-          <w:sz w:val="24"/>
-          <w:szCs w:val="24"/>
-        </w:rPr>
-        <w:t xml:space="preserve"> the risk our article named in warning against positioning the algorithm as “the default standard against which nursing assessment is judged”.</w:t>
-      </w:r>
-      <w:r>
-        <w:rPr>
-          <w:rFonts w:ascii="Times New Roman" w:cs="Times New Roman" w:eastAsia="Times New Roman" w:hAnsi="Times New Roman"/>
-          <w:b w:val="false"/>
-          <w:bCs w:val="false"/>
-          <w:sz w:val="24"/>
-          <w:szCs w:val="24"/>
-          <w:vertAlign w:val="superscript"/>
-        </w:rPr>
-        <w:t xml:space="preserve">2</w:t>
-      </w:r>
-      <w:r>
-        <w:rPr>
-          <w:rFonts w:ascii="Times New Roman" w:cs="Times New Roman" w:eastAsia="Times New Roman" w:hAnsi="Times New Roman"/>
-          <w:b w:val="false"/>
-          <w:bCs w:val="false"/>
-          <w:sz w:val="24"/>
-          <w:szCs w:val="24"/>
-        </w:rPr>
-        <w:t xml:space="preserve"> Logs, in turn, need interpretive categories: a log shows that an alert was not escalated, not whether it was assessed and judged wrong or never read, hence our proposed single-click acknowledgement,</w:t>
-      </w:r>
-      <w:r>
-        <w:rPr>
-          <w:rFonts w:ascii="Times New Roman" w:cs="Times New Roman" w:eastAsia="Times New Roman" w:hAnsi="Times New Roman"/>
-          <w:b w:val="false"/>
-          <w:bCs w:val="false"/>
-          <w:sz w:val="24"/>
-          <w:szCs w:val="24"/>
-          <w:vertAlign w:val="superscript"/>
-        </w:rPr>
-        <w:t xml:space="preserve">2</w:t>
-      </w:r>
-      <w:r>
-        <w:rPr>
-          <w:rFonts w:ascii="Times New Roman" w:cs="Times New Roman" w:eastAsia="Times New Roman" w:hAnsi="Times New Roman"/>
-          <w:b w:val="false"/>
-          <w:bCs w:val="false"/>
-          <w:sz w:val="24"/>
-          <w:szCs w:val="24"/>
-        </w:rPr>
-        <w:t xml:space="preserve"> which symmetric capture would extend to every alert. As a low-cost first step, units could check each deterioration against alert logs to find those no alert preceded.</w:t>
-      </w:r>
-    </w:p>
-    <w:p>
-      <w:pPr>
-        <w:keepNext/>
-        <w:spacing w:after="120" w:before="240" w:line="360"/>
-      </w:pPr>
-      <w:r>
-        <w:rPr>
-          <w:rFonts w:ascii="Times New Roman" w:cs="Times New Roman" w:eastAsia="Times New Roman" w:hAnsi="Times New Roman"/>
-          <w:b/>
-          <w:bCs/>
-          <w:sz w:val="24"/>
-          <w:szCs w:val="24"/>
-        </w:rPr>
-        <w:t xml:space="preserve">5 | CONCLUSION: COMPLEMENTARY EVIDENCE</w:t>
-      </w:r>
-    </w:p>
-    <w:p>
-      <w:pPr>
-        <w:spacing w:after="200" w:before="0" w:line="360"/>
-        <w:jc w:val="both"/>
-      </w:pPr>
-      <w:r>
-        <w:rPr>
-          <w:rFonts w:ascii="Times New Roman" w:cs="Times New Roman" w:eastAsia="Times New Roman" w:hAnsi="Times New Roman"/>
-          <w:b w:val="false"/>
-          <w:bCs w:val="false"/>
-          <w:sz w:val="24"/>
-          <w:szCs w:val="24"/>
-        </w:rPr>
-        <w:t xml:space="preserve">The commentators’ call for “behavioural designs that observe judgement with and without the system”</w:t>
-      </w:r>
-      <w:r>
-        <w:rPr>
-          <w:rFonts w:ascii="Times New Roman" w:cs="Times New Roman" w:eastAsia="Times New Roman" w:hAnsi="Times New Roman"/>
-          <w:b w:val="false"/>
-          <w:bCs w:val="false"/>
-          <w:sz w:val="24"/>
-          <w:szCs w:val="24"/>
-          <w:vertAlign w:val="superscript"/>
-        </w:rPr>
-        <w:t xml:space="preserve">1</w:t>
-      </w:r>
-      <w:r>
-        <w:rPr>
-          <w:rFonts w:ascii="Times New Roman" w:cs="Times New Roman" w:eastAsia="Times New Roman" w:hAnsi="Times New Roman"/>
-          <w:b w:val="false"/>
-          <w:bCs w:val="false"/>
-          <w:sz w:val="24"/>
-          <w:szCs w:val="24"/>
-        </w:rPr>
-        <w:t xml:space="preserve"> goes further than our proposal to link accounts with audit data</w:t>
-      </w:r>
-      <w:r>
-        <w:rPr>
-          <w:rFonts w:ascii="Times New Roman" w:cs="Times New Roman" w:eastAsia="Times New Roman" w:hAnsi="Times New Roman"/>
-          <w:b w:val="false"/>
-          <w:bCs w:val="false"/>
-          <w:sz w:val="24"/>
-          <w:szCs w:val="24"/>
-          <w:vertAlign w:val="superscript"/>
-        </w:rPr>
-        <w:t xml:space="preserve">2</w:t>
-      </w:r>
-      <w:r>
-        <w:rPr>
-          <w:rFonts w:ascii="Times New Roman" w:cs="Times New Roman" w:eastAsia="Times New Roman" w:hAnsi="Times New Roman"/>
-          <w:b w:val="false"/>
-          <w:bCs w:val="false"/>
-          <w:sz w:val="24"/>
-          <w:szCs w:val="24"/>
-        </w:rPr>
-        <w:t xml:space="preserve">: audit data show what nurses did; only such designs show what the system changed. Where a deployed system cannot ethically be withheld, simulation and vignette studies offer a feasible route, and our findings suggest what to test: discordant alerts, alarms after suctioning, and complex cases, for which participants trusted the system less (P05).</w:t>
-      </w:r>
-      <w:r>
-        <w:rPr>
-          <w:rFonts w:ascii="Times New Roman" w:cs="Times New Roman" w:eastAsia="Times New Roman" w:hAnsi="Times New Roman"/>
-          <w:b w:val="false"/>
-          <w:bCs w:val="false"/>
-          <w:sz w:val="24"/>
-          <w:szCs w:val="24"/>
-          <w:vertAlign w:val="superscript"/>
-        </w:rPr>
-        <w:t xml:space="preserve">2</w:t>
-      </w:r>
-      <w:r>
-        <w:rPr>
-          <w:rFonts w:ascii="Times New Roman" w:cs="Times New Roman" w:eastAsia="Times New Roman" w:hAnsi="Times New Roman"/>
-          <w:b w:val="false"/>
-          <w:bCs w:val="false"/>
-          <w:sz w:val="24"/>
-          <w:szCs w:val="24"/>
-        </w:rPr>
-        <w:t xml:space="preserve"> Comparing nurses’ trust across patient groups with group-specific false-alarm rates and with misses, separating those nurses caught from those they did not, would show whether differentiated trust tracks the system’s reliability, as our reading predicts, or only its visible errors, as the commentators’ reading predicts. Interpretive studies, in turn, show how nurses understand and account for their reliance, what they teach, and when, by their account, disagreement goes unrecorded. Neither substitutes for the other.</w:t>
-      </w:r>
-    </w:p>
-    <w:p>
-      <w:pPr>
-        <w:spacing w:after="200" w:before="0" w:line="360"/>
-        <w:jc w:val="both"/>
-      </w:pPr>
-      <w:r>
-        <w:rPr>
-          <w:rFonts w:ascii="Times New Roman" w:cs="Times New Roman" w:eastAsia="Times New Roman" w:hAnsi="Times New Roman"/>
-          <w:b w:val="false"/>
-          <w:bCs w:val="false"/>
-          <w:sz w:val="24"/>
-          <w:szCs w:val="24"/>
-        </w:rPr>
-        <w:t xml:space="preserve">‘Calibrated to what?’ is the right question, and it has two answers. At the bedside, each alert is weighed against the patient, a real-time but fallible reference. Across alerts, learned trust must be checked against the system’s measured performance, misses included. Our study described the first; the commentators rightly insist on the second. Safe AI-assisted early warning needs both, and nurses who keep watching closely enough to notice when alert and patient disagree. We thank the commentators for sharpening this agenda.</w:t>
+        <w:t xml:space="preserve">‘Calibrated to what?’ is the right question, and it has two answers. At the bedside, each alert is weighed against the patient, a real-time but fallible reference point. Across alerts, learned trust must be checked against the system’s measured performance, misses included. Our study described the first; the commentators rightly insist on the second. Safe AI-assisted early warning needs both, and nurses who keep watching closely enough to notice when alert and patient disagree.</w:t>
       </w:r>
     </w:p>
     <w:p>
@@ -1543,7 +1397,7 @@
           <w:szCs w:val="22"/>
           <w:vertAlign w:val="superscript"/>
         </w:rPr>
-        <w:t xml:space="preserve">2</w:t>
+        <w:t xml:space="preserve">1</w:t>
       </w:r>
     </w:p>
     <w:p>
@@ -1576,39 +1430,7 @@
           <w:sz w:val="22"/>
           <w:szCs w:val="22"/>
         </w:rPr>
-        <w:t xml:space="preserve">1. </w:t>
-      </w:r>
-      <w:r>
-        <w:rPr>
-          <w:rFonts w:ascii="Times New Roman" w:cs="Times New Roman" w:eastAsia="Times New Roman" w:hAnsi="Times New Roman"/>
-          <w:b w:val="false"/>
-          <w:bCs w:val="false"/>
-          <w:sz w:val="22"/>
-          <w:szCs w:val="22"/>
-          <w:shd w:fill="FFFF00" w:color="auto" w:val="clear"/>
-        </w:rPr>
-        <w:t xml:space="preserve">[Author names to be inserted by the Editorial Office]</w:t>
-      </w:r>
-      <w:r>
-        <w:rPr>
-          <w:rFonts w:ascii="Times New Roman" w:cs="Times New Roman" w:eastAsia="Times New Roman" w:hAnsi="Times New Roman"/>
-          <w:b w:val="false"/>
-          <w:bCs w:val="false"/>
-          <w:sz w:val="22"/>
-          <w:szCs w:val="22"/>
-        </w:rPr>
-        <w:t xml:space="preserve">. Calibrated to what? Feedback asymmetry and the limits of experiential trust in AI-assisted early warning. Nursing in Critical Care. In press. </w:t>
-      </w:r>
-      <w:r>
-        <w:rPr>
-          <w:rFonts w:ascii="Times New Roman" w:cs="Times New Roman" w:eastAsia="Times New Roman" w:hAnsi="Times New Roman"/>
-          <w:b w:val="false"/>
-          <w:bCs w:val="false"/>
-          <w:sz w:val="22"/>
-          <w:szCs w:val="22"/>
-          <w:shd w:fill="FFFF00" w:color="auto" w:val="clear"/>
-        </w:rPr>
-        <w:t xml:space="preserve">doi:[to be inserted by the Editorial Office]</w:t>
+        <w:t xml:space="preserve">1. Samy R, Ramadan OME, Elsayed GEA. Trusting the algorithm or trusting the nurse? Critical care nurses’ experiences of automation bias and professional autonomy in AI-assisted early warning. Nursing in Critical Care. 2026;31(5):e70620. doi:10.1111/nicc.70620</w:t>
       </w:r>
     </w:p>
     <w:p>
@@ -1625,7 +1447,7 @@
           <w:sz w:val="22"/>
           <w:szCs w:val="22"/>
         </w:rPr>
-        <w:t xml:space="preserve">2. Samy R, Ramadan OME, Elsayed GEA. Trusting the algorithm or trusting the nurse? Critical care nurses’ experiences of automation bias and professional autonomy in AI-assisted early warning. Nursing in Critical Care. 2026;31(5):e70620. doi:10.1111/nicc.70620</w:t>
+        <w:t xml:space="preserve">2. Thorne S. Interpretive Description: Qualitative Research for Applied Practice. 2nd ed. New York: Routledge; 2016.</w:t>
       </w:r>
     </w:p>
     <w:p>
@@ -1642,7 +1464,7 @@
           <w:sz w:val="22"/>
           <w:szCs w:val="22"/>
         </w:rPr>
-        <w:t xml:space="preserve">3. Thorne S. Interpretive Description: Qualitative Research for Applied Practice. 2nd ed. New York: Routledge; 2016.</w:t>
+        <w:t xml:space="preserve">3. Blumer H. What is wrong with social theory? American Sociological Review. 1954;19(1):3-10.</w:t>
       </w:r>
     </w:p>
     <w:p>
@@ -1659,7 +1481,7 @@
           <w:sz w:val="22"/>
           <w:szCs w:val="22"/>
         </w:rPr>
-        <w:t xml:space="preserve">4. Blumer H. What is wrong with social theory? American Sociological Review. 1954;19(1):3-10.</w:t>
+        <w:t xml:space="preserve">4. Parasuraman R, Manzey DH. Complacency and bias in human use of automation: an attentional integration. Human Factors. 2010;52(3):381-410. doi:10.1177/0018720810376055</w:t>
       </w:r>
     </w:p>
     <w:p>
@@ -1676,7 +1498,7 @@
           <w:sz w:val="22"/>
           <w:szCs w:val="22"/>
         </w:rPr>
-        <w:t xml:space="preserve">5. Parasuraman R, Manzey DH. Complacency and bias in human use of automation: an attentional integration. Human Factors. 2010;52(3):381-410. doi:10.1177/0018720810376055</w:t>
+        <w:t xml:space="preserve">5. Lee JD, See KA. Trust in automation: designing for appropriate reliance. Human Factors. 2004;46(1):50-80. doi:10.1518/hfes.46.1.50_30392</w:t>
       </w:r>
     </w:p>
     <w:p>
@@ -1693,7 +1515,7 @@
           <w:sz w:val="22"/>
           <w:szCs w:val="22"/>
         </w:rPr>
-        <w:t xml:space="preserve">6. Lee JD, See KA. Trust in automation: designing for appropriate reliance. Human Factors. 2004;46(1):50-80. doi:10.1518/hfes.46.1.50_30392</w:t>
+        <w:t xml:space="preserve">6. Kahneman D, Klein G. Conditions for intuitive expertise: a failure to disagree. American Psychologist. 2009;64(6):515-526. doi:10.1037/a0016755</w:t>
       </w:r>
     </w:p>
     <w:p>
@@ -1710,7 +1532,7 @@
           <w:sz w:val="22"/>
           <w:szCs w:val="22"/>
         </w:rPr>
-        <w:t xml:space="preserve">7. Kahneman D, Klein G. Conditions for intuitive expertise: a failure to disagree. American Psychologist. 2009;64(6):515-526. doi:10.1037/a0016755</w:t>
+        <w:t xml:space="preserve">7. Kohn SC, de Visser EJ, Wiese E, Lee YC, Shaw TH. Measurement of trust in automation: a narrative review and reference guide. Frontiers in Psychology. 2021;12:604977. doi:10.3389/fpsyg.2021.604977</w:t>
       </w:r>
     </w:p>
     <w:p>
@@ -1727,7 +1549,7 @@
           <w:sz w:val="22"/>
           <w:szCs w:val="22"/>
         </w:rPr>
-        <w:t xml:space="preserve">8. Kohn SC, de Visser EJ, Wiese E, Lee YC, Shaw TH. Measurement of trust in automation: a narrative review and reference guide. Frontiers in Psychology. 2021;12:604977. doi:10.3389/fpsyg.2021.604977</w:t>
+        <w:t xml:space="preserve">8. Nisbett RE, Wilson TD. Telling more than we can know: verbal reports on mental processes. Psychological Review. 1977;84(3):231-259. doi:10.1037/0033-295X.84.3.231</w:t>
       </w:r>
     </w:p>
     <w:p>
@@ -1744,7 +1566,7 @@
           <w:sz w:val="22"/>
           <w:szCs w:val="22"/>
         </w:rPr>
-        <w:t xml:space="preserve">9. Nisbett RE, Wilson TD. Telling more than we can know: verbal reports on mental processes. Psychological Review. 1977;84(3):231-259. doi:10.1037/0033-295X.84.3.231</w:t>
+        <w:t xml:space="preserve">9. Dietvorst BJ, Simmons JP, Massey C. Algorithm aversion: people erroneously avoid algorithms after seeing them err. Journal of Experimental Psychology: General. 2015;144(1):114-126. doi:10.1037/xge0000033</w:t>
       </w:r>
     </w:p>
     <w:p>
@@ -1761,7 +1583,7 @@
           <w:sz w:val="22"/>
           <w:szCs w:val="22"/>
         </w:rPr>
-        <w:t xml:space="preserve">10. Dietvorst BJ, Simmons JP, Massey C. Algorithm aversion: people erroneously avoid algorithms after seeing them err. Journal of Experimental Psychology: General. 2015;144(1):114-126. doi:10.1037/xge0000033</w:t>
+        <w:t xml:space="preserve">10. Tanner CA. Thinking like a nurse: a research-based model of clinical judgment in nursing. Journal of Nursing Education. 2006;45(6):204-211. doi:10.3928/01484834-20060601-04</w:t>
       </w:r>
     </w:p>
     <w:p>
@@ -1778,7 +1600,7 @@
           <w:sz w:val="22"/>
           <w:szCs w:val="22"/>
         </w:rPr>
-        <w:t xml:space="preserve">11. Tanner CA. Thinking like a nurse: a research-based model of clinical judgment in nursing. Journal of Nursing Education. 2006;45(6):204-211. doi:10.3928/01484834-20060601-04</w:t>
+        <w:t xml:space="preserve">11. Schwartz JM, George M, Rossetti SC, et al. Factors influencing clinician trust in predictive clinical decision support systems for in-hospital deterioration: qualitative descriptive study. JMIR Human Factors. 2022;9(2):e33960. doi:10.2196/33960</w:t>
       </w:r>
     </w:p>
     <w:p>
@@ -1795,7 +1617,7 @@
           <w:sz w:val="22"/>
           <w:szCs w:val="22"/>
         </w:rPr>
-        <w:t xml:space="preserve">12. Schwartz JM, George M, Rossetti SC, et al. Factors influencing clinician trust in predictive clinical decision support systems for in-hospital deterioration: qualitative descriptive study. JMIR Human Factors. 2022;9(2):e33960. doi:10.2196/33960</w:t>
+        <w:t xml:space="preserve">12. Wong A, Otles E, Donnelly JP, et al. External validation of a widely implemented proprietary sepsis prediction model in hospitalized patients. JAMA Internal Medicine. 2021;181(8):1065-1070. doi:10.1001/jamainternmed.2021.2626</w:t>
       </w:r>
     </w:p>
     <w:p>
@@ -1812,7 +1634,7 @@
           <w:sz w:val="22"/>
           <w:szCs w:val="22"/>
         </w:rPr>
-        <w:t xml:space="preserve">13. Wong A, Otles E, Donnelly JP, et al. External validation of a widely implemented proprietary sepsis prediction model in hospitalized patients. JAMA Internal Medicine. 2021;181(8):1065-1070. doi:10.1001/jamainternmed.2021.2626</w:t>
+        <w:t xml:space="preserve">13. Jabbour S, Fouhey D, Shepard S, et al. Measuring the impact of AI in the diagnosis of hospitalized patients: a randomized clinical vignette survey study. JAMA. 2023;330(23):2275-2284. doi:10.1001/jama.2023.22295</w:t>
       </w:r>
     </w:p>
     <w:sectPr>

</xml_diff>

<commit_message>
Make Osama Mohamed Elsayed Ramadan first and corresponding author of the response
Affiliations renumbered; the citation of the published article keeps its
original author order.

Co-Authored-By: Claude Opus 5.5 <noreply@anthropic.com>
Claude-Session: https://claude.ai/code/session_01NFxkwSoaToLEQqh28ojz2g
</commit_message>
<xml_diff>
--- a/nicc_commentary_response/01_Response_to_Commentary_NICC.docx
+++ b/nicc_commentary_response/01_Response_to_Commentary_NICC.docx
@@ -42,32 +42,32 @@
           <w:sz w:val="24"/>
           <w:szCs w:val="24"/>
         </w:rPr>
+        <w:t xml:space="preserve">Osama Mohamed Elsayed Ramadan</w:t>
+      </w:r>
+      <w:r>
+        <w:rPr>
+          <w:rFonts w:ascii="Times New Roman" w:cs="Times New Roman" w:eastAsia="Times New Roman" w:hAnsi="Times New Roman"/>
+          <w:sz w:val="24"/>
+          <w:szCs w:val="24"/>
+          <w:vertAlign w:val="superscript"/>
+        </w:rPr>
+        <w:t xml:space="preserve">1*</w:t>
+      </w:r>
+      <w:r>
+        <w:rPr>
+          <w:rFonts w:ascii="Times New Roman" w:cs="Times New Roman" w:eastAsia="Times New Roman" w:hAnsi="Times New Roman"/>
+          <w:sz w:val="24"/>
+          <w:szCs w:val="24"/>
+        </w:rPr>
+        <w:t xml:space="preserve"> | </w:t>
+      </w:r>
+      <w:r>
+        <w:rPr>
+          <w:rFonts w:ascii="Times New Roman" w:cs="Times New Roman" w:eastAsia="Times New Roman" w:hAnsi="Times New Roman"/>
+          <w:sz w:val="24"/>
+          <w:szCs w:val="24"/>
+        </w:rPr>
         <w:t xml:space="preserve">Reda Samy</w:t>
-      </w:r>
-      <w:r>
-        <w:rPr>
-          <w:rFonts w:ascii="Times New Roman" w:cs="Times New Roman" w:eastAsia="Times New Roman" w:hAnsi="Times New Roman"/>
-          <w:sz w:val="24"/>
-          <w:szCs w:val="24"/>
-          <w:vertAlign w:val="superscript"/>
-        </w:rPr>
-        <w:t xml:space="preserve">1</w:t>
-      </w:r>
-      <w:r>
-        <w:rPr>
-          <w:rFonts w:ascii="Times New Roman" w:cs="Times New Roman" w:eastAsia="Times New Roman" w:hAnsi="Times New Roman"/>
-          <w:sz w:val="24"/>
-          <w:szCs w:val="24"/>
-        </w:rPr>
-        <w:t xml:space="preserve"> | </w:t>
-      </w:r>
-      <w:r>
-        <w:rPr>
-          <w:rFonts w:ascii="Times New Roman" w:cs="Times New Roman" w:eastAsia="Times New Roman" w:hAnsi="Times New Roman"/>
-          <w:sz w:val="24"/>
-          <w:szCs w:val="24"/>
-        </w:rPr>
-        <w:t xml:space="preserve">Osama Mohamed Elsayed Ramadan</w:t>
       </w:r>
       <w:r>
         <w:rPr>
@@ -123,7 +123,7 @@
           <w:sz w:val="20"/>
           <w:szCs w:val="20"/>
         </w:rPr>
-        <w:t xml:space="preserve">Department of Medical Surgical Nursing, College of Nursing, Jouf University, Sakaka, Saudi Arabia</w:t>
+        <w:t xml:space="preserve">Department of Maternal and Child Health Nursing, College of Nursing, Jouf University, Sakaka, Saudi Arabia</w:t>
       </w:r>
     </w:p>
     <w:p>
@@ -145,7 +145,7 @@
           <w:sz w:val="20"/>
           <w:szCs w:val="20"/>
         </w:rPr>
-        <w:t xml:space="preserve">Department of Maternal and Child Health Nursing, College of Nursing, Jouf University, Sakaka, Saudi Arabia</w:t>
+        <w:t xml:space="preserve">Department of Medical Surgical Nursing, College of Nursing, Jouf University, Sakaka, Saudi Arabia</w:t>
       </w:r>
     </w:p>
     <w:p>
@@ -205,7 +205,7 @@
           <w:sz w:val="20"/>
           <w:szCs w:val="20"/>
         </w:rPr>
-        <w:t xml:space="preserve">Correspondence: Osama Mohamed Elsayed Ramadan (omramadan@ju.edu.sa)</w:t>
+        <w:t xml:space="preserve">*Corresponding author: Osama Mohamed Elsayed Ramadan, Department of Maternal and Child Health Nursing, College of Nursing, Jouf University, Sakaka, Saudi Arabia. Email: omramadan@ju.edu.sa</w:t>
       </w:r>
     </w:p>
     <w:p>

</xml_diff>

<commit_message>
Apply final independent review: new title, P14 answer, attribution fixes
- Title: 'Reading the patient, measuring the system: Two reference points
  for nurses' trust in AI-assisted early warning'
- Resolve the bias/error contradiction; single-click acknowledgement now
  read as an extension; quotations of the commentary attributed in text
- Answer P14's 'when it would miss'; add hindsight point; tighter wording
- Covering email explains why the commentary is not listed as a reference
- Main text 1,480 words (1,496 with title); 34 quotations verified

Co-Authored-By: Claude Opus 5.5 <noreply@anthropic.com>
Claude-Session: https://claude.ai/code/session_01NFxkwSoaToLEQqh28ojz2g
</commit_message>
<xml_diff>
--- a/nicc_commentary_response/01_Response_to_Commentary_NICC.docx
+++ b/nicc_commentary_response/01_Response_to_Commentary_NICC.docx
@@ -29,7 +29,7 @@
           <w:sz w:val="32"/>
           <w:szCs w:val="32"/>
         </w:rPr>
-        <w:t xml:space="preserve">The patient and the system: Two reference points for evaluating nurses’ trust in AI-assisted early warning</w:t>
+        <w:t xml:space="preserve">Reading the patient, measuring the system: Two reference points for nurses’ trust in AI-assisted early warning</w:t>
       </w:r>
     </w:p>
     <w:p>
@@ -223,7 +223,7 @@
           <w:sz w:val="20"/>
           <w:szCs w:val="20"/>
         </w:rPr>
-        <w:t xml:space="preserve">Response to the commentary on our article: Samy R, Ramadan OME, Elsayed GEA. Nursing in Critical Care. 2026;31(5):e70620. doi:10.1111/nicc.70620</w:t>
+        <w:t xml:space="preserve">Response to a commentary on: Samy R, Ramadan OME, Elsayed GEA. Trusting the algorithm or trusting the nurse? Critical care nurses’ experiences of automation bias and professional autonomy in AI-assisted early warning. Nursing in Critical Care. 2026;31(5):e70620. doi:10.1111/nicc.70620</w:t>
       </w:r>
     </w:p>
     <w:p>
@@ -239,7 +239,7 @@
           <w:sz w:val="20"/>
           <w:szCs w:val="20"/>
         </w:rPr>
-        <w:t xml:space="preserve">Word count: 1478 words (main text including headings; excluding title, author details, end statements and references). Title: 16 words.</w:t>
+        <w:t xml:space="preserve">Word count: 1481 words (main text including headings; excluding title, author details, end statements and references). Title: 16 words.</w:t>
       </w:r>
     </w:p>
     <w:p>
@@ -292,7 +292,7 @@
           <w:sz w:val="24"/>
           <w:szCs w:val="24"/>
         </w:rPr>
-        <w:t xml:space="preserve"> and for their recognition that silent override “deserves the governance attention the authors call for”. They accept that interviews “capture well how nurses make sense of their reliance”; their concern is “one inferential step: from nurses’ accounts of trust to the claim that this trust is calibrated”. We agree that reported adjustment of trust does not establish accurate calibration. Equally, understanding how nurses interpret alerts and negotiate responsibility makes a distinct contribution to the safe use of AI.</w:t>
+        <w:t xml:space="preserve"> and for their recognition that silent override “deserves the governance attention the authors call for”. They accept that interviews “capture well how nurses make sense of their reliance”; their concern is “one inferential step: from nurses’ accounts of trust to the claim that this trust is calibrated”. We agree that reported adjustment of trust does not establish accurate calibration. Equally, understanding how nurses interpret alerts and negotiate responsibility contributes distinctly to the safe use of AI.</w:t>
       </w:r>
     </w:p>
     <w:p>
@@ -429,7 +429,7 @@
           <w:sz w:val="24"/>
           <w:szCs w:val="24"/>
         </w:rPr>
-        <w:t xml:space="preserve"> Such reliance becomes bias only when the aid errs; our title refers to experiences of that pull.</w:t>
+        <w:t xml:space="preserve"> Such reliance produces error only when the aid errs; our title refers to experiences of that pull.</w:t>
       </w:r>
     </w:p>
     <w:p>
@@ -487,7 +487,7 @@
           <w:sz w:val="24"/>
           <w:szCs w:val="24"/>
         </w:rPr>
-        <w:t xml:space="preserve"> The precise formulation is that participants described adjusting their trust through experience; the accuracy of those adjustments was not evaluated. Our Limitations drew this line, placing ‘calibrated trust’ in quotation marks, to be read as “considered self-understanding rather than as a verified description of in-the-moment behaviour”.</w:t>
+        <w:t xml:space="preserve"> Precisely, participants described adjusting their trust through experience; the accuracy of those adjustments was not evaluated. Our Limitations drew this line, placing ‘calibrated trust’ in quotation marks, to be read as “considered self-understanding rather than as a verified description of in-the-moment behaviour”.</w:t>
       </w:r>
       <w:r>
         <w:rPr>
@@ -656,7 +656,7 @@
           <w:sz w:val="24"/>
           <w:szCs w:val="24"/>
         </w:rPr>
-        <w:t xml:space="preserve"> It applies fully to participants’ explanations of why they trusted, which therefore cannot evidence calibration. Our other claims rest on concrete episodes and on reported practices and meanings that no audit log records: what senior nurses teach (“the algorithm is one voice”, P19), how override was framed (“I have to be able to explain it”, P06), and when risk felt shared or “entirely personal” (P05).</w:t>
+        <w:t xml:space="preserve"> It applies fully to participants’ explanations of why they trusted, which therefore cannot evidence calibration. Our other claims rest on episodes, reported practices and meanings that no audit log records: what senior nurses teach (“the algorithm is one voice”, P19), how override was framed (“I have to be able to explain it”, P06), and when risk felt shared or “entirely personal” (P05).</w:t>
       </w:r>
       <w:r>
         <w:rPr>
@@ -683,7 +683,7 @@
           <w:sz w:val="24"/>
           <w:szCs w:val="24"/>
         </w:rPr>
-        <w:t xml:space="preserve">Finally, we accept that the foundational accounts the commentators cite are already dynamic,</w:t>
+        <w:t xml:space="preserve">We also accept that the foundational accounts the commentators cite are already dynamic,</w:t>
       </w:r>
       <w:r>
         <w:rPr>
@@ -778,7 +778,7 @@
           <w:sz w:val="24"/>
           <w:szCs w:val="24"/>
         </w:rPr>
-        <w:t xml:space="preserve"> but did not follow that point through to how trust is learned. Their reading is a plausible hypothesis rather than a demonstrated mechanism; like ours, it interprets the same accounts, and interviews cannot settle the choice between them.</w:t>
+        <w:t xml:space="preserve"> but did not follow that point through to how trust is learned. As they frame it, their reading is a hypothesis; like ours, it interprets the same accounts, and interviews cannot show how far each explains the trajectory.</w:t>
       </w:r>
     </w:p>
     <w:p>
@@ -815,7 +815,28 @@
           <w:sz w:val="24"/>
           <w:szCs w:val="24"/>
         </w:rPr>
-        <w:t xml:space="preserve"> These were, however, misses that nurses themselves caught (P09). Misses shared by nurse and model remain unrecognised as model failures, and rare events accumulate slowly within 7 to 26 months of exposure.</w:t>
+        <w:t xml:space="preserve"> These were, however, misses that nurses themselves caught (P09), the only experiential basis for knowing “when it would miss” (P14).</w:t>
+      </w:r>
+      <w:r>
+        <w:rPr>
+          <w:rFonts w:ascii="Times New Roman" w:cs="Times New Roman" w:eastAsia="Times New Roman" w:hAnsi="Times New Roman"/>
+          <w:b w:val="false"/>
+          <w:bCs w:val="false"/>
+          <w:sz w:val="24"/>
+          <w:szCs w:val="24"/>
+          <w:vertAlign w:val="superscript"/>
+        </w:rPr>
+        <w:t xml:space="preserve">1</w:t>
+      </w:r>
+      <w:r>
+        <w:rPr>
+          <w:rFonts w:ascii="Times New Roman" w:cs="Times New Roman" w:eastAsia="Times New Roman" w:hAnsi="Times New Roman"/>
+          <w:b w:val="false"/>
+          <w:bCs w:val="false"/>
+          <w:sz w:val="24"/>
+          <w:szCs w:val="24"/>
+        </w:rPr>
+        <w:t xml:space="preserve"> Misses shared by nurse and model remain unrecognised as model failures, and rare events accumulate slowly over 7 to 26 months of exposure.</w:t>
       </w:r>
       <w:r>
         <w:rPr>
@@ -857,28 +878,28 @@
           <w:sz w:val="24"/>
           <w:szCs w:val="24"/>
         </w:rPr>
-        <w:t xml:space="preserve">: if surveillance erodes into alert-dependence, misses go not only undetected but unlearned. Surveillance alone is not enough: knowledge pooled through “peer exchange”</w:t>
-      </w:r>
-      <w:r>
-        <w:rPr>
-          <w:rFonts w:ascii="Times New Roman" w:cs="Times New Roman" w:eastAsia="Times New Roman" w:hAnsi="Times New Roman"/>
-          <w:b w:val="false"/>
-          <w:bCs w:val="false"/>
-          <w:sz w:val="24"/>
-          <w:szCs w:val="24"/>
-          <w:vertAlign w:val="superscript"/>
-        </w:rPr>
-        <w:t xml:space="preserve">1</w:t>
-      </w:r>
-      <w:r>
-        <w:rPr>
-          <w:rFonts w:ascii="Times New Roman" w:cs="Times New Roman" w:eastAsia="Times New Roman" w:hAnsi="Times New Roman"/>
-          <w:b w:val="false"/>
-          <w:bCs w:val="false"/>
-          <w:sz w:val="24"/>
-          <w:szCs w:val="24"/>
-        </w:rPr>
-        <w:t xml:space="preserve"> shares the same asymmetry; the nurse-facing performance reports the commentators propose would supply the feedback that neither experience nor training alone provides.</w:t>
+        <w:t xml:space="preserve">: if surveillance erodes into alert-dependence, misses go not only undetected but unlearned. Yet surveillance and knowledge pooled through “peer exchange”</w:t>
+      </w:r>
+      <w:r>
+        <w:rPr>
+          <w:rFonts w:ascii="Times New Roman" w:cs="Times New Roman" w:eastAsia="Times New Roman" w:hAnsi="Times New Roman"/>
+          <w:b w:val="false"/>
+          <w:bCs w:val="false"/>
+          <w:sz w:val="24"/>
+          <w:szCs w:val="24"/>
+          <w:vertAlign w:val="superscript"/>
+        </w:rPr>
+        <w:t xml:space="preserve">1</w:t>
+      </w:r>
+      <w:r>
+        <w:rPr>
+          <w:rFonts w:ascii="Times New Roman" w:cs="Times New Roman" w:eastAsia="Times New Roman" w:hAnsi="Times New Roman"/>
+          <w:b w:val="false"/>
+          <w:bCs w:val="false"/>
+          <w:sz w:val="24"/>
+          <w:szCs w:val="24"/>
+        </w:rPr>
+        <w:t xml:space="preserve"> share the same asymmetry; nurse-facing performance reports, as the commentators propose, can correct it.</w:t>
       </w:r>
     </w:p>
     <w:p>
@@ -894,7 +915,7 @@
           <w:sz w:val="24"/>
           <w:szCs w:val="24"/>
         </w:rPr>
-        <w:t xml:space="preserve">Algorithm aversion, moreover, was demonstrated where people could choose whether to rely on an algorithm after seeing it err</w:t>
+        <w:t xml:space="preserve">Algorithm aversion was demonstrated where people could choose whether to rely on an algorithm after seeing it err</w:t>
       </w:r>
       <w:r>
         <w:rPr>
@@ -936,7 +957,7 @@
           <w:sz w:val="24"/>
           <w:szCs w:val="24"/>
         </w:rPr>
-        <w:t xml:space="preserve"> An audit log would record that escalation as acceptance, whereas the account shows compliance without trust. Conversely, an unrecorded override leaves no rationale to review against what happened next, and P16’s certainty that an alert was “not real” is the kind of confidence that incomplete feedback can sustain.</w:t>
+        <w:t xml:space="preserve"> An audit log would record that escalation as acceptance, whereas the account shows compliance without trust. Conversely, an unrecorded override leaves no rationale to review against what happened next, and P16’s certainty that an alert was “not real” is the kind of confidence that, as the commentators argue, incomplete feedback can sustain.</w:t>
       </w:r>
       <w:r>
         <w:rPr>
@@ -1131,7 +1152,7 @@
           <w:sz w:val="24"/>
           <w:szCs w:val="24"/>
         </w:rPr>
-        <w:t xml:space="preserve">; its estimates do not describe the general deterioration model our participants used, but its lesson transfers. Local evaluation should specify outcomes, prediction horizons and alert thresholds, account for the effects of clinical intervention, and be made known to nurses.</w:t>
+        <w:t xml:space="preserve">; its estimates do not describe our participants’ general deterioration model, but its lesson transfers. Local evaluation should specify outcomes, prediction horizons and alert thresholds, account for the effects of clinical intervention, and be made known to nurses.</w:t>
       </w:r>
     </w:p>
     <w:p>
@@ -1163,28 +1184,28 @@
           <w:sz w:val="24"/>
           <w:szCs w:val="24"/>
         </w:rPr>
-        <w:t xml:space="preserve">Our proposed override field was a governance recommendation, not a tested intervention or a claim that overrides were safe. We accept that a field required only for overrides could “make acceptance the implicit default and attach friction to disagreement alone”, the risk our article named in warning against positioning the algorithm as “the default standard against which nursing assessment is judged”.</w:t>
-      </w:r>
-      <w:r>
-        <w:rPr>
-          <w:rFonts w:ascii="Times New Roman" w:cs="Times New Roman" w:eastAsia="Times New Roman" w:hAnsi="Times New Roman"/>
-          <w:b w:val="false"/>
-          <w:bCs w:val="false"/>
-          <w:sz w:val="24"/>
-          <w:szCs w:val="24"/>
-          <w:vertAlign w:val="superscript"/>
-        </w:rPr>
-        <w:t xml:space="preserve">1</w:t>
-      </w:r>
-      <w:r>
-        <w:rPr>
-          <w:rFonts w:ascii="Times New Roman" w:cs="Times New Roman" w:eastAsia="Times New Roman" w:hAnsi="Times New Roman"/>
-          <w:b w:val="false"/>
-          <w:bCs w:val="false"/>
-          <w:sz w:val="24"/>
-          <w:szCs w:val="24"/>
-        </w:rPr>
-        <w:t xml:space="preserve"> Acceptance and disagreement deserve comparable scrutiny, and accountability should follow the clinical reasoning rather than conformity with the algorithm. We therefore welcome symmetric capture from system logs, linking alerts, and periods without alerts, to nurses’ responses and to independently ascertained deterioration. Logs still need interpretive categories: a log shows that an alert was not escalated, not whether it was assessed and judged wrong or never read, which our proposed single-click acknowledgement, applied to every alert, would record.</w:t>
+        <w:t xml:space="preserve">Our proposed override field was a governance recommendation, not a tested intervention or a claim that overrides were safe. We accept the commentators’ warning that a field required only for overrides could “make acceptance the implicit default and attach friction to disagreement alone”, the risk our article named in warning against positioning the algorithm as “the default standard against which nursing assessment is judged”.</w:t>
+      </w:r>
+      <w:r>
+        <w:rPr>
+          <w:rFonts w:ascii="Times New Roman" w:cs="Times New Roman" w:eastAsia="Times New Roman" w:hAnsi="Times New Roman"/>
+          <w:b w:val="false"/>
+          <w:bCs w:val="false"/>
+          <w:sz w:val="24"/>
+          <w:szCs w:val="24"/>
+          <w:vertAlign w:val="superscript"/>
+        </w:rPr>
+        <w:t xml:space="preserve">1</w:t>
+      </w:r>
+      <w:r>
+        <w:rPr>
+          <w:rFonts w:ascii="Times New Roman" w:cs="Times New Roman" w:eastAsia="Times New Roman" w:hAnsi="Times New Roman"/>
+          <w:b w:val="false"/>
+          <w:bCs w:val="false"/>
+          <w:sz w:val="24"/>
+          <w:szCs w:val="24"/>
+        </w:rPr>
+        <w:t xml:space="preserve"> Acceptance and disagreement deserve comparable scrutiny, and accountability should follow clinical reasoning as judged at the time, not outcomes or conformity with the algorithm. We therefore welcome symmetric capture from system logs, linking alerts, and periods without alerts, to nurses’ responses and to independently ascertained deterioration. Logs still need interpretive categories: a log shows that an alert was not escalated, not whether it was assessed and judged wrong or never read, which our single-click acknowledgement, extended to every alert, could partly record.</w:t>
       </w:r>
       <w:r>
         <w:rPr>
@@ -1232,7 +1253,7 @@
           <w:sz w:val="24"/>
           <w:szCs w:val="24"/>
         </w:rPr>
-        <w:t xml:space="preserve"> Where a deployed system cannot ethically be withheld, simulation and vignette designs are feasible. The trial they cite also warrants caution: image-based explanations did not mitigate the harm of systematically biased predictions in a clinician vignette study,</w:t>
+        <w:t xml:space="preserve"> Where a deployed system cannot ethically be withheld, simulation and vignettes are feasible. The trial they cite counsels caution: image-based explanations did not mitigate the harm of systematically biased predictions in a clinician vignette study,</w:t>
       </w:r>
       <w:r>
         <w:rPr>
@@ -1253,7 +1274,7 @@
           <w:sz w:val="24"/>
           <w:szCs w:val="24"/>
         </w:rPr>
-        <w:t xml:space="preserve"> although its relevance to real-time nursing surveillance is untested. Our findings suggest what to test: discordant alerts, alarms after suctioning, and complex cases, for which participants trusted the system less (P05).</w:t>
+        <w:t xml:space="preserve"> although its relevance to real-time nursing surveillance is untested. Our findings suggest what to test: discordant alerts (P09), alarms after suctioning (P17), and complex cases, for which participants trusted the system less (P05).</w:t>
       </w:r>
       <w:r>
         <w:rPr>
@@ -1290,7 +1311,7 @@
           <w:sz w:val="24"/>
           <w:szCs w:val="24"/>
         </w:rPr>
-        <w:t xml:space="preserve">‘Calibrated to what?’ is the right question, and it has two answers. At the bedside, each alert is weighed against the patient, a real-time but fallible reference point. Across alerts, learned trust must be checked against the system’s measured performance, misses included. Our study described the first; the commentators rightly insist on the second. Safe AI-assisted early warning needs both, and nurses who keep watching closely enough to notice when alert and patient disagree.</w:t>
+        <w:t xml:space="preserve">The commentators ask the right question, ‘Calibrated to what?’, and it has two answers. At the bedside, each alert is weighed against the patient, a real-time but fallible reference point. Across alerts, learned trust must be checked against the system’s measured performance, misses included. Our study described the first; the commentators rightly insist on the second. Safe AI-assisted early warning needs both, and nurses who keep watching closely enough to notice when alert and patient disagree.</w:t>
       </w:r>
     </w:p>
     <w:p>

</xml_diff>

<commit_message>
Apply the corresponding author's six requested revisions to the response
- Title: 'Reading the Patient, Evaluating the System: Nurses' Trust and
  Reliance in AI-Assisted Early Warning'; 'two reference points' removed
- Commentary identified by title in the opening
- Perceived discordance no longer presented as verified model misses;
  event-frequency inference removed; absolute statements softened
- Logs and performance reports described precisely; accountability
  sentence refined; final synthesis rewritten
- Main text 1,460 words (1,474 with title); 32 quotations verified;
  12 references (Kahneman & Klein no longer cited)

Co-Authored-By: Claude Opus 5.5 <noreply@anthropic.com>
Claude-Session: https://claude.ai/code/session_01NFxkwSoaToLEQqh28ojz2g
</commit_message>
<xml_diff>
--- a/nicc_commentary_response/01_Response_to_Commentary_NICC.docx
+++ b/nicc_commentary_response/01_Response_to_Commentary_NICC.docx
@@ -29,7 +29,7 @@
           <w:sz w:val="32"/>
           <w:szCs w:val="32"/>
         </w:rPr>
-        <w:t xml:space="preserve">Reading the patient, measuring the system: Two reference points for nurses’ trust in AI-assisted early warning</w:t>
+        <w:t xml:space="preserve">Reading the Patient, Evaluating the System: Nurses’ Trust and Reliance in AI-Assisted Early Warning</w:t>
       </w:r>
     </w:p>
     <w:p>
@@ -239,7 +239,7 @@
           <w:sz w:val="20"/>
           <w:szCs w:val="20"/>
         </w:rPr>
-        <w:t xml:space="preserve">Word count: 1481 words (main text including headings; excluding title, author details, end statements and references). Title: 16 words.</w:t>
+        <w:t xml:space="preserve">Word count: 1460 words (main text including headings; excluding title, author details, end statements and references). Title: 14 words.</w:t>
       </w:r>
     </w:p>
     <w:p>
@@ -271,28 +271,28 @@
           <w:sz w:val="24"/>
           <w:szCs w:val="24"/>
         </w:rPr>
-        <w:t xml:space="preserve">We thank the commentators for their close reading of our study,</w:t>
-      </w:r>
-      <w:r>
-        <w:rPr>
-          <w:rFonts w:ascii="Times New Roman" w:cs="Times New Roman" w:eastAsia="Times New Roman" w:hAnsi="Times New Roman"/>
-          <w:b w:val="false"/>
-          <w:bCs w:val="false"/>
-          <w:sz w:val="24"/>
-          <w:szCs w:val="24"/>
-          <w:vertAlign w:val="superscript"/>
-        </w:rPr>
-        <w:t xml:space="preserve">1</w:t>
-      </w:r>
-      <w:r>
-        <w:rPr>
-          <w:rFonts w:ascii="Times New Roman" w:cs="Times New Roman" w:eastAsia="Times New Roman" w:hAnsi="Times New Roman"/>
-          <w:b w:val="false"/>
-          <w:bCs w:val="false"/>
-          <w:sz w:val="24"/>
-          <w:szCs w:val="24"/>
-        </w:rPr>
-        <w:t xml:space="preserve"> and for their recognition that silent override “deserves the governance attention the authors call for”. They accept that interviews “capture well how nurses make sense of their reliance”; their concern is “one inferential step: from nurses’ accounts of trust to the claim that this trust is calibrated”. We agree that reported adjustment of trust does not establish accurate calibration. Equally, understanding how nurses interpret alerts and negotiate responsibility contributes distinctly to the safe use of AI.</w:t>
+        <w:t xml:space="preserve">We thank the authors of the commentary “Calibrated to what? Feedback asymmetry and the limits of experiential trust in AI-assisted early warning” for their close reading of our study,</w:t>
+      </w:r>
+      <w:r>
+        <w:rPr>
+          <w:rFonts w:ascii="Times New Roman" w:cs="Times New Roman" w:eastAsia="Times New Roman" w:hAnsi="Times New Roman"/>
+          <w:b w:val="false"/>
+          <w:bCs w:val="false"/>
+          <w:sz w:val="24"/>
+          <w:szCs w:val="24"/>
+          <w:vertAlign w:val="superscript"/>
+        </w:rPr>
+        <w:t xml:space="preserve">1</w:t>
+      </w:r>
+      <w:r>
+        <w:rPr>
+          <w:rFonts w:ascii="Times New Roman" w:cs="Times New Roman" w:eastAsia="Times New Roman" w:hAnsi="Times New Roman"/>
+          <w:b w:val="false"/>
+          <w:bCs w:val="false"/>
+          <w:sz w:val="24"/>
+          <w:szCs w:val="24"/>
+        </w:rPr>
+        <w:t xml:space="preserve"> and for recognising that silent override “deserves the governance attention the authors call for”. They accept that interviews “capture well how nurses make sense of their reliance”; their concern is “one inferential step: from nurses’ accounts of trust to the claim that this trust is calibrated”. We agree that reported adjustment of trust does not establish accurate calibration. Equally, understanding how nurses interpret alerts and negotiate responsibility contributes distinctly to the safe use of AI.</w:t>
       </w:r>
     </w:p>
     <w:p>
@@ -345,28 +345,28 @@
           <w:sz w:val="24"/>
           <w:szCs w:val="24"/>
         </w:rPr>
-        <w:t xml:space="preserve"> Automation bias theory “sensitised the study” while “remaining subordinate to the inductive, interpretive commitments” of the design.</w:t>
-      </w:r>
-      <w:r>
-        <w:rPr>
-          <w:rFonts w:ascii="Times New Roman" w:cs="Times New Roman" w:eastAsia="Times New Roman" w:hAnsi="Times New Roman"/>
-          <w:b w:val="false"/>
-          <w:bCs w:val="false"/>
-          <w:sz w:val="24"/>
-          <w:szCs w:val="24"/>
-          <w:vertAlign w:val="superscript"/>
-        </w:rPr>
-        <w:t xml:space="preserve">1</w:t>
-      </w:r>
-      <w:r>
-        <w:rPr>
-          <w:rFonts w:ascii="Times New Roman" w:cs="Times New Roman" w:eastAsia="Times New Roman" w:hAnsi="Times New Roman"/>
-          <w:b w:val="false"/>
-          <w:bCs w:val="false"/>
-          <w:sz w:val="24"/>
-          <w:szCs w:val="24"/>
-        </w:rPr>
-        <w:t xml:space="preserve"> In Blumer’s terms, automation bias was a sensitising concept, suggesting “directions along which to look” rather than “prescriptions of what to see”.</w:t>
+        <w:t xml:space="preserve"> Automation bias theory “sensitised the study”</w:t>
+      </w:r>
+      <w:r>
+        <w:rPr>
+          <w:rFonts w:ascii="Times New Roman" w:cs="Times New Roman" w:eastAsia="Times New Roman" w:hAnsi="Times New Roman"/>
+          <w:b w:val="false"/>
+          <w:bCs w:val="false"/>
+          <w:sz w:val="24"/>
+          <w:szCs w:val="24"/>
+          <w:vertAlign w:val="superscript"/>
+        </w:rPr>
+        <w:t xml:space="preserve">1</w:t>
+      </w:r>
+      <w:r>
+        <w:rPr>
+          <w:rFonts w:ascii="Times New Roman" w:cs="Times New Roman" w:eastAsia="Times New Roman" w:hAnsi="Times New Roman"/>
+          <w:b w:val="false"/>
+          <w:bCs w:val="false"/>
+          <w:sz w:val="24"/>
+          <w:szCs w:val="24"/>
+        </w:rPr>
+        <w:t xml:space="preserve">: in Blumer’s terms, it served as a sensitising concept, suggesting “directions along which to look” rather than “prescriptions of what to see”.</w:t>
       </w:r>
       <w:r>
         <w:rPr>
@@ -387,7 +387,7 @@
           <w:sz w:val="24"/>
           <w:szCs w:val="24"/>
         </w:rPr>
-        <w:t xml:space="preserve"> We agree that automation bias is identified through the omission and commission errors it produces</w:t>
+        <w:t xml:space="preserve"> We agree that automation bias is identified through the omission and commission errors it produces.</w:t>
       </w:r>
       <w:r>
         <w:rPr>
@@ -408,28 +408,28 @@
           <w:sz w:val="24"/>
           <w:szCs w:val="24"/>
         </w:rPr>
-        <w:t xml:space="preserve">; no interview can capture an unrecognised error, and we claimed to detect none. What participants could describe was the pull towards the aid: an early period of “giving the score more authority than their own assessment”, and “an uneasy tendency to wait for the alert rather than lead surveillance”.</w:t>
-      </w:r>
-      <w:r>
-        <w:rPr>
-          <w:rFonts w:ascii="Times New Roman" w:cs="Times New Roman" w:eastAsia="Times New Roman" w:hAnsi="Times New Roman"/>
-          <w:b w:val="false"/>
-          <w:bCs w:val="false"/>
-          <w:sz w:val="24"/>
-          <w:szCs w:val="24"/>
-          <w:vertAlign w:val="superscript"/>
-        </w:rPr>
-        <w:t xml:space="preserve">1</w:t>
-      </w:r>
-      <w:r>
-        <w:rPr>
-          <w:rFonts w:ascii="Times New Roman" w:cs="Times New Roman" w:eastAsia="Times New Roman" w:hAnsi="Times New Roman"/>
-          <w:b w:val="false"/>
-          <w:bCs w:val="false"/>
-          <w:sz w:val="24"/>
-          <w:szCs w:val="24"/>
-        </w:rPr>
-        <w:t xml:space="preserve"> Such reliance produces error only when the aid errs; our title refers to experiences of that pull.</w:t>
+        <w:t xml:space="preserve"> Our interviews explored participants’ accounts of reliance and professional judgement; they did not independently establish the occurrence, frequency or consequences of automation-induced errors. What participants described was the pull towards the aid, including an early period of “giving the score more authority than their own assessment” and “an uneasy tendency to wait for the alert rather than lead surveillance”</w:t>
+      </w:r>
+      <w:r>
+        <w:rPr>
+          <w:rFonts w:ascii="Times New Roman" w:cs="Times New Roman" w:eastAsia="Times New Roman" w:hAnsi="Times New Roman"/>
+          <w:b w:val="false"/>
+          <w:bCs w:val="false"/>
+          <w:sz w:val="24"/>
+          <w:szCs w:val="24"/>
+          <w:vertAlign w:val="superscript"/>
+        </w:rPr>
+        <w:t xml:space="preserve">1</w:t>
+      </w:r>
+      <w:r>
+        <w:rPr>
+          <w:rFonts w:ascii="Times New Roman" w:cs="Times New Roman" w:eastAsia="Times New Roman" w:hAnsi="Times New Roman"/>
+          <w:b w:val="false"/>
+          <w:bCs w:val="false"/>
+          <w:sz w:val="24"/>
+          <w:szCs w:val="24"/>
+        </w:rPr>
+        <w:t xml:space="preserve">; the “experiences of automation bias” in our title refer to that pull.</w:t>
       </w:r>
     </w:p>
     <w:p>
@@ -521,27 +521,6 @@
         </w:rPr>
         <w:t xml:space="preserve">1</w:t>
       </w:r>
-      <w:r>
-        <w:rPr>
-          <w:rFonts w:ascii="Times New Roman" w:cs="Times New Roman" w:eastAsia="Times New Roman" w:hAnsi="Times New Roman"/>
-          <w:b w:val="false"/>
-          <w:bCs w:val="false"/>
-          <w:sz w:val="24"/>
-          <w:szCs w:val="24"/>
-        </w:rPr>
-        <w:t xml:space="preserve"> As Kahneman and Klein conclude, “subjective experience is not a reliable indicator of judgment accuracy”.</w:t>
-      </w:r>
-      <w:r>
-        <w:rPr>
-          <w:rFonts w:ascii="Times New Roman" w:cs="Times New Roman" w:eastAsia="Times New Roman" w:hAnsi="Times New Roman"/>
-          <w:b w:val="false"/>
-          <w:bCs w:val="false"/>
-          <w:sz w:val="24"/>
-          <w:szCs w:val="24"/>
-          <w:vertAlign w:val="superscript"/>
-        </w:rPr>
-        <w:t xml:space="preserve">6</w:t>
-      </w:r>
     </w:p>
     <w:p>
       <w:pPr>
@@ -609,7 +588,7 @@
           <w:szCs w:val="24"/>
           <w:vertAlign w:val="superscript"/>
         </w:rPr>
-        <w:t xml:space="preserve">7</w:t>
+        <w:t xml:space="preserve">6</w:t>
       </w:r>
       <w:r>
         <w:rPr>
@@ -646,7 +625,7 @@
           <w:szCs w:val="24"/>
           <w:vertAlign w:val="superscript"/>
         </w:rPr>
-        <w:t xml:space="preserve">8</w:t>
+        <w:t xml:space="preserve">7</w:t>
       </w:r>
       <w:r>
         <w:rPr>
@@ -794,112 +773,70 @@
           <w:sz w:val="24"/>
           <w:szCs w:val="24"/>
         </w:rPr>
-        <w:t xml:space="preserve">Feedback about correctness is incomplete in both directions. As the commentators acknowledge, an alert followed by no deterioration may reflect successful intervention rather than a false alarm; conversely, deterioration that nurses recognise can make an absent warning visible. Participants described patients who “appeared clinically worse than the score suggested” and learned “which situations it did not capture well”.</w:t>
-      </w:r>
-      <w:r>
-        <w:rPr>
-          <w:rFonts w:ascii="Times New Roman" w:cs="Times New Roman" w:eastAsia="Times New Roman" w:hAnsi="Times New Roman"/>
-          <w:b w:val="false"/>
-          <w:bCs w:val="false"/>
-          <w:sz w:val="24"/>
-          <w:szCs w:val="24"/>
-          <w:vertAlign w:val="superscript"/>
-        </w:rPr>
-        <w:t xml:space="preserve">1</w:t>
-      </w:r>
-      <w:r>
-        <w:rPr>
-          <w:rFonts w:ascii="Times New Roman" w:cs="Times New Roman" w:eastAsia="Times New Roman" w:hAnsi="Times New Roman"/>
-          <w:b w:val="false"/>
-          <w:bCs w:val="false"/>
-          <w:sz w:val="24"/>
-          <w:szCs w:val="24"/>
-        </w:rPr>
-        <w:t xml:space="preserve"> These were, however, misses that nurses themselves caught (P09), the only experiential basis for knowing “when it would miss” (P14).</w:t>
-      </w:r>
-      <w:r>
-        <w:rPr>
-          <w:rFonts w:ascii="Times New Roman" w:cs="Times New Roman" w:eastAsia="Times New Roman" w:hAnsi="Times New Roman"/>
-          <w:b w:val="false"/>
-          <w:bCs w:val="false"/>
-          <w:sz w:val="24"/>
-          <w:szCs w:val="24"/>
-          <w:vertAlign w:val="superscript"/>
-        </w:rPr>
-        <w:t xml:space="preserve">1</w:t>
-      </w:r>
-      <w:r>
-        <w:rPr>
-          <w:rFonts w:ascii="Times New Roman" w:cs="Times New Roman" w:eastAsia="Times New Roman" w:hAnsi="Times New Roman"/>
-          <w:b w:val="false"/>
-          <w:bCs w:val="false"/>
-          <w:sz w:val="24"/>
-          <w:szCs w:val="24"/>
-        </w:rPr>
-        <w:t xml:space="preserve"> Misses shared by nurse and model remain unrecognised as model failures, and rare events accumulate slowly over 7 to 26 months of exposure.</w:t>
-      </w:r>
-      <w:r>
-        <w:rPr>
-          <w:rFonts w:ascii="Times New Roman" w:cs="Times New Roman" w:eastAsia="Times New Roman" w:hAnsi="Times New Roman"/>
-          <w:b w:val="false"/>
-          <w:bCs w:val="false"/>
-          <w:sz w:val="24"/>
-          <w:szCs w:val="24"/>
-          <w:vertAlign w:val="superscript"/>
-        </w:rPr>
-        <w:t xml:space="preserve">1</w:t>
-      </w:r>
-      <w:r>
-        <w:rPr>
-          <w:rFonts w:ascii="Times New Roman" w:cs="Times New Roman" w:eastAsia="Times New Roman" w:hAnsi="Times New Roman"/>
-          <w:b w:val="false"/>
-          <w:bCs w:val="false"/>
-          <w:sz w:val="24"/>
-          <w:szCs w:val="24"/>
-        </w:rPr>
-        <w:t xml:space="preserve"> This strengthens our argument that surveillance skills “must be deliberately taught, practised and protected”</w:t>
-      </w:r>
-      <w:r>
-        <w:rPr>
-          <w:rFonts w:ascii="Times New Roman" w:cs="Times New Roman" w:eastAsia="Times New Roman" w:hAnsi="Times New Roman"/>
-          <w:b w:val="false"/>
-          <w:bCs w:val="false"/>
-          <w:sz w:val="24"/>
-          <w:szCs w:val="24"/>
-          <w:vertAlign w:val="superscript"/>
-        </w:rPr>
-        <w:t xml:space="preserve">1</w:t>
-      </w:r>
-      <w:r>
-        <w:rPr>
-          <w:rFonts w:ascii="Times New Roman" w:cs="Times New Roman" w:eastAsia="Times New Roman" w:hAnsi="Times New Roman"/>
-          <w:b w:val="false"/>
-          <w:bCs w:val="false"/>
-          <w:sz w:val="24"/>
-          <w:szCs w:val="24"/>
-        </w:rPr>
-        <w:t xml:space="preserve">: if surveillance erodes into alert-dependence, misses go not only undetected but unlearned. Yet surveillance and knowledge pooled through “peer exchange”</w:t>
-      </w:r>
-      <w:r>
-        <w:rPr>
-          <w:rFonts w:ascii="Times New Roman" w:cs="Times New Roman" w:eastAsia="Times New Roman" w:hAnsi="Times New Roman"/>
-          <w:b w:val="false"/>
-          <w:bCs w:val="false"/>
-          <w:sz w:val="24"/>
-          <w:szCs w:val="24"/>
-          <w:vertAlign w:val="superscript"/>
-        </w:rPr>
-        <w:t xml:space="preserve">1</w:t>
-      </w:r>
-      <w:r>
-        <w:rPr>
-          <w:rFonts w:ascii="Times New Roman" w:cs="Times New Roman" w:eastAsia="Times New Roman" w:hAnsi="Times New Roman"/>
-          <w:b w:val="false"/>
-          <w:bCs w:val="false"/>
-          <w:sz w:val="24"/>
-          <w:szCs w:val="24"/>
-        </w:rPr>
-        <w:t xml:space="preserve"> share the same asymmetry; nurse-facing performance reports, as the commentators propose, can correct it.</w:t>
+        <w:t xml:space="preserve">Feedback about correctness is incomplete in both directions. As the commentators acknowledge, an alert followed by no deterioration may reflect successful intervention rather than a false alarm; conversely, deterioration that nurses recognise can make an absent warning visible. Participants described occasions when their assessment suggested deterioration that the score did not adequately reflect (“The score was fine, but I knew something was wrong”, P09).</w:t>
+      </w:r>
+      <w:r>
+        <w:rPr>
+          <w:rFonts w:ascii="Times New Roman" w:cs="Times New Roman" w:eastAsia="Times New Roman" w:hAnsi="Times New Roman"/>
+          <w:b w:val="false"/>
+          <w:bCs w:val="false"/>
+          <w:sz w:val="24"/>
+          <w:szCs w:val="24"/>
+          <w:vertAlign w:val="superscript"/>
+        </w:rPr>
+        <w:t xml:space="preserve">1</w:t>
+      </w:r>
+      <w:r>
+        <w:rPr>
+          <w:rFonts w:ascii="Times New Roman" w:cs="Times New Roman" w:eastAsia="Times New Roman" w:hAnsi="Times New Roman"/>
+          <w:b w:val="false"/>
+          <w:bCs w:val="false"/>
+          <w:sz w:val="24"/>
+          <w:szCs w:val="24"/>
+        </w:rPr>
+        <w:t xml:space="preserve"> These accounts illustrate perceived discordance, rather than independently verified model misses; P14’s sense of knowing “when it would miss” is likewise perceived, not verified. Misses shared by nurse and model would remain unrecognised, and duration of exposure alone does not show whether feedback was complete enough to evaluate the system’s reliability. This strengthens our argument that surveillance skills “must be deliberately taught, practised and protected”</w:t>
+      </w:r>
+      <w:r>
+        <w:rPr>
+          <w:rFonts w:ascii="Times New Roman" w:cs="Times New Roman" w:eastAsia="Times New Roman" w:hAnsi="Times New Roman"/>
+          <w:b w:val="false"/>
+          <w:bCs w:val="false"/>
+          <w:sz w:val="24"/>
+          <w:szCs w:val="24"/>
+          <w:vertAlign w:val="superscript"/>
+        </w:rPr>
+        <w:t xml:space="preserve">1</w:t>
+      </w:r>
+      <w:r>
+        <w:rPr>
+          <w:rFonts w:ascii="Times New Roman" w:cs="Times New Roman" w:eastAsia="Times New Roman" w:hAnsi="Times New Roman"/>
+          <w:b w:val="false"/>
+          <w:bCs w:val="false"/>
+          <w:sz w:val="24"/>
+          <w:szCs w:val="24"/>
+        </w:rPr>
+        <w:t xml:space="preserve">: if surveillance erodes into alert-dependence, missed deterioration goes not only undetected but unlearned. Yet surveillance and knowledge pooled through “peer exchange”</w:t>
+      </w:r>
+      <w:r>
+        <w:rPr>
+          <w:rFonts w:ascii="Times New Roman" w:cs="Times New Roman" w:eastAsia="Times New Roman" w:hAnsi="Times New Roman"/>
+          <w:b w:val="false"/>
+          <w:bCs w:val="false"/>
+          <w:sz w:val="24"/>
+          <w:szCs w:val="24"/>
+          <w:vertAlign w:val="superscript"/>
+        </w:rPr>
+        <w:t xml:space="preserve">1</w:t>
+      </w:r>
+      <w:r>
+        <w:rPr>
+          <w:rFonts w:ascii="Times New Roman" w:cs="Times New Roman" w:eastAsia="Times New Roman" w:hAnsi="Times New Roman"/>
+          <w:b w:val="false"/>
+          <w:bCs w:val="false"/>
+          <w:sz w:val="24"/>
+          <w:szCs w:val="24"/>
+        </w:rPr>
+        <w:t xml:space="preserve"> share the same asymmetry; nurse-facing performance reports, as the commentators propose, may help address it, provided outcomes are soundly ascertained and interpreted.</w:t>
       </w:r>
     </w:p>
     <w:p>
@@ -926,7 +863,7 @@
           <w:szCs w:val="24"/>
           <w:vertAlign w:val="superscript"/>
         </w:rPr>
-        <w:t xml:space="preserve">9</w:t>
+        <w:t xml:space="preserve">8</w:t>
       </w:r>
       <w:r>
         <w:rPr>
@@ -957,7 +894,7 @@
           <w:sz w:val="24"/>
           <w:szCs w:val="24"/>
         </w:rPr>
-        <w:t xml:space="preserve"> An audit log would record that escalation as acceptance, whereas the account shows compliance without trust. Conversely, an unrecorded override leaves no rationale to review against what happened next, and P16’s certainty that an alert was “not real” is the kind of confidence that, as the commentators argue, incomplete feedback can sustain.</w:t>
+        <w:t xml:space="preserve"> A log may show that escalation without revealing whether it reflected trust, uncertainty or institutional pressure; the account suggests compliance without trust. Conversely, an unrecorded override leaves no rationale to review against what happened next, and P16’s certainty that an alert was “not real” is the kind of confidence that, as the commentators argue, incomplete feedback can sustain.</w:t>
       </w:r>
       <w:r>
         <w:rPr>
@@ -994,7 +931,7 @@
           <w:sz w:val="24"/>
           <w:szCs w:val="24"/>
         </w:rPr>
-        <w:t xml:space="preserve">4 | TWO REFERENCE POINTS: THE PATIENT AND THE SYSTEM</w:t>
+        <w:t xml:space="preserve">4 | BEDSIDE JUDGEMENT AND INDEPENDENT EVALUATION</w:t>
       </w:r>
     </w:p>
     <w:p>
@@ -1010,7 +947,7 @@
           <w:sz w:val="24"/>
           <w:szCs w:val="24"/>
         </w:rPr>
-        <w:t xml:space="preserve">For each alert, our participants’ reference point was the patient in front of them (“I look at my patient”, P03),</w:t>
+        <w:t xml:space="preserve">For each alert, participants weighed the score against the patient in front of them (“I look at my patient”, P03),</w:t>
       </w:r>
       <w:r>
         <w:rPr>
@@ -1042,6 +979,48 @@
           <w:szCs w:val="24"/>
           <w:vertAlign w:val="superscript"/>
         </w:rPr>
+        <w:t xml:space="preserve">9</w:t>
+      </w:r>
+      <w:r>
+        <w:rPr>
+          <w:rFonts w:ascii="Times New Roman" w:cs="Times New Roman" w:eastAsia="Times New Roman" w:hAnsi="Times New Roman"/>
+          <w:b w:val="false"/>
+          <w:bCs w:val="false"/>
+          <w:sz w:val="24"/>
+          <w:szCs w:val="24"/>
+        </w:rPr>
+        <w:t xml:space="preserve"> Bedside judgement guides the clinical response but cannot establish calibration. As the commentators argue, nurse and model can agree and both be wrong, and an assessment anchored by the alert cannot independently judge the same decision. We add a structural reason: the model analyses the same “routinely documented vital signs and laboratory parameters”</w:t>
+      </w:r>
+      <w:r>
+        <w:rPr>
+          <w:rFonts w:ascii="Times New Roman" w:cs="Times New Roman" w:eastAsia="Times New Roman" w:hAnsi="Times New Roman"/>
+          <w:b w:val="false"/>
+          <w:bCs w:val="false"/>
+          <w:sz w:val="24"/>
+          <w:szCs w:val="24"/>
+          <w:vertAlign w:val="superscript"/>
+        </w:rPr>
+        <w:t xml:space="preserve">1</w:t>
+      </w:r>
+      <w:r>
+        <w:rPr>
+          <w:rFonts w:ascii="Times New Roman" w:cs="Times New Roman" w:eastAsia="Times New Roman" w:hAnsi="Times New Roman"/>
+          <w:b w:val="false"/>
+          <w:bCs w:val="false"/>
+          <w:sz w:val="24"/>
+          <w:szCs w:val="24"/>
+        </w:rPr>
+        <w:t xml:space="preserve"> that inform the nurse’s assessment, so the two are not fully independent, and clinicians report judging a model’s accuracy partly by its concordance with their own impressions.</w:t>
+      </w:r>
+      <w:r>
+        <w:rPr>
+          <w:rFonts w:ascii="Times New Roman" w:cs="Times New Roman" w:eastAsia="Times New Roman" w:hAnsi="Times New Roman"/>
+          <w:b w:val="false"/>
+          <w:bCs w:val="false"/>
+          <w:sz w:val="24"/>
+          <w:szCs w:val="24"/>
+          <w:vertAlign w:val="superscript"/>
+        </w:rPr>
         <w:t xml:space="preserve">10</w:t>
       </w:r>
       <w:r>
@@ -1052,49 +1031,7 @@
           <w:sz w:val="24"/>
           <w:szCs w:val="24"/>
         </w:rPr>
-        <w:t xml:space="preserve"> As the commentators argue, a nurse and a model can agree and both be wrong, and an assessment anchored by the alert cannot serve as an independent standard for the same decision. We add a structural reason: the model analyses the same “routinely documented vital signs and laboratory parameters”</w:t>
-      </w:r>
-      <w:r>
-        <w:rPr>
-          <w:rFonts w:ascii="Times New Roman" w:cs="Times New Roman" w:eastAsia="Times New Roman" w:hAnsi="Times New Roman"/>
-          <w:b w:val="false"/>
-          <w:bCs w:val="false"/>
-          <w:sz w:val="24"/>
-          <w:szCs w:val="24"/>
-          <w:vertAlign w:val="superscript"/>
-        </w:rPr>
-        <w:t xml:space="preserve">1</w:t>
-      </w:r>
-      <w:r>
-        <w:rPr>
-          <w:rFonts w:ascii="Times New Roman" w:cs="Times New Roman" w:eastAsia="Times New Roman" w:hAnsi="Times New Roman"/>
-          <w:b w:val="false"/>
-          <w:bCs w:val="false"/>
-          <w:sz w:val="24"/>
-          <w:szCs w:val="24"/>
-        </w:rPr>
-        <w:t xml:space="preserve"> that inform the nurse’s assessment, so the two are not fully independent, and clinicians report judging a model’s accuracy partly by its concordance with their own impressions.</w:t>
-      </w:r>
-      <w:r>
-        <w:rPr>
-          <w:rFonts w:ascii="Times New Roman" w:cs="Times New Roman" w:eastAsia="Times New Roman" w:hAnsi="Times New Roman"/>
-          <w:b w:val="false"/>
-          <w:bCs w:val="false"/>
-          <w:sz w:val="24"/>
-          <w:szCs w:val="24"/>
-          <w:vertAlign w:val="superscript"/>
-        </w:rPr>
-        <w:t xml:space="preserve">11</w:t>
-      </w:r>
-      <w:r>
-        <w:rPr>
-          <w:rFonts w:ascii="Times New Roman" w:cs="Times New Roman" w:eastAsia="Times New Roman" w:hAnsi="Times New Roman"/>
-          <w:b w:val="false"/>
-          <w:bCs w:val="false"/>
-          <w:sz w:val="24"/>
-          <w:szCs w:val="24"/>
-        </w:rPr>
-        <w:t xml:space="preserve"> Whether learned trust tracks the system’s reliability can be known only against a second reference point: local performance data that include missed events.</w:t>
+        <w:t xml:space="preserve"> Whether trust and reliance correspond to the system’s performance can be established only by independent, outcome-linked evaluation that includes missed events.</w:t>
       </w:r>
     </w:p>
     <w:p>
@@ -1142,7 +1079,7 @@
           <w:szCs w:val="24"/>
           <w:vertAlign w:val="superscript"/>
         </w:rPr>
-        <w:t xml:space="preserve">12</w:t>
+        <w:t xml:space="preserve">11</w:t>
       </w:r>
       <w:r>
         <w:rPr>
@@ -1184,28 +1121,28 @@
           <w:sz w:val="24"/>
           <w:szCs w:val="24"/>
         </w:rPr>
-        <w:t xml:space="preserve">Our proposed override field was a governance recommendation, not a tested intervention or a claim that overrides were safe. We accept the commentators’ warning that a field required only for overrides could “make acceptance the implicit default and attach friction to disagreement alone”, the risk our article named in warning against positioning the algorithm as “the default standard against which nursing assessment is judged”.</w:t>
-      </w:r>
-      <w:r>
-        <w:rPr>
-          <w:rFonts w:ascii="Times New Roman" w:cs="Times New Roman" w:eastAsia="Times New Roman" w:hAnsi="Times New Roman"/>
-          <w:b w:val="false"/>
-          <w:bCs w:val="false"/>
-          <w:sz w:val="24"/>
-          <w:szCs w:val="24"/>
-          <w:vertAlign w:val="superscript"/>
-        </w:rPr>
-        <w:t xml:space="preserve">1</w:t>
-      </w:r>
-      <w:r>
-        <w:rPr>
-          <w:rFonts w:ascii="Times New Roman" w:cs="Times New Roman" w:eastAsia="Times New Roman" w:hAnsi="Times New Roman"/>
-          <w:b w:val="false"/>
-          <w:bCs w:val="false"/>
-          <w:sz w:val="24"/>
-          <w:szCs w:val="24"/>
-        </w:rPr>
-        <w:t xml:space="preserve"> Acceptance and disagreement deserve comparable scrutiny, and accountability should follow clinical reasoning as judged at the time, not outcomes or conformity with the algorithm. We therefore welcome symmetric capture from system logs, linking alerts, and periods without alerts, to nurses’ responses and to independently ascertained deterioration. Logs still need interpretive categories: a log shows that an alert was not escalated, not whether it was assessed and judged wrong or never read, which our single-click acknowledgement, extended to every alert, could partly record.</w:t>
+        <w:t xml:space="preserve">Our proposed override field was a governance recommendation, not a tested intervention or a claim that overrides were safe. We accept the commentators’ warning that a field required only for overrides could “make acceptance the implicit default and attach friction to disagreement alone”, a risk our article also named.</w:t>
+      </w:r>
+      <w:r>
+        <w:rPr>
+          <w:rFonts w:ascii="Times New Roman" w:cs="Times New Roman" w:eastAsia="Times New Roman" w:hAnsi="Times New Roman"/>
+          <w:b w:val="false"/>
+          <w:bCs w:val="false"/>
+          <w:sz w:val="24"/>
+          <w:szCs w:val="24"/>
+          <w:vertAlign w:val="superscript"/>
+        </w:rPr>
+        <w:t xml:space="preserve">1</w:t>
+      </w:r>
+      <w:r>
+        <w:rPr>
+          <w:rFonts w:ascii="Times New Roman" w:cs="Times New Roman" w:eastAsia="Times New Roman" w:hAnsi="Times New Roman"/>
+          <w:b w:val="false"/>
+          <w:bCs w:val="false"/>
+          <w:sz w:val="24"/>
+          <w:szCs w:val="24"/>
+        </w:rPr>
+        <w:t xml:space="preserve"> Acceptance and disagreement deserve comparable scrutiny. Accountability should consider the information available at the time of the decision alongside independent review of subsequent outcomes, rather than conformity with the algorithm alone. We therefore welcome symmetric capture from system logs, linking alerts, and periods without alerts, to nurses’ responses and to independently ascertained deterioration. Logs still need interpretive categories: a log shows that an alert was not escalated, not whether it was assessed and judged wrong or never read, which our single-click acknowledgement, extended to every alert, could partly record.</w:t>
       </w:r>
       <w:r>
         <w:rPr>
@@ -1264,38 +1201,38 @@
           <w:szCs w:val="24"/>
           <w:vertAlign w:val="superscript"/>
         </w:rPr>
-        <w:t xml:space="preserve">13</w:t>
-      </w:r>
-      <w:r>
-        <w:rPr>
-          <w:rFonts w:ascii="Times New Roman" w:cs="Times New Roman" w:eastAsia="Times New Roman" w:hAnsi="Times New Roman"/>
-          <w:b w:val="false"/>
-          <w:bCs w:val="false"/>
-          <w:sz w:val="24"/>
-          <w:szCs w:val="24"/>
-        </w:rPr>
-        <w:t xml:space="preserve"> although its relevance to real-time nursing surveillance is untested. Our findings suggest what to test: discordant alerts (P09), alarms after suctioning (P17), and complex cases, for which participants trusted the system less (P05).</w:t>
-      </w:r>
-      <w:r>
-        <w:rPr>
-          <w:rFonts w:ascii="Times New Roman" w:cs="Times New Roman" w:eastAsia="Times New Roman" w:hAnsi="Times New Roman"/>
-          <w:b w:val="false"/>
-          <w:bCs w:val="false"/>
-          <w:sz w:val="24"/>
-          <w:szCs w:val="24"/>
-          <w:vertAlign w:val="superscript"/>
-        </w:rPr>
-        <w:t xml:space="preserve">1</w:t>
-      </w:r>
-      <w:r>
-        <w:rPr>
-          <w:rFonts w:ascii="Times New Roman" w:cs="Times New Roman" w:eastAsia="Times New Roman" w:hAnsi="Times New Roman"/>
-          <w:b w:val="false"/>
-          <w:bCs w:val="false"/>
-          <w:sz w:val="24"/>
-          <w:szCs w:val="24"/>
-        </w:rPr>
-        <w:t xml:space="preserve"> Comparing nurses’ trust across patient groups with group-specific false-alarm rates and with misses, separating those nurses caught from those they did not, would show whether differentiated trust tracks the system’s reliability or only its visible errors. Such studies should distinguish confidence, reported trust and observed reliance; interviews, in turn, show how nurses understand that reliance.</w:t>
+        <w:t xml:space="preserve">12</w:t>
+      </w:r>
+      <w:r>
+        <w:rPr>
+          <w:rFonts w:ascii="Times New Roman" w:cs="Times New Roman" w:eastAsia="Times New Roman" w:hAnsi="Times New Roman"/>
+          <w:b w:val="false"/>
+          <w:bCs w:val="false"/>
+          <w:sz w:val="24"/>
+          <w:szCs w:val="24"/>
+        </w:rPr>
+        <w:t xml:space="preserve"> although its relevance to nursing surveillance is untested. Our findings suggest what to test: discordant alerts (P09), alarms after suctioning (P17), and complex cases, for which participants trusted the system less (P05).</w:t>
+      </w:r>
+      <w:r>
+        <w:rPr>
+          <w:rFonts w:ascii="Times New Roman" w:cs="Times New Roman" w:eastAsia="Times New Roman" w:hAnsi="Times New Roman"/>
+          <w:b w:val="false"/>
+          <w:bCs w:val="false"/>
+          <w:sz w:val="24"/>
+          <w:szCs w:val="24"/>
+          <w:vertAlign w:val="superscript"/>
+        </w:rPr>
+        <w:t xml:space="preserve">1</w:t>
+      </w:r>
+      <w:r>
+        <w:rPr>
+          <w:rFonts w:ascii="Times New Roman" w:cs="Times New Roman" w:eastAsia="Times New Roman" w:hAnsi="Times New Roman"/>
+          <w:b w:val="false"/>
+          <w:bCs w:val="false"/>
+          <w:sz w:val="24"/>
+          <w:szCs w:val="24"/>
+        </w:rPr>
+        <w:t xml:space="preserve"> Comparing nurses’ trust across patient groups with group-specific false-alarm rates and independently ascertained misses, separating those nurses recognised from those they did not, would show whether differentiated trust tracks reliability or only visible errors. Such studies should distinguish confidence, reported trust and observed reliance.</w:t>
       </w:r>
     </w:p>
     <w:p>
@@ -1311,7 +1248,7 @@
           <w:sz w:val="24"/>
           <w:szCs w:val="24"/>
         </w:rPr>
-        <w:t xml:space="preserve">The commentators ask the right question, ‘Calibrated to what?’, and it has two answers. At the bedside, each alert is weighed against the patient, a real-time but fallible reference point. Across alerts, learned trust must be checked against the system’s measured performance, misses included. Our study described the first; the commentators rightly insist on the second. Safe AI-assisted early warning needs both, and nurses who keep watching closely enough to notice when alert and patient disagree.</w:t>
+        <w:t xml:space="preserve">The commentators ask the right question: ‘Calibrated to what?’ Bedside assessment guides the immediate clinical response; independent, outcome-linked evaluation establishes whether trust and reliance correspond to system performance. Our study illuminates nurses’ interpretations and the organisational conditions shaping their responses. The commentary identifies the complementary evidence needed to evaluate their appropriateness.</w:t>
       </w:r>
     </w:p>
     <w:p>
@@ -1536,7 +1473,7 @@
           <w:sz w:val="22"/>
           <w:szCs w:val="22"/>
         </w:rPr>
-        <w:t xml:space="preserve">6. Kahneman D, Klein G. Conditions for intuitive expertise: a failure to disagree. American Psychologist. 2009;64(6):515-526. doi:10.1037/a0016755</w:t>
+        <w:t xml:space="preserve">6. Kohn SC, de Visser EJ, Wiese E, Lee YC, Shaw TH. Measurement of trust in automation: a narrative review and reference guide. Frontiers in Psychology. 2021;12:604977. doi:10.3389/fpsyg.2021.604977</w:t>
       </w:r>
     </w:p>
     <w:p>
@@ -1553,7 +1490,7 @@
           <w:sz w:val="22"/>
           <w:szCs w:val="22"/>
         </w:rPr>
-        <w:t xml:space="preserve">7. Kohn SC, de Visser EJ, Wiese E, Lee YC, Shaw TH. Measurement of trust in automation: a narrative review and reference guide. Frontiers in Psychology. 2021;12:604977. doi:10.3389/fpsyg.2021.604977</w:t>
+        <w:t xml:space="preserve">7. Nisbett RE, Wilson TD. Telling more than we can know: verbal reports on mental processes. Psychological Review. 1977;84(3):231-259. doi:10.1037/0033-295X.84.3.231</w:t>
       </w:r>
     </w:p>
     <w:p>
@@ -1570,7 +1507,7 @@
           <w:sz w:val="22"/>
           <w:szCs w:val="22"/>
         </w:rPr>
-        <w:t xml:space="preserve">8. Nisbett RE, Wilson TD. Telling more than we can know: verbal reports on mental processes. Psychological Review. 1977;84(3):231-259. doi:10.1037/0033-295X.84.3.231</w:t>
+        <w:t xml:space="preserve">8. Dietvorst BJ, Simmons JP, Massey C. Algorithm aversion: people erroneously avoid algorithms after seeing them err. Journal of Experimental Psychology: General. 2015;144(1):114-126. doi:10.1037/xge0000033</w:t>
       </w:r>
     </w:p>
     <w:p>
@@ -1587,7 +1524,7 @@
           <w:sz w:val="22"/>
           <w:szCs w:val="22"/>
         </w:rPr>
-        <w:t xml:space="preserve">9. Dietvorst BJ, Simmons JP, Massey C. Algorithm aversion: people erroneously avoid algorithms after seeing them err. Journal of Experimental Psychology: General. 2015;144(1):114-126. doi:10.1037/xge0000033</w:t>
+        <w:t xml:space="preserve">9. Tanner CA. Thinking like a nurse: a research-based model of clinical judgment in nursing. Journal of Nursing Education. 2006;45(6):204-211. doi:10.3928/01484834-20060601-04</w:t>
       </w:r>
     </w:p>
     <w:p>
@@ -1604,7 +1541,7 @@
           <w:sz w:val="22"/>
           <w:szCs w:val="22"/>
         </w:rPr>
-        <w:t xml:space="preserve">10. Tanner CA. Thinking like a nurse: a research-based model of clinical judgment in nursing. Journal of Nursing Education. 2006;45(6):204-211. doi:10.3928/01484834-20060601-04</w:t>
+        <w:t xml:space="preserve">10. Schwartz JM, George M, Rossetti SC, et al. Factors influencing clinician trust in predictive clinical decision support systems for in-hospital deterioration: qualitative descriptive study. JMIR Human Factors. 2022;9(2):e33960. doi:10.2196/33960</w:t>
       </w:r>
     </w:p>
     <w:p>
@@ -1621,7 +1558,7 @@
           <w:sz w:val="22"/>
           <w:szCs w:val="22"/>
         </w:rPr>
-        <w:t xml:space="preserve">11. Schwartz JM, George M, Rossetti SC, et al. Factors influencing clinician trust in predictive clinical decision support systems for in-hospital deterioration: qualitative descriptive study. JMIR Human Factors. 2022;9(2):e33960. doi:10.2196/33960</w:t>
+        <w:t xml:space="preserve">11. Wong A, Otles E, Donnelly JP, et al. External validation of a widely implemented proprietary sepsis prediction model in hospitalized patients. JAMA Internal Medicine. 2021;181(8):1065-1070. doi:10.1001/jamainternmed.2021.2626</w:t>
       </w:r>
     </w:p>
     <w:p>
@@ -1638,24 +1575,7 @@
           <w:sz w:val="22"/>
           <w:szCs w:val="22"/>
         </w:rPr>
-        <w:t xml:space="preserve">12. Wong A, Otles E, Donnelly JP, et al. External validation of a widely implemented proprietary sepsis prediction model in hospitalized patients. JAMA Internal Medicine. 2021;181(8):1065-1070. doi:10.1001/jamainternmed.2021.2626</w:t>
-      </w:r>
-    </w:p>
-    <w:p>
-      <w:pPr>
-        <w:spacing w:after="100" w:before="0" w:line="276"/>
-        <w:ind w:left="400" w:hanging="400"/>
-        <w:jc w:val="left"/>
-      </w:pPr>
-      <w:r>
-        <w:rPr>
-          <w:rFonts w:ascii="Times New Roman" w:cs="Times New Roman" w:eastAsia="Times New Roman" w:hAnsi="Times New Roman"/>
-          <w:b w:val="false"/>
-          <w:bCs w:val="false"/>
-          <w:sz w:val="22"/>
-          <w:szCs w:val="22"/>
-        </w:rPr>
-        <w:t xml:space="preserve">13. Jabbour S, Fouhey D, Shepard S, et al. Measuring the impact of AI in the diagnosis of hospitalized patients: a randomized clinical vignette survey study. JAMA. 2023;330(23):2275-2284. doi:10.1001/jama.2023.22295</w:t>
+        <w:t xml:space="preserve">12. Jabbour S, Fouhey D, Shepard S, et al. Measuring the impact of AI in the diagnosis of hospitalized patients: a randomized clinical vignette survey study. JAMA. 2023;330(23):2275-2284. doi:10.1001/jama.2023.22295</w:t>
       </w:r>
     </w:p>
     <w:sectPr>

</xml_diff>

<commit_message>
Apply compliance-audit fixes: hedge remaining categorical claims
- 'may remain unrecognised', 'may go ... unlearned', 'apparently false
  alarms', 'a log may show that no escalation was recorded',
  'interviews alone', 'our interviews'
- Shorter citation line under the title
- Main text 1,465 words; 1,493 even counting title and citation line

Co-Authored-By: Claude Opus 5.5 <noreply@anthropic.com>
Claude-Session: https://claude.ai/code/session_01NFxkwSoaToLEQqh28ojz2g
</commit_message>
<xml_diff>
--- a/nicc_commentary_response/01_Response_to_Commentary_NICC.docx
+++ b/nicc_commentary_response/01_Response_to_Commentary_NICC.docx
@@ -223,7 +223,7 @@
           <w:sz w:val="20"/>
           <w:szCs w:val="20"/>
         </w:rPr>
-        <w:t xml:space="preserve">Response to a commentary on: Samy R, Ramadan OME, Elsayed GEA. Trusting the algorithm or trusting the nurse? Critical care nurses’ experiences of automation bias and professional autonomy in AI-assisted early warning. Nursing in Critical Care. 2026;31(5):e70620. doi:10.1111/nicc.70620</w:t>
+        <w:t xml:space="preserve">Response to a commentary on Samy et al., Nursing in Critical Care 2026;31(5):e70620. doi:10.1111/nicc.70620</w:t>
       </w:r>
     </w:p>
     <w:p>
@@ -239,7 +239,7 @@
           <w:sz w:val="20"/>
           <w:szCs w:val="20"/>
         </w:rPr>
-        <w:t xml:space="preserve">Word count: 1460 words (main text including headings; excluding title, author details, end statements and references). Title: 14 words.</w:t>
+        <w:t xml:space="preserve">Word count: 1465 words (main text including headings; excluding title, author details, end statements and references). Title: 14 words.</w:t>
       </w:r>
     </w:p>
     <w:p>
@@ -466,7 +466,7 @@
           <w:sz w:val="24"/>
           <w:szCs w:val="24"/>
         </w:rPr>
-        <w:t xml:space="preserve"> and that interviews cannot establish it. Our statement that trust was “actively calibrated through experience” suggests more than our design supports.</w:t>
+        <w:t xml:space="preserve"> and that interviews alone cannot establish it. Our statement that trust was “actively calibrated through experience” suggests more than our design supports.</w:t>
       </w:r>
       <w:r>
         <w:rPr>
@@ -757,7 +757,7 @@
           <w:sz w:val="24"/>
           <w:szCs w:val="24"/>
         </w:rPr>
-        <w:t xml:space="preserve"> but did not follow that point through to how trust is learned. As they frame it, their reading is a hypothesis; like ours, it interprets the same accounts, and interviews cannot show how far each explains the trajectory.</w:t>
+        <w:t xml:space="preserve"> but did not follow that point through to how trust is learned. As they frame it, their reading is a hypothesis; like ours, it interprets the same accounts, and our interviews cannot show how far each explains the trajectory.</w:t>
       </w:r>
     </w:p>
     <w:p>
@@ -794,28 +794,28 @@
           <w:sz w:val="24"/>
           <w:szCs w:val="24"/>
         </w:rPr>
-        <w:t xml:space="preserve"> These accounts illustrate perceived discordance, rather than independently verified model misses; P14’s sense of knowing “when it would miss” is likewise perceived, not verified. Misses shared by nurse and model would remain unrecognised, and duration of exposure alone does not show whether feedback was complete enough to evaluate the system’s reliability. This strengthens our argument that surveillance skills “must be deliberately taught, practised and protected”</w:t>
-      </w:r>
-      <w:r>
-        <w:rPr>
-          <w:rFonts w:ascii="Times New Roman" w:cs="Times New Roman" w:eastAsia="Times New Roman" w:hAnsi="Times New Roman"/>
-          <w:b w:val="false"/>
-          <w:bCs w:val="false"/>
-          <w:sz w:val="24"/>
-          <w:szCs w:val="24"/>
-          <w:vertAlign w:val="superscript"/>
-        </w:rPr>
-        <w:t xml:space="preserve">1</w:t>
-      </w:r>
-      <w:r>
-        <w:rPr>
-          <w:rFonts w:ascii="Times New Roman" w:cs="Times New Roman" w:eastAsia="Times New Roman" w:hAnsi="Times New Roman"/>
-          <w:b w:val="false"/>
-          <w:bCs w:val="false"/>
-          <w:sz w:val="24"/>
-          <w:szCs w:val="24"/>
-        </w:rPr>
-        <w:t xml:space="preserve">: if surveillance erodes into alert-dependence, missed deterioration goes not only undetected but unlearned. Yet surveillance and knowledge pooled through “peer exchange”</w:t>
+        <w:t xml:space="preserve"> These accounts illustrate perceived discordance, rather than independently verified model misses; P14’s sense of knowing “when it would miss” is likewise perceived, not verified. Misses shared by nurse and model may remain unrecognised, and duration of exposure alone does not show whether feedback was complete enough to evaluate the system’s reliability. This strengthens our argument that surveillance skills “must be deliberately taught, practised and protected”</w:t>
+      </w:r>
+      <w:r>
+        <w:rPr>
+          <w:rFonts w:ascii="Times New Roman" w:cs="Times New Roman" w:eastAsia="Times New Roman" w:hAnsi="Times New Roman"/>
+          <w:b w:val="false"/>
+          <w:bCs w:val="false"/>
+          <w:sz w:val="24"/>
+          <w:szCs w:val="24"/>
+          <w:vertAlign w:val="superscript"/>
+        </w:rPr>
+        <w:t xml:space="preserve">1</w:t>
+      </w:r>
+      <w:r>
+        <w:rPr>
+          <w:rFonts w:ascii="Times New Roman" w:cs="Times New Roman" w:eastAsia="Times New Roman" w:hAnsi="Times New Roman"/>
+          <w:b w:val="false"/>
+          <w:bCs w:val="false"/>
+          <w:sz w:val="24"/>
+          <w:szCs w:val="24"/>
+        </w:rPr>
+        <w:t xml:space="preserve">: if surveillance erodes into alert-dependence, missed deterioration may go not only undetected but unlearned. Yet surveillance and knowledge pooled through “peer exchange”</w:t>
       </w:r>
       <w:r>
         <w:rPr>
@@ -873,7 +873,7 @@
           <w:sz w:val="24"/>
           <w:szCs w:val="24"/>
         </w:rPr>
-        <w:t xml:space="preserve">; our participants’ discretion was constrained, though not absent. P17’s account illustrates the commentators’ point about salient false alarms, yet the nurse “still had to process the escalation because the alert existed”.</w:t>
+        <w:t xml:space="preserve">; our participants’ discretion was constrained, though not absent. P17’s account illustrates the commentators’ point about salient, apparently false alarms, yet the nurse “still had to process the escalation because the alert existed”.</w:t>
       </w:r>
       <w:r>
         <w:rPr>
@@ -1142,7 +1142,7 @@
           <w:sz w:val="24"/>
           <w:szCs w:val="24"/>
         </w:rPr>
-        <w:t xml:space="preserve"> Acceptance and disagreement deserve comparable scrutiny. Accountability should consider the information available at the time of the decision alongside independent review of subsequent outcomes, rather than conformity with the algorithm alone. We therefore welcome symmetric capture from system logs, linking alerts, and periods without alerts, to nurses’ responses and to independently ascertained deterioration. Logs still need interpretive categories: a log shows that an alert was not escalated, not whether it was assessed and judged wrong or never read, which our single-click acknowledgement, extended to every alert, could partly record.</w:t>
+        <w:t xml:space="preserve"> Acceptance and disagreement deserve comparable scrutiny. Accountability should consider the information available at the time of the decision alongside independent review of subsequent outcomes, rather than conformity with the algorithm alone. We therefore welcome symmetric capture from system logs, linking alerts, and periods without alerts, to nurses’ responses and to independently ascertained deterioration. Logs still need interpretive categories: a log may show that no escalation was recorded, not whether the alert was assessed and judged wrong or never read, which our single-click acknowledgement, extended to every alert, could partly record.</w:t>
       </w:r>
       <w:r>
         <w:rPr>

</xml_diff>

<commit_message>
Apply final adversarial-read fixes to the response
- Remove universal behaviour claim ('For each alert...') and the 'only'
  overclaim on how calibration can be established
- Precise attribution: governance-attention quote, the commentators'
  feedback argument, P05's reported trust, 'a risk our article raised
  only generally', 'a related line' for the Limitations
- Clarity: self-report as a measure; reference vs behavioural data; the
  lesson of external validation; single-click acknowledgement wording
- Main text 1,469 words; 1,497 even counting title and citation line;
  33 quotations verified; 12 references

Co-Authored-By: Claude Opus 5.5 <noreply@anthropic.com>
Claude-Session: https://claude.ai/code/session_01NFxkwSoaToLEQqh28ojz2g
</commit_message>
<xml_diff>
--- a/nicc_commentary_response/01_Response_to_Commentary_NICC.docx
+++ b/nicc_commentary_response/01_Response_to_Commentary_NICC.docx
@@ -239,7 +239,7 @@
           <w:sz w:val="20"/>
           <w:szCs w:val="20"/>
         </w:rPr>
-        <w:t xml:space="preserve">Word count: 1465 words (main text including headings; excluding title, author details, end statements and references). Title: 14 words.</w:t>
+        <w:t xml:space="preserve">Word count: 1469 words (main text including headings; excluding title, author details, end statements and references). Title: 14 words.</w:t>
       </w:r>
     </w:p>
     <w:p>
@@ -292,7 +292,7 @@
           <w:sz w:val="24"/>
           <w:szCs w:val="24"/>
         </w:rPr>
-        <w:t xml:space="preserve"> and for recognising that silent override “deserves the governance attention the authors call for”. They accept that interviews “capture well how nurses make sense of their reliance”; their concern is “one inferential step: from nurses’ accounts of trust to the claim that this trust is calibrated”. We agree that reported adjustment of trust does not establish accurate calibration. Equally, understanding how nurses interpret alerts and negotiate responsibility contributes distinctly to the safe use of AI.</w:t>
+        <w:t xml:space="preserve"> and for recognising that our identification of silent override “deserves the governance attention” we called for. They accept that interviews “capture well how nurses make sense of their reliance”; their concern is “one inferential step: from nurses’ accounts of trust to the claim that this trust is calibrated”. We agree that reported adjustment of trust does not establish accurate calibration. Equally, understanding how nurses interpret alerts and negotiate responsibility contributes distinctly to the safe use of AI.</w:t>
       </w:r>
     </w:p>
     <w:p>
@@ -429,7 +429,7 @@
           <w:sz w:val="24"/>
           <w:szCs w:val="24"/>
         </w:rPr>
-        <w:t xml:space="preserve">; the “experiences of automation bias” in our title refer to that pull.</w:t>
+        <w:t xml:space="preserve">; our title’s “experiences of automation bias” should be read as that pull.</w:t>
       </w:r>
     </w:p>
     <w:p>
@@ -487,7 +487,7 @@
           <w:sz w:val="24"/>
           <w:szCs w:val="24"/>
         </w:rPr>
-        <w:t xml:space="preserve"> Precisely, participants described adjusting their trust through experience; the accuracy of those adjustments was not evaluated. Our Limitations drew this line, placing ‘calibrated trust’ in quotation marks, to be read as “considered self-understanding rather than as a verified description of in-the-moment behaviour”.</w:t>
+        <w:t xml:space="preserve"> More precisely, participants described adjusting their trust through experience; the accuracy of those adjustments was not evaluated. Our Limitations drew a related line, asking that self-reported ‘calibrated trust’ be read as “considered self-understanding rather than as a verified description of in-the-moment behaviour”.</w:t>
       </w:r>
       <w:r>
         <w:rPr>
@@ -577,7 +577,7 @@
           <w:sz w:val="24"/>
           <w:szCs w:val="24"/>
         </w:rPr>
-        <w:t xml:space="preserve"> but differentiation is not calibration: trust can be differentiated wrongly. Self-report is an established route to trust as an attitude</w:t>
+        <w:t xml:space="preserve"> but differentiation is not calibration: trust can be differentiated wrongly. Self-report is an established measure of trust as an attitude</w:t>
       </w:r>
       <w:r>
         <w:rPr>
@@ -598,7 +598,7 @@
           <w:sz w:val="24"/>
           <w:szCs w:val="24"/>
         </w:rPr>
-        <w:t xml:space="preserve">; whether trust or reliance is appropriate requires behavioural and reference data.</w:t>
+        <w:t xml:space="preserve">; judging whether trust or reliance is appropriate requires reference data and, for reliance, behavioural data.</w:t>
       </w:r>
     </w:p>
     <w:p>
@@ -757,7 +757,7 @@
           <w:sz w:val="24"/>
           <w:szCs w:val="24"/>
         </w:rPr>
-        <w:t xml:space="preserve"> but did not follow that point through to how trust is learned. As they frame it, their reading is a hypothesis; like ours, it interprets the same accounts, and our interviews cannot show how far each explains the trajectory.</w:t>
+        <w:t xml:space="preserve"> but did not follow that point through to how trust is learned. Their reading, like ours, interprets the same accounts, though it draws on established research on learning from feedback; our interviews cannot show how far each explains the trajectory.</w:t>
       </w:r>
     </w:p>
     <w:p>
@@ -773,7 +773,7 @@
           <w:sz w:val="24"/>
           <w:szCs w:val="24"/>
         </w:rPr>
-        <w:t xml:space="preserve">Feedback about correctness is incomplete in both directions. As the commentators acknowledge, an alert followed by no deterioration may reflect successful intervention rather than a false alarm; conversely, deterioration that nurses recognise can make an absent warning visible. Participants described occasions when their assessment suggested deterioration that the score did not adequately reflect (“The score was fine, but I knew something was wrong”, P09).</w:t>
+        <w:t xml:space="preserve">Feedback about correctness is incomplete in both directions, though not equally. As the commentators note, an alert followed by no deterioration may reflect successful intervention rather than a false alarm, and deterioration that nurses recognise can make an absent warning visible. Participants described occasions when their assessment suggested deterioration that the score did not adequately reflect (“The score was fine, but I knew something was wrong”, P09).</w:t>
       </w:r>
       <w:r>
         <w:rPr>
@@ -815,28 +815,28 @@
           <w:sz w:val="24"/>
           <w:szCs w:val="24"/>
         </w:rPr>
-        <w:t xml:space="preserve">: if surveillance erodes into alert-dependence, missed deterioration may go not only undetected but unlearned. Yet surveillance and knowledge pooled through “peer exchange”</w:t>
-      </w:r>
-      <w:r>
-        <w:rPr>
-          <w:rFonts w:ascii="Times New Roman" w:cs="Times New Roman" w:eastAsia="Times New Roman" w:hAnsi="Times New Roman"/>
-          <w:b w:val="false"/>
-          <w:bCs w:val="false"/>
-          <w:sz w:val="24"/>
-          <w:szCs w:val="24"/>
-          <w:vertAlign w:val="superscript"/>
-        </w:rPr>
-        <w:t xml:space="preserve">1</w:t>
-      </w:r>
-      <w:r>
-        <w:rPr>
-          <w:rFonts w:ascii="Times New Roman" w:cs="Times New Roman" w:eastAsia="Times New Roman" w:hAnsi="Times New Roman"/>
-          <w:b w:val="false"/>
-          <w:bCs w:val="false"/>
-          <w:sz w:val="24"/>
-          <w:szCs w:val="24"/>
-        </w:rPr>
-        <w:t xml:space="preserve"> share the same asymmetry; nurse-facing performance reports, as the commentators propose, may help address it, provided outcomes are soundly ascertained and interpreted.</w:t>
+        <w:t xml:space="preserve">: if surveillance erodes into alert-dependence, missed deterioration may go not only undetected but unlearned. Yet knowledge gained through surveillance and pooled through “peer exchange”</w:t>
+      </w:r>
+      <w:r>
+        <w:rPr>
+          <w:rFonts w:ascii="Times New Roman" w:cs="Times New Roman" w:eastAsia="Times New Roman" w:hAnsi="Times New Roman"/>
+          <w:b w:val="false"/>
+          <w:bCs w:val="false"/>
+          <w:sz w:val="24"/>
+          <w:szCs w:val="24"/>
+          <w:vertAlign w:val="superscript"/>
+        </w:rPr>
+        <w:t xml:space="preserve">1</w:t>
+      </w:r>
+      <w:r>
+        <w:rPr>
+          <w:rFonts w:ascii="Times New Roman" w:cs="Times New Roman" w:eastAsia="Times New Roman" w:hAnsi="Times New Roman"/>
+          <w:b w:val="false"/>
+          <w:bCs w:val="false"/>
+          <w:sz w:val="24"/>
+          <w:szCs w:val="24"/>
+        </w:rPr>
+        <w:t xml:space="preserve"> shares the same asymmetry; nurse-facing performance reports, as the commentators propose, may help address it, provided outcomes are soundly ascertained and interpreted.</w:t>
       </w:r>
     </w:p>
     <w:p>
@@ -894,28 +894,28 @@
           <w:sz w:val="24"/>
           <w:szCs w:val="24"/>
         </w:rPr>
-        <w:t xml:space="preserve"> A log may show that escalation without revealing whether it reflected trust, uncertainty or institutional pressure; the account suggests compliance without trust. Conversely, an unrecorded override leaves no rationale to review against what happened next, and P16’s certainty that an alert was “not real” is the kind of confidence that, as the commentators argue, incomplete feedback can sustain.</w:t>
-      </w:r>
-      <w:r>
-        <w:rPr>
-          <w:rFonts w:ascii="Times New Roman" w:cs="Times New Roman" w:eastAsia="Times New Roman" w:hAnsi="Times New Roman"/>
-          <w:b w:val="false"/>
-          <w:bCs w:val="false"/>
-          <w:sz w:val="24"/>
-          <w:szCs w:val="24"/>
-          <w:vertAlign w:val="superscript"/>
-        </w:rPr>
-        <w:t xml:space="preserve">1</w:t>
-      </w:r>
-      <w:r>
-        <w:rPr>
-          <w:rFonts w:ascii="Times New Roman" w:cs="Times New Roman" w:eastAsia="Times New Roman" w:hAnsi="Times New Roman"/>
-          <w:b w:val="false"/>
-          <w:bCs w:val="false"/>
-          <w:sz w:val="24"/>
-          <w:szCs w:val="24"/>
-        </w:rPr>
-        <w:t xml:space="preserve"> Silent override thus adds an organisational layer to their feedback asymmetry.</w:t>
+        <w:t xml:space="preserve"> A log may show that escalation without revealing whether it reflected trust, uncertainty or institutional pressure; the account suggests compliance without trust. Conversely, an unrecorded override leaves no rationale to review against what happened next, and P16’s certainty that an alert was “not real”</w:t>
+      </w:r>
+      <w:r>
+        <w:rPr>
+          <w:rFonts w:ascii="Times New Roman" w:cs="Times New Roman" w:eastAsia="Times New Roman" w:hAnsi="Times New Roman"/>
+          <w:b w:val="false"/>
+          <w:bCs w:val="false"/>
+          <w:sz w:val="24"/>
+          <w:szCs w:val="24"/>
+          <w:vertAlign w:val="superscript"/>
+        </w:rPr>
+        <w:t xml:space="preserve">1</w:t>
+      </w:r>
+      <w:r>
+        <w:rPr>
+          <w:rFonts w:ascii="Times New Roman" w:cs="Times New Roman" w:eastAsia="Times New Roman" w:hAnsi="Times New Roman"/>
+          <w:b w:val="false"/>
+          <w:bCs w:val="false"/>
+          <w:sz w:val="24"/>
+          <w:szCs w:val="24"/>
+        </w:rPr>
+        <w:t xml:space="preserve"> is the kind of confidence that, as the commentators argue, incomplete feedback can sustain. Silent override thus adds an organisational layer to their feedback asymmetry.</w:t>
       </w:r>
     </w:p>
     <w:p>
@@ -947,7 +947,7 @@
           <w:sz w:val="24"/>
           <w:szCs w:val="24"/>
         </w:rPr>
-        <w:t xml:space="preserve">For each alert, participants weighed the score against the patient in front of them (“I look at my patient”, P03),</w:t>
+        <w:t xml:space="preserve">Participants described weighing alerts against the patient in front of them (“I look at my patient”, P03),</w:t>
       </w:r>
       <w:r>
         <w:rPr>
@@ -989,7 +989,7 @@
           <w:sz w:val="24"/>
           <w:szCs w:val="24"/>
         </w:rPr>
-        <w:t xml:space="preserve"> Bedside judgement guides the clinical response but cannot establish calibration. As the commentators argue, nurse and model can agree and both be wrong, and an assessment anchored by the alert cannot independently judge the same decision. We add a structural reason: the model analyses the same “routinely documented vital signs and laboratory parameters”</w:t>
+        <w:t xml:space="preserve"> As the commentators argue, nurse and model can agree and both be wrong, and an assessment anchored by the alert cannot independently check it. We add a structural reason: the model analyses the same “routinely documented vital signs and laboratory parameters”</w:t>
       </w:r>
       <w:r>
         <w:rPr>
@@ -1031,7 +1031,7 @@
           <w:sz w:val="24"/>
           <w:szCs w:val="24"/>
         </w:rPr>
-        <w:t xml:space="preserve"> Whether trust and reliance correspond to the system’s performance can be established only by independent, outcome-linked evaluation that includes missed events.</w:t>
+        <w:t xml:space="preserve"> Establishing whether trust and reliance correspond to the system’s performance requires an independent reference, such as outcome-linked evaluation that includes missed events.</w:t>
       </w:r>
     </w:p>
     <w:p>
@@ -1089,7 +1089,7 @@
           <w:sz w:val="24"/>
           <w:szCs w:val="24"/>
         </w:rPr>
-        <w:t xml:space="preserve">; its estimates do not describe our participants’ general deterioration model, but its lesson transfers. Local evaluation should specify outcomes, prediction horizons and alert thresholds, account for the effects of clinical intervention, and be made known to nurses.</w:t>
+        <w:t xml:space="preserve">; its estimates do not describe our participants’ deterioration model, but its lesson, independent local validation, transfers. Local evaluation should specify outcomes, prediction horizons and alert thresholds, account for the effects of clinical intervention, and be made known to nurses.</w:t>
       </w:r>
     </w:p>
     <w:p>
@@ -1121,28 +1121,28 @@
           <w:sz w:val="24"/>
           <w:szCs w:val="24"/>
         </w:rPr>
-        <w:t xml:space="preserve">Our proposed override field was a governance recommendation, not a tested intervention or a claim that overrides were safe. We accept the commentators’ warning that a field required only for overrides could “make acceptance the implicit default and attach friction to disagreement alone”, a risk our article also named.</w:t>
-      </w:r>
-      <w:r>
-        <w:rPr>
-          <w:rFonts w:ascii="Times New Roman" w:cs="Times New Roman" w:eastAsia="Times New Roman" w:hAnsi="Times New Roman"/>
-          <w:b w:val="false"/>
-          <w:bCs w:val="false"/>
-          <w:sz w:val="24"/>
-          <w:szCs w:val="24"/>
-          <w:vertAlign w:val="superscript"/>
-        </w:rPr>
-        <w:t xml:space="preserve">1</w:t>
-      </w:r>
-      <w:r>
-        <w:rPr>
-          <w:rFonts w:ascii="Times New Roman" w:cs="Times New Roman" w:eastAsia="Times New Roman" w:hAnsi="Times New Roman"/>
-          <w:b w:val="false"/>
-          <w:bCs w:val="false"/>
-          <w:sz w:val="24"/>
-          <w:szCs w:val="24"/>
-        </w:rPr>
-        <w:t xml:space="preserve"> Acceptance and disagreement deserve comparable scrutiny. Accountability should consider the information available at the time of the decision alongside independent review of subsequent outcomes, rather than conformity with the algorithm alone. We therefore welcome symmetric capture from system logs, linking alerts, and periods without alerts, to nurses’ responses and to independently ascertained deterioration. Logs still need interpretive categories: a log may show that no escalation was recorded, not whether the alert was assessed and judged wrong or never read, which our single-click acknowledgement, extended to every alert, could partly record.</w:t>
+        <w:t xml:space="preserve">Our proposed override field was a governance recommendation, not a tested intervention or a claim that overrides were safe. We accept the commentators’ warning that a field required only for overrides could “make acceptance the implicit default and attach friction to disagreement alone”, a risk our article raised only generally.</w:t>
+      </w:r>
+      <w:r>
+        <w:rPr>
+          <w:rFonts w:ascii="Times New Roman" w:cs="Times New Roman" w:eastAsia="Times New Roman" w:hAnsi="Times New Roman"/>
+          <w:b w:val="false"/>
+          <w:bCs w:val="false"/>
+          <w:sz w:val="24"/>
+          <w:szCs w:val="24"/>
+          <w:vertAlign w:val="superscript"/>
+        </w:rPr>
+        <w:t xml:space="preserve">1</w:t>
+      </w:r>
+      <w:r>
+        <w:rPr>
+          <w:rFonts w:ascii="Times New Roman" w:cs="Times New Roman" w:eastAsia="Times New Roman" w:hAnsi="Times New Roman"/>
+          <w:b w:val="false"/>
+          <w:bCs w:val="false"/>
+          <w:sz w:val="24"/>
+          <w:szCs w:val="24"/>
+        </w:rPr>
+        <w:t xml:space="preserve"> Acceptance and disagreement deserve comparable scrutiny. Accountability should consider the information available at the time of the decision alongside independent review of subsequent outcomes, rather than conformity with the algorithm alone. We therefore welcome symmetric capture from system logs, linking alerts, and periods without alerts, to nurses’ responses and to independently ascertained deterioration. Logs still need interpretive categories: a log may show that no escalation was recorded, not whether the alert was assessed and judged wrong or never read; our single-click acknowledgement, extended to every alert, could partly capture this distinction.</w:t>
       </w:r>
       <w:r>
         <w:rPr>
@@ -1190,7 +1190,7 @@
           <w:sz w:val="24"/>
           <w:szCs w:val="24"/>
         </w:rPr>
-        <w:t xml:space="preserve"> Where a deployed system cannot ethically be withheld, simulation and vignettes are feasible. The trial they cite counsels caution: image-based explanations did not mitigate the harm of systematically biased predictions in a clinician vignette study,</w:t>
+        <w:t xml:space="preserve"> Where a deployed system cannot ethically be withheld, simulation and vignettes are feasible. The vignette trial they cite warns against relying on explanations: image-based explanations did not mitigate the harm of systematically biased predictions among clinicians,</w:t>
       </w:r>
       <w:r>
         <w:rPr>
@@ -1211,28 +1211,28 @@
           <w:sz w:val="24"/>
           <w:szCs w:val="24"/>
         </w:rPr>
-        <w:t xml:space="preserve"> although its relevance to nursing surveillance is untested. Our findings suggest what to test: discordant alerts (P09), alarms after suctioning (P17), and complex cases, for which participants trusted the system less (P05).</w:t>
-      </w:r>
-      <w:r>
-        <w:rPr>
-          <w:rFonts w:ascii="Times New Roman" w:cs="Times New Roman" w:eastAsia="Times New Roman" w:hAnsi="Times New Roman"/>
-          <w:b w:val="false"/>
-          <w:bCs w:val="false"/>
-          <w:sz w:val="24"/>
-          <w:szCs w:val="24"/>
-          <w:vertAlign w:val="superscript"/>
-        </w:rPr>
-        <w:t xml:space="preserve">1</w:t>
-      </w:r>
-      <w:r>
-        <w:rPr>
-          <w:rFonts w:ascii="Times New Roman" w:cs="Times New Roman" w:eastAsia="Times New Roman" w:hAnsi="Times New Roman"/>
-          <w:b w:val="false"/>
-          <w:bCs w:val="false"/>
-          <w:sz w:val="24"/>
-          <w:szCs w:val="24"/>
-        </w:rPr>
-        <w:t xml:space="preserve"> Comparing nurses’ trust across patient groups with group-specific false-alarm rates and independently ascertained misses, separating those nurses recognised from those they did not, would show whether differentiated trust tracks reliability or only visible errors. Such studies should distinguish confidence, reported trust and observed reliance.</w:t>
+        <w:t xml:space="preserve"> although its relevance to nursing surveillance is untested. Our findings suggest what to test: discordant alerts (P09), alarms after suctioning (P17), and complex cases, for which P05 reported trusting the system less.</w:t>
+      </w:r>
+      <w:r>
+        <w:rPr>
+          <w:rFonts w:ascii="Times New Roman" w:cs="Times New Roman" w:eastAsia="Times New Roman" w:hAnsi="Times New Roman"/>
+          <w:b w:val="false"/>
+          <w:bCs w:val="false"/>
+          <w:sz w:val="24"/>
+          <w:szCs w:val="24"/>
+          <w:vertAlign w:val="superscript"/>
+        </w:rPr>
+        <w:t xml:space="preserve">1</w:t>
+      </w:r>
+      <w:r>
+        <w:rPr>
+          <w:rFonts w:ascii="Times New Roman" w:cs="Times New Roman" w:eastAsia="Times New Roman" w:hAnsi="Times New Roman"/>
+          <w:b w:val="false"/>
+          <w:bCs w:val="false"/>
+          <w:sz w:val="24"/>
+          <w:szCs w:val="24"/>
+        </w:rPr>
+        <w:t xml:space="preserve"> Comparing nurses’ trust across patient groups with group-specific false-alarm rates and independently ascertained misses, separating those nurses recognised from those they did not, could show whether differentiated trust tracks reliability or only visible errors. Such studies should distinguish nurses’ self-confidence, reported trust and observed reliance.</w:t>
       </w:r>
     </w:p>
     <w:p>
@@ -1248,7 +1248,7 @@
           <w:sz w:val="24"/>
           <w:szCs w:val="24"/>
         </w:rPr>
-        <w:t xml:space="preserve">The commentators ask the right question: ‘Calibrated to what?’ Bedside assessment guides the immediate clinical response; independent, outcome-linked evaluation establishes whether trust and reliance correspond to system performance. Our study illuminates nurses’ interpretations and the organisational conditions shaping their responses. The commentary identifies the complementary evidence needed to evaluate their appropriateness.</w:t>
+        <w:t xml:space="preserve">The commentators ask the right question: “Calibrated to what?” Bedside assessment guides the immediate clinical response; independent, outcome-linked evaluation establishes whether trust and reliance correspond to system performance. Our study illuminates nurses’ interpretations and the organisational conditions shaping their responses. The commentary identifies the complementary evidence needed to evaluate their appropriateness.</w:t>
       </w:r>
     </w:p>
     <w:p>

</xml_diff>